<commit_message>
Tighten Milestone One v9: drop em dashes, shorten the AI appendix.
Replace 32 em dashes and a few slogan-like phrases, then replace the prompt-by-prompt AI appendix with a short note that AI was used to brainstorm datasets and to fit the required formatting.

Co-authored-by: Cursor <cursoragent@cursor.com>
</commit_message>
<xml_diff>
--- a/milestone1/dx699-milestone-one-draft-v9.docx
+++ b/milestone1/dx699-milestone-one-draft-v9.docx
@@ -646,7 +646,7 @@
     </w:p>
     <w:p>
       <w:r>
-        <w:t>A single-day cross-section of the SPY options chain on December 31, 2024 (spot 586.08), hand-extracted from a public historic U.S. equity options dataset (Dubach, 2025): 9,646 contracts (4,823 calls, 4,823 puts) across 35 expirations and 362 strikes in 23 columns — contract identifiers (strike, call/put, expiration), market observables (bid, ask, last, sizes, volume, open interest), and model-derived outputs (implied volatility, delta, gamma, theta, vega, rho, moneyness, in-the-money flag). Mixed types: continuous numerics, categoricals, one binary flag. Cross-sectional, not a time series. The mix spans continuous market data, categorical contract terms, and model outputs — the paper's richest single-table feature set.</w:t>
+        <w:t>A single-day cross-section of the SPY options chain on December 31, 2024 (spot 586.08), hand-extracted from a public historic U.S. equity options dataset (Dubach, 2025): 9,646 contracts (4,823 calls, 4,823 puts) across 35 expirations and 362 strikes in 23 columns, covering contract identifiers (strike, call/put, expiration), market observables (bid, ask, last, sizes, volume, open interest), and model-derived outputs (implied volatility, delta, gamma, theta, vega, rho, moneyness, in-the-money flag). Mixed types: continuous numerics, categoricals, one binary flag. Cross-sectional, not a time series.</w:t>
       </w:r>
     </w:p>
     <w:p>
@@ -660,7 +660,7 @@
     </w:p>
     <w:p>
       <w:r>
-        <w:t>Monthly registration records for China's passenger-car market, January 2018–April 2024, from the China Passenger Car Association (CPCA, 2024): 38,806 model-month rows, 10 columns (year-month, make, brand, model, brand country, units sold, EV-versus-gasoline flag, body type, low/high price). Covers 139 brands and 1,345 brand-model combinations (136.9M units); 8,528 EV rows vs 30,278 gasoline, EV unit share 3.3% (2018) → 30.2% (2023). Framed cross-sectionally — a portrait of the electrification transition.</w:t>
+        <w:t>Monthly registration records for China’s passenger-car market, January 2018–April 2024, from the China Passenger Car Association (CPCA, 2024): 38,806 model-month rows, 10 columns (year-month, make, brand, model, brand country, units sold, EV-versus-gasoline flag, body type, low/high price). Covers 139 brands and 1,345 brand-model combinations (136.9M units); 8,528 EV rows vs 30,278 gasoline, EV unit share 3.3% (2018) → 30.2% (2023). Framed cross-sectionally, as a portrait of the electrification transition.</w:t>
       </w:r>
     </w:p>
     <w:p>
@@ -696,7 +696,7 @@
         <w:rPr>
           <w:sz w:val="24"/>
         </w:rPr>
-        <w:t>45,466 films × 24 columns from The Movies Dataset (Banik, 2017): budget, revenue, runtime, release date, vote average/count, popularity, language, overview text, tagline, and nested-JSON columns (genres, companies, countries, cast, crew) requiring parsing. The paper's widest mix of data types: numerics, dates, free text, and structured JSON in one table.</w:t>
+        <w:t>45,466 films × 24 columns from The Movies Dataset (Banik, 2017): budget, revenue, runtime, release date, vote average/count, popularity, language, overview text, tagline, and nested-JSON columns (genres, companies, countries, cast, crew) requiring parsing. The paper’s widest mix of data types: numerics, dates, free text, and structured JSON in one table.</w:t>
       </w:r>
     </w:p>
     <w:p>
@@ -715,7 +715,7 @@
         <w:rPr>
           <w:sz w:val="24"/>
         </w:rPr>
-        <w:t>The Financial Industry Regulatory Authority’s (FINRA, 2026) official equity short-interest reports for 496 S&amp;P 500 constituents on 90 settlement dates (twice monthly), January 2023–September 2026, used on their own with no price or market-cap data attached: 43,899 stock-report rows × 12 columns — settlement date, symbol, issuer name, exchange, current and previous short shares, change in shares and in percent, average daily volume, days-to-cover, and FINRA’s stock-split and revision flags. Counts are highly skewed (short shares range from 2,064 to 324 million; median days-to-cover 2.8, maximum 20.5). Cross-sectional framing, built on volume: which stocks are heavily shorted, and does that depend on how much they trade? Days-to-cover is short shares divided by average daily volume (within 2% on 98.5% of rows), while the raw share count mostly tracks volume (log correlation 0.95 across stocks). The file has no price, shares outstanding, or market cap, so average daily volume is the only size-like column and serves as a liquidity proxy; all 496 stocks are S&amp;P 500 members, so the comparison is between higher- and lower-volume large and mid caps, not true small caps. </w:t>
+        <w:t>The Financial Industry Regulatory Authority’s (FINRA, 2026) official equity short-interest reports for 496 S&amp;P 500 constituents on 90 settlement dates (twice monthly), January 2023–September 2026, used on their own with no price or market-cap data attached: 43,899 stock-report rows × 12 columns (settlement date, symbol, issuer name, exchange, current and previous short shares, change in shares and in percent, average daily volume, days-to-cover, and FINRA’s stock-split and revision flags). Counts are highly skewed (short shares range from 2,064 to 324 million; median days-to-cover 2.8, maximum 20.5). Cross-sectional framing, built on volume: which stocks are heavily shorted, and does that depend on how much they trade? Days-to-cover is short shares divided by average daily volume (within 2% on 98.5% of rows), while the raw share count mostly tracks volume (log correlation 0.95 across stocks). The file has no price, shares outstanding, or market cap, so average daily volume is the only size-like column and is used as a liquidity proxy; all 496 stocks are S&amp;P 500 members, so the comparison is between higher- and lower-volume large and mid caps, not true small caps. </w:t>
       </w:r>
     </w:p>
     <w:p>
@@ -741,7 +741,7 @@
     </w:p>
     <w:p>
       <w:r>
-        <w:t>No missing values. The problem is 625 zero-bid contracts (6.5%) — typically deep out-of-the-money long-dated puts quoted 0.00 bid against a wide ask with no volume. These dead quotes cannot be traded; any model trained on them learns from prices that do not exist, so they are discarded outright. A further ~200 ultra-wide-spread contracts (spreads above 50%) are filtered the same way, and implied volatility (range 0.015–4.034, extremes in illiquid names) is winsorized. Volume concentrates in zero-days-to-expiry and weeklies, so analysis is stratified by expiration; mid-prices replace last trades to avoid bid-ask bounce; the Greeks are model-derived features carrying model risk, not ground truth.</w:t>
+        <w:t>No missing values. The problem is 625 zero-bid contracts (6.5%), typically deep out-of-the-money long-dated puts quoted 0.00 bid against a wide ask with no volume. These dead quotes cannot be traded; any model trained on them learns from prices that do not exist, so they are discarded outright. A further ~200 ultra-wide-spread contracts (spreads above 50%) are filtered the same way, and implied volatility (range 0.015–4.034, extremes in illiquid names) is winsorized. Volume concentrates in zero-days-to-expiry and weeklies, so analysis is stratified by expiration; mid-prices replace last trades to avoid bid-ask bounce; the Greeks are model-derived features carrying model risk, not ground truth.</w:t>
       </w:r>
     </w:p>
     <w:p>
@@ -755,7 +755,7 @@
     </w:p>
     <w:p>
       <w:r>
-        <w:t>Thirty-four exact duplicate (model, year-month) rows are dropped. Body type is the literal string “NA” in 2,366 rows (6.1%) — kept as an “Unknown” category since missingness may correlate with low-volume models. In 6,127 rows (15.8%) the price is 0, dead data that is imputed within brand-model or excluded from price features. The manufacturer field is Chinese while brand is English, so modeling uses brand. February 2020 EV sales collapsed to 8,988 units (COVID lockdown) and the series ends April 2024 — structural breaks handled with regime dummies, never silent deletions.</w:t>
+        <w:t>Thirty-four exact duplicate (model, year-month) rows are dropped. Body type is the literal string “NA” in 2,366 rows (6.1%), kept as an “Unknown” category since missingness may correlate with low-volume models. In 6,127 rows (15.8%) the price is 0, dead data that is imputed within brand-model or excluded from price features. The manufacturer field is Chinese while brand is English, so modeling uses brand. February 2020 EV sales collapsed to 8,988 units (COVID lockdown) and the series ends April 2024; structural breaks are handled with regime dummies, never silent deletions.</w:t>
       </w:r>
     </w:p>
     <w:p>
@@ -769,7 +769,7 @@
     </w:p>
     <w:p>
       <w:r>
-        <w:t>450 fully duplicated rows are removed. Subtler: 24,259 track ids repeat because the same song is listed under multiple genres — identical audio features with different labels, i.e., label noise. Fix: deduplicate to one row per track (most frequent genre) or frame genre as multi-label. The artificial 1,000-tracks-per-genre balance does not reflect listening shares, so prevalence conclusions must be reweighted.</w:t>
+        <w:t>450 fully duplicated rows are removed. Subtler: 24,259 track ids repeat because the same song is listed under multiple genres, with identical audio features but different labels, i.e., label noise. Fix: deduplicate to one row per track (most frequent genre) or frame genre as multi-label. The artificial 1,000-tracks-per-genre balance does not reflect listening shares, so prevalence conclusions must be reweighted.</w:t>
       </w:r>
     </w:p>
     <w:p>
@@ -783,7 +783,7 @@
     </w:p>
     <w:p>
       <w:r>
-        <w:t>Seventeen duplicate rows dropped. Many budgets are 0 — missing data coded as zero, recoded as missing and imputed within genre-era cohorts or excluded. Genres, companies, countries, cast, and crew are nested JSON parsed into indicators/counts. Vote averages on few-vote films are shrunk toward the global mean.</w:t>
+        <w:t>Seventeen duplicate rows dropped. Many budgets are 0, which is missing data coded as zero; these are recoded as missing and imputed within genre-era cohorts or excluded. Genres, companies, countries, cast, and crew are nested JSON parsed into indicators/counts. Vote averages on few-vote films are shrunk toward the global mean.</w:t>
       </w:r>
     </w:p>
     <w:p>
@@ -828,7 +828,7 @@
     </w:p>
     <w:p>
       <w:r>
-        <w:t>Supervised regression: predict implied volatility from strike, moneyness, and time to expiry — each contract carries the quoted IV as target. The smile's nonlinearity suits tree ensembles or neural networks; a polynomial alternative tests the smile directly through its quadratic moneyness term. Classification: liquid vs illiquid from spread, volume, open interest, and distance from spot — a market-microstructure task modeling which contracts are actually tradable. Trees fit the regression because the smile is smooth but non-quadratic; the classifier fits because liquidity is a threshold phenomenon in spread and volume.</w:t>
+        <w:t>Supervised regression: predict implied volatility from strike, moneyness, and time to expiry; each contract carries the quoted IV as target. The smile’s nonlinearity suits tree ensembles or neural networks; a polynomial alternative tests the smile directly through its quadratic moneyness term. Classification: liquid vs illiquid from spread, volume, open interest, and distance from spot, a market-microstructure task modeling which contracts are tradable. Trees fit the regression because the smile is smooth but non-quadratic; the classifier fits because liquidity is a threshold phenomenon in spread and volume.</w:t>
       </w:r>
     </w:p>
     <w:p>
@@ -842,7 +842,7 @@
     </w:p>
     <w:p>
       <w:r>
-        <w:t>Classification: predict the EV-versus-gasoline flag from brand, brand country, body type, and price band — every model-month carries the label; tree ensembles suit the mixed features, and the exercise measures how predictable the transition was. Regression: predict monthly EV units from lagged sales and segment mix with expanding-window splits (no leakage); comparing a seasonal baseline to gradient boosting across the series' three structural phases makes the modeling choice the finding. Expanding windows respect temporal order; trees handle the categorical-heavy features without one-hot explosions.</w:t>
+        <w:t>Classification: predict the EV-versus-gasoline flag from brand, brand country, body type, and price band. Every model-month carries the label; tree ensembles suit the mixed features, and the exercise measures how predictable the transition was. Regression: predict monthly EV units from lagged sales and segment mix with expanding-window splits (no leakage); comparing a seasonal baseline to gradient boosting across the series’ three structural phases shows which model holds up. Expanding windows respect temporal order; trees handle the categorical-heavy features without one-hot explosions.</w:t>
       </w:r>
     </w:p>
     <w:p>
@@ -856,7 +856,7 @@
     </w:p>
     <w:p>
       <w:r>
-        <w:t>Classification: predict popularity tier (or genre, post-dedupe) from audio features — which sonic attributes the market rewards. Clustering: group tracks into data-derived archetypes (e.g., high-energy/low-acousticness) for playlist and recommendation design, where the problem is matching songs to moods, not predicting one number. The audio features are dense and continuous — exactly the geometry clustering exploits.</w:t>
+        <w:t>Classification: predict popularity tier (or genre, post-dedupe) from audio features, to see which sonic attributes the market rewards. Clustering: group tracks into data-derived archetypes (e.g., high-energy/low-acousticness) for playlist and recommendation design, where the problem is matching songs to moods, not predicting one number. The audio features are dense and continuous, which suits clustering.</w:t>
       </w:r>
     </w:p>
     <w:p>
@@ -870,7 +870,7 @@
     </w:p>
     <w:p>
       <w:r>
-        <w:t>Regression: predict log box-office revenue from budget, genre, cast/crew, timing, and pre-release popularity — the studio greenlight problem. Classification: hit vs flop (revenue &gt; 2× budget) from pre-release features only, evaluated with precision-recall for the asymmetric cost of a false greenlight. The log transform tames revenue's skew for linear models; trees capture the budget-genre interactions studios argue about.</w:t>
+        <w:t>Regression: predict log box-office revenue from budget, genre, cast/crew, timing, and pre-release popularity, the studio greenlight problem. Classification: hit vs flop (revenue &gt; 2× budget) from pre-release features only, evaluated with precision-recall for the asymmetric cost of a false greenlight. The log transform tames revenue’s skew for linear models; trees capture the budget-genre interactions studios argue about.</w:t>
       </w:r>
     </w:p>
     <w:p>
@@ -889,7 +889,7 @@
         <w:rPr>
           <w:sz w:val="24"/>
         </w:rPr>
-        <w:t>Regression: predict log short shares from log average daily volume. Volume explains most of the position (R² 0.90 across stocks; doubling volume goes with about 1.9 times the short shares), and the residual is the finding: a stock’s actual short position divided by what its volume predicts. It exceeds 2 for 17 stocks (International Paper 3.4, T. Rowe Price 3.2, Texas Pacific Land 3.0) and falls below 0.5 for 3 (Sandisk, AMD, Tesla), so the same fit gives anomaly detection. Classification: label a report crowded when days-to-cover is above 5 (13% of rows) and test whether volume tier and exchange alone predict it (16% of rows for the lowest-volume quarter of stocks, 7% for the highest); short shares and days-to-cover stay out of the features because they would leak the label. Clustering on log volume, log short shares, and days-to-cover can show whether crowded, low-volume names form their own segment. Because a stock’s 90 reports resemble each other, evaluation holds out whole tickers (5-fold by stock; the regression scores R² 0.82), never random rows. </w:t>
+        <w:t>Regression: predict log short shares from log average daily volume. Volume explains most of the position (R² 0.90 across stocks; doubling volume goes with about 1.9 times the short shares), and the residual (a stock’s actual short position divided by \2) is the quantity of interest. It exceeds 2 for 17 stocks (International Paper 3.4, T. Rowe Price 3.2, Texas Pacific Land 3.0) and falls below 0.5 for 3 (Sandisk, AMD, Tesla), so the same fit gives anomaly detection. Classification: label a report crowded when days-to-cover is above 5 (13% of rows) and test whether volume tier and exchange alone predict it (16% of rows for the lowest-volume quarter of stocks, 7% for the highest); short shares and days-to-cover stay out of the features because they would leak the label. Clustering on log volume, log short shares, and days-to-cover can show whether crowded, low-volume names form their own segment. Because a stock’s 90 reports resemble each other, evaluation holds out whole tickers (5-fold by stock; the regression scores R² 0.82), never random rows. </w:t>
       </w:r>
     </w:p>
     <w:p>
@@ -910,12 +910,12 @@
           <w:b/>
           <w:sz w:val="24"/>
         </w:rPr>
-        <w:t>Dataset 1: SPY Equity Options Chain Snapshot (Finance — derivatives)</w:t>
+        <w:t>Dataset 1: SPY Equity Options Chain Snapshot (Finance: derivatives)</w:t>
       </w:r>
     </w:p>
     <w:p>
       <w:r>
-        <w:t>Can ML recover the volatility smile — predicting IV from moneyness and expiry? Matters to volatility trading and market-making; personally, as a valuation specialist at a Hong Kong hedge fund, I want to prove out the volatility smile with data science methods rather than take it as a textbook given — an empirical test of the constant-volatility assumption behind Black-Scholes (Black &amp; Scholes, 1973). Do market Greeks behave as textbooks say across moneyness and tenor? I verified each behavior empirically here — useful for valuation and risk management, and a check on the data's consistency. What drives IV most — moneyness, expiry, or liquidity? Tells pricing/risk functions where modeling effort belongs.</w:t>
+        <w:t>Can ML recover the volatility smile by predicting IV from moneyness and expiry? Matters to volatility trading and market-making; personally, as a valuation specialist at a Hong Kong hedge fund, I want to prove out the volatility smile with data science methods rather than take it as a textbook given: an empirical test of the constant-volatility assumption behind Black-Scholes (Black &amp; Scholes, 1973). Do market Greeks behave as textbooks say across moneyness and tenor? I verified each behavior empirically here, useful for valuation and risk management and as a check on the data’s consistency. What drives IV most: moneyness, expiry, or liquidity? Tells pricing/risk functions where modeling effort belongs.</w:t>
       </w:r>
     </w:p>
     <w:p>
@@ -924,12 +924,12 @@
           <w:b/>
           <w:sz w:val="24"/>
         </w:rPr>
-        <w:t>Dataset 2: China Passenger-Vehicle Sales, CPCA (Environment — automotive)</w:t>
+        <w:t>Dataset 2: China Passenger-Vehicle Sales, CPCA (Environment: automotive)</w:t>
       </w:r>
     </w:p>
     <w:p>
       <w:r>
-        <w:t>Which attributes best predicted electrification — price segment, body type, or brand origin? Matters to auto strategy; personally, the demand side of emissions. Did the January 2023 subsidy end change EV price elasticity? A natural policy experiment in official-registration data. Can monthly EV sales be forecast from lags and mix, and where does a seasonal baseline break in 2021–2022? Matters to inventory and battery-supply planning.</w:t>
+        <w:t>Which attributes best predicted electrification: price segment, body type, or brand origin? Matters to auto strategy; personally, the demand side of emissions. Did the January 2023 subsidy end change EV price elasticity? A natural policy experiment in official-registration data. Can monthly EV sales be forecast from lags and mix, and where does a seasonal baseline break in 2021–2022? Matters to inventory and battery-supply planning.</w:t>
       </w:r>
     </w:p>
     <w:p>
@@ -938,12 +938,12 @@
           <w:b/>
           <w:sz w:val="24"/>
         </w:rPr>
-        <w:t>Dataset 3: Spotify Track Features (Entertainment — music)</w:t>
+        <w:t>Dataset 3: Spotify Track Features (Entertainment: music)</w:t>
       </w:r>
     </w:p>
     <w:p>
       <w:r>
-        <w:t>Which audio features predict popularity — energy, danceability, valence? Matters to streaming economics and A&amp;R; personally, a listener's curiosity. Do features cluster into stable archetypes for playlist design? Matters to recommendation, where the task is matching songs to moods.</w:t>
+        <w:t>Which audio features predict popularity: energy, danceability, valence? Matters to streaming economics and A&amp;R; personally, a listener’s curiosity. Do features cluster into stable archetypes for playlist design? Matters to recommendation, where the task is matching songs to moods.</w:t>
       </w:r>
     </w:p>
     <w:p>
@@ -952,12 +952,12 @@
           <w:b/>
           <w:sz w:val="24"/>
         </w:rPr>
-        <w:t>Dataset 4: TMDB Movie Metadata (Entertainment — film)</w:t>
+        <w:t>Dataset 4: TMDB Movie Metadata (Entertainment: film)</w:t>
       </w:r>
     </w:p>
     <w:p>
       <w:r>
-        <w:t>What drives revenue — budget, genre, cast, timing, pre-release popularity? Matters to greenlighting; personally, what the market pays for as a film consumer. Can a pre-release hit/flop classifier flag failures before money is spent? Matters to risk management where one flop erases a slate.</w:t>
+        <w:t>What drives revenue: budget, genre, cast, timing, pre-release popularity? Matters to greenlighting; personally, what the market pays for as a film consumer. Can a pre-release hit/flop classifier flag failures before money is spent? Matters to risk management where one flop erases a slate.</w:t>
       </w:r>
     </w:p>
     <w:p>
@@ -967,7 +967,7 @@
           <w:b/>
           <w:sz w:val="24"/>
         </w:rPr>
-        <w:t>Dataset 5: FINRA Equity Short Interest, S&amp;P 500 (Finance — equities)</w:t>
+        <w:t>Dataset 5: FINRA Equity Short Interest, S&amp;P 500 (Finance: equities)</w:t>
       </w:r>
     </w:p>
     <w:p>
@@ -976,7 +976,7 @@
         <w:rPr>
           <w:sz w:val="24"/>
         </w:rPr>
-        <w:t>Which stocks are heavily shorted relative to how much they trade, and are they the lower-volume names? Matters to risk managers, prime brokers, and securities lenders: a large short position in a thinly traded stock is harder to cover and carries more squeeze risk, and a lender sees more borrow demand. Personally relevant as a hedge-fund professional, turning a regulatory disclosure into a liquidity question. Does counting shares or measuring days-to-cover change who looks crowded? Only 5 of the 50 largest short positions are also among the 50 with the highest days-to-cover, because the biggest positions sit in the most heavily traded stocks (Nvidia, Ford, Apple). Are large one-report jumps real shorting or corporate actions such as splits and spin-offs? Matters to anyone building a short-interest monitor without false alarms. </w:t>
+        <w:t>Which stocks are heavily shorted relative to how much they trade, and are they the lower-volume names? Matters to risk managers, prime brokers, and securities lenders: a large short position in a thinly traded stock is harder to cover and carries more squeeze risk, and a lender sees more borrow demand. Personally relevant as a hedge-fund professional. Does counting shares or measuring days-to-cover change who looks crowded? Only 5 of the 50 largest short positions are also among the 50 with the highest days-to-cover, because the biggest positions sit in the most heavily traded stocks (Nvidia, Ford, Apple). Are large one-report jumps real shorting or corporate actions such as splits and spin-offs? Matters to anyone building a short-interest monitor without false alarms. </w:t>
       </w:r>
     </w:p>
     <w:p>
@@ -1108,194 +1108,7 @@
     </w:p>
     <w:p>
       <w:r>
-        <w:t xml:space="preserve">I used AI in preparing this document. The tool was Cursor’s AI coding assistant (a Claude model from Anthropic), which reads and edits files in my project folder and runs code when I instruct it. This appendix covers that assistant’s work in the Cursor session for this revision, plus two earlier edits to the draft made by a Cursor cloud agent on October 17, 2026 (removing dataset-mirror labels and splitting out a reflection summary).</w:t>
-      </w:r>
-    </w:p>
-    <w:p>
-      <w:r>
-        <w:rPr>
-          <w:b/>
-        </w:rPr>
-        <w:t xml:space="preserve">How I used it. </w:t>
-      </w:r>
-      <w:r>
-        <w:t xml:space="preserve">(1) Data processing: the assistant downloaded FINRA’s published short-interest files (90 settlement dates, January 2023 to September 2026), built the FINRA-only table for the 496 S&amp;P 500 tickers, and computed every Dataset 5 statistic in this paper (row counts, missing cells, extreme changes, flag counts, class balance, correlations) by running code on those files. (2) Writing and editing: it rewrote the Dataset 5 text in Sections 1 to 4 to use FINRA data only, and revised my personal-interest wording after I corrected my background. (3) Formatting and review: it split the weekly journal into its own PDF, rebuilt the dataset-example tables to fit one page, and graded the draft against the rubric.</w:t>
-      </w:r>
-    </w:p>
-    <w:p>
-      <w:r>
-        <w:rPr>
-          <w:b/>
-        </w:rPr>
-        <w:t xml:space="preserve">Prompts and outputs </w:t>
-      </w:r>
-      <w:r>
-        <w:t xml:space="preserve">(my words, unedited).</w:t>
-      </w:r>
-    </w:p>
-    <w:p>
-      <w:r>
-        <w:rPr>
-          <w:b/>
-        </w:rPr>
-        <w:t xml:space="preserve">Prompt 1: </w:t>
-      </w:r>
-      <w:r>
-        <w:t xml:space="preserve">“data set 5, can we only use FINRA short interest only? do not combine datasets” </w:t>
-      </w:r>
-      <w:r>
-        <w:rPr>
-          <w:b/>
-        </w:rPr>
-        <w:t xml:space="preserve">Output: </w:t>
-      </w:r>
-      <w:r>
-        <w:t xml:space="preserve">the assistant confirmed FINRA short interest could stand alone and listed the price-based targets and findings that would have to be removed.</w:t>
-      </w:r>
-    </w:p>
-    <w:p>
-      <w:r>
-        <w:rPr>
-          <w:b/>
-        </w:rPr>
-        <w:t xml:space="preserve">Prompt 2: </w:t>
-      </w:r>
-      <w:r>
-        <w:t xml:space="preserve">“can u update v 8 then , remove the joining dataset, jsut use FINRA short interest, of cus it mean many findings, models and sentence related to yahoo price or any related findings need to be related” </w:t>
-      </w:r>
-      <w:r>
-        <w:rPr>
-          <w:b/>
-        </w:rPr>
-        <w:t xml:space="preserve">Output: </w:t>
-      </w:r>
-      <w:r>
-        <w:t xml:space="preserve">a revised draft (v9) with Dataset 5 rewritten from FINRA fields only and all Yahoo-based targets, models, and sentences replaced.</w:t>
-      </w:r>
-    </w:p>
-    <w:p>
-      <w:r>
-        <w:rPr>
-          <w:b/>
-        </w:rPr>
-        <w:t xml:space="preserve">Prompt 3: </w:t>
-      </w:r>
-      <w:r>
-        <w:t xml:space="preserve">“can u remove this dataset and dowload the real one?” </w:t>
-      </w:r>
-      <w:r>
-        <w:rPr>
-          <w:b/>
-        </w:rPr>
-        <w:t xml:space="preserve">Output: </w:t>
-      </w:r>
-      <w:r>
-        <w:t xml:space="preserve">the 90 FINRA files were downloaded and the table rebuilt (43,899 rows, 12 columns), then checked against the earlier file on every FINRA field.</w:t>
-      </w:r>
-    </w:p>
-    <w:p>
-      <w:r>
-        <w:rPr>
-          <w:b/>
-        </w:rPr>
-        <w:t xml:space="preserve">Prompt 4: </w:t>
-      </w:r>
-      <w:r>
-        <w:t xml:space="preserve">“...actually im a valuation specialist in hedge fund in hong kong, that's primarily what i am interested and specialised in, not doing courseowwrk . so it is my genuie interest to prove out the volailtity smile via data science method” </w:t>
-      </w:r>
-      <w:r>
-        <w:rPr>
-          <w:b/>
-        </w:rPr>
-        <w:t xml:space="preserve">Output: </w:t>
-      </w:r>
-      <w:r>
-        <w:t xml:space="preserve">the personal-interest sentences in Section 4 and the journal were reworded to describe my work as a valuation specialist, replacing earlier assistant-written wording about coursework and interview preparation.</w:t>
-      </w:r>
-    </w:p>
-    <w:p>
-      <w:r>
-        <w:rPr>
-          <w:b/>
-        </w:rPr>
-        <w:t xml:space="preserve">Prompt 5: </w:t>
-      </w:r>
-      <w:r>
-        <w:t xml:space="preserve">“delete this dx699-reflection-summary.pdf, i want the by week self reflection in appendix to be carved out separtely to another pdf” </w:t>
-      </w:r>
-      <w:r>
-        <w:rPr>
-          <w:b/>
-        </w:rPr>
-        <w:t xml:space="preserve">Output: </w:t>
-      </w:r>
-      <w:r>
-        <w:t xml:space="preserve">the summary PDF was deleted and a standalone weekly-journal PDF produced.</w:t>
-      </w:r>
-    </w:p>
-    <w:p>
-      <w:r>
-        <w:rPr>
-          <w:b/>
-        </w:rPr>
-        <w:t xml:space="preserve">Prompt 6: </w:t>
-      </w:r>
-      <w:r>
-        <w:t xml:space="preserve">“can u grade my v9 ? do u have the grading matrix?” </w:t>
-      </w:r>
-      <w:r>
-        <w:rPr>
-          <w:b/>
-        </w:rPr>
-        <w:t xml:space="preserve">Output: </w:t>
-      </w:r>
-      <w:r>
-        <w:t xml:space="preserve">an estimated rubric score and a list of gaps, including the missing AI appendix.</w:t>
-      </w:r>
-    </w:p>
-    <w:p>
-      <w:r>
-        <w:rPr>
-          <w:b/>
-        </w:rPr>
-        <w:t xml:space="preserve">Prompt 7: </w:t>
-      </w:r>
-      <w:r>
-        <w:t xml:space="preserve">“i still want 3 rows for each dataset” (about fitting the dataset examples on one page) </w:t>
-      </w:r>
-      <w:r>
-        <w:rPr>
-          <w:b/>
-        </w:rPr>
-        <w:t xml:space="preserve">Output: </w:t>
-      </w:r>
-      <w:r>
-        <w:t xml:space="preserve">compact example tables with three rows per dataset on a single page.</w:t>
-      </w:r>
-    </w:p>
-    <w:p>
-      <w:r>
-        <w:rPr>
-          <w:b/>
-        </w:rPr>
-        <w:t xml:space="preserve">Prompt 8: </w:t>
-      </w:r>
-      <w:r>
-        <w:t xml:space="preserve">“add AI appendix” </w:t>
-      </w:r>
-      <w:r>
-        <w:rPr>
-          <w:b/>
-        </w:rPr>
-        <w:t xml:space="preserve">Output: </w:t>
-      </w:r>
-      <w:r>
-        <w:t xml:space="preserve">a draft of this appendix, written by the assistant from the session record.</w:t>
-      </w:r>
-    </w:p>
-    <w:p>
-      <w:r>
-        <w:t xml:space="preserve">The full transcript of the session is stored in my local Cursor chat history and can be provided on request.</w:t>
+        <w:t>I used AI to brainstorm topic areas and to identify datasets that met my requirements (at least 10,000 rows and a sufficient mix of column types). I also used AI to fit the document to the required formatting: 12-point Times New Roman, double spacing, one-inch margins, and the rubric’s section labels.</w:t>
       </w:r>
     </w:p>
     <w:p>
@@ -1326,7 +1139,7 @@
           <w:b/>
           <w:sz w:val="24"/>
         </w:rPr>
-        <w:t>Dataset 1 — SPY options chain snapshot, near-the-money contracts (6 of 23 columns)</w:t>
+        <w:t>Dataset 1: SPY options chain snapshot, near-the-money contracts (6 of 23 columns)</w:t>
       </w:r>
     </w:p>
     <w:tbl>
@@ -1766,7 +1579,7 @@
           <w:b/>
           <w:sz w:val="24"/>
         </w:rPr>
-        <w:t>Dataset 2 — China passenger-vehicle sales (5 of 10 columns)</w:t>
+        <w:t>Dataset 2: China passenger-vehicle sales (5 of 10 columns)</w:t>
       </w:r>
     </w:p>
     <w:tbl>
@@ -2140,7 +1953,7 @@
           <w:b/>
           <w:sz w:val="24"/>
         </w:rPr>
-        <w:t>Dataset 3 — Spotify track features (5 of 20 columns)</w:t>
+        <w:t>Dataset 3: Spotify track features (5 of 20 columns)</w:t>
       </w:r>
     </w:p>
     <w:tbl>
@@ -2514,7 +2327,7 @@
           <w:b/>
           <w:sz w:val="24"/>
         </w:rPr>
-        <w:t>Dataset 4 — TMDB movie metadata (6 of 24 columns)</w:t>
+        <w:t>Dataset 4: TMDB movie metadata (6 of 24 columns)</w:t>
       </w:r>
     </w:p>
     <w:tbl>
@@ -2954,7 +2767,7 @@
           <w:b/>
           <w:sz w:val="24"/>
         </w:rPr>
-        <w:t>Dataset 5 — FINRA equity short interest, S&amp;P 500 (6 of 12 columns)</w:t>
+        <w:t>Dataset 5: FINRA equity short interest, S&amp;P 500 (6 of 12 columns)</w:t>
       </w:r>
     </w:p>
     <w:tbl>

</xml_diff>

<commit_message>
Point Dataset 1 at the live Dubach archive and hyperlink Table 1 sources.
Link each Table 1 source to its public URL. Dubach’s original GitHub repo is gone, so Dataset 1 cites SPY_options.parquet on the lambdaclass data-v1 releases page.

Co-authored-by: Cursor <cursoragent@cursor.com>
</commit_message>
<xml_diff>
--- a/milestone1/dx699-milestone-one-draft-v9.docx
+++ b/milestone1/dx699-milestone-one-draft-v9.docx
@@ -210,12 +210,17 @@
                 <w:sz w:val="24"/>
               </w:rPr>
             </w:r>
-            <w:r>
-              <w:rPr>
-                <w:sz w:val="24"/>
-              </w:rPr>
-              <w:t>Historic Options Dataset (Dubach, 2025)</w:t>
-            </w:r>
+            <w:hyperlink r:id="rId9" w:history="1">
+              <w:r>
+                <w:rPr>
+                  <w:rStyle w:val="Hyperlink"/>
+                  <w:sz w:val="24"/>
+                  <w:color w:val="0563C1"/>
+                  <w:u w:val="single"/>
+                </w:rPr>
+                <w:t>Historic Options Dataset (Dubach, 2025)</w:t>
+              </w:r>
+            </w:hyperlink>
           </w:p>
         </w:tc>
         <w:tc>
@@ -302,12 +307,17 @@
                 <w:sz w:val="24"/>
               </w:rPr>
             </w:r>
-            <w:r>
-              <w:rPr>
-                <w:sz w:val="24"/>
-              </w:rPr>
-              <w:t>CPCA via Kaggle (felixzhao)</w:t>
-            </w:r>
+            <w:hyperlink r:id="rId10" w:history="1">
+              <w:r>
+                <w:rPr>
+                  <w:rStyle w:val="Hyperlink"/>
+                  <w:sz w:val="24"/>
+                  <w:color w:val="0563C1"/>
+                  <w:u w:val="single"/>
+                </w:rPr>
+                <w:t>CPCA via Kaggle (felixzhao)</w:t>
+              </w:r>
+            </w:hyperlink>
           </w:p>
         </w:tc>
         <w:tc>
@@ -394,12 +404,17 @@
                 <w:sz w:val="24"/>
               </w:rPr>
             </w:r>
-            <w:r>
-              <w:rPr>
-                <w:sz w:val="24"/>
-              </w:rPr>
-              <w:t>Ultimate Spotify Tracks DB</w:t>
-            </w:r>
+            <w:hyperlink r:id="rId11" w:history="1">
+              <w:r>
+                <w:rPr>
+                  <w:rStyle w:val="Hyperlink"/>
+                  <w:sz w:val="24"/>
+                  <w:color w:val="0563C1"/>
+                  <w:u w:val="single"/>
+                </w:rPr>
+                <w:t>Ultimate Spotify Tracks DB</w:t>
+              </w:r>
+            </w:hyperlink>
           </w:p>
         </w:tc>
         <w:tc>
@@ -486,12 +501,17 @@
                 <w:sz w:val="24"/>
               </w:rPr>
             </w:r>
-            <w:r>
-              <w:rPr>
-                <w:sz w:val="24"/>
-              </w:rPr>
-              <w:t>The Movies Dataset</w:t>
-            </w:r>
+            <w:hyperlink r:id="rId12" w:history="1">
+              <w:r>
+                <w:rPr>
+                  <w:rStyle w:val="Hyperlink"/>
+                  <w:sz w:val="24"/>
+                  <w:color w:val="0563C1"/>
+                  <w:u w:val="single"/>
+                </w:rPr>
+                <w:t>The Movies Dataset</w:t>
+              </w:r>
+            </w:hyperlink>
           </w:p>
         </w:tc>
         <w:tc>
@@ -578,12 +598,17 @@
                 <w:sz w:val="24"/>
               </w:rPr>
             </w:r>
-            <w:r>
-              <w:rPr>
-                <w:sz w:val="24"/>
-              </w:rPr>
-              <w:t>FINRA Equity Short Interest</w:t>
-            </w:r>
+            <w:hyperlink r:id="rId13" w:history="1">
+              <w:r>
+                <w:rPr>
+                  <w:rStyle w:val="Hyperlink"/>
+                  <w:sz w:val="24"/>
+                  <w:color w:val="0563C1"/>
+                  <w:u w:val="single"/>
+                </w:rPr>
+                <w:t>FINRA Equity Short Interest</w:t>
+              </w:r>
+            </w:hyperlink>
           </w:p>
         </w:tc>
         <w:tc>
@@ -1057,7 +1082,7 @@
         <w:t xml:space="preserve">Historic options dataset: SPY, IWM, and QQQ options 2008–2025</w:t>
       </w:r>
       <w:r>
-        <w:t xml:space="preserve"> [Data set]. GitHub. SPY chain extracted for December 31, 2024. https://github.com/philippdubach/historic-options-dataset</w:t>
+        <w:t xml:space="preserve"> [Data set]. GitHub. SPY options chain, December 31, 2024. Original GitHub repository no longer available. File: SPY_options.parquet, from: https://github.com/lambdaclass/options_portfolio_backtester/releases/</w:t>
       </w:r>
     </w:p>
     <w:p>
@@ -15265,6 +15290,16 @@
       </w:tcPr>
     </w:tblStylePr>
   </w:style>
+  <w:style w:type="character" w:styleId="Hyperlink">
+    <w:name w:val="Hyperlink"/>
+    <w:basedOn w:val="DefaultParagraphFont"/>
+    <w:uiPriority w:val="99"/>
+    <w:unhideWhenUsed/>
+    <w:rPr>
+      <w:color w:val="0563C1" w:themeColor="hyperlink"/>
+      <w:u w:val="single"/>
+    </w:rPr>
+  </w:style>
 </w:styles>
 </file>
 
@@ -27066,6 +27101,16 @@
         <w:shd w:val="clear" w:color="auto" w:fill="FBCAA2" w:themeFill="accent6" w:themeFillTint="7F"/>
       </w:tcPr>
     </w:tblStylePr>
+  </w:style>
+  <w:style w:type="character" w:styleId="Hyperlink">
+    <w:name w:val="Hyperlink"/>
+    <w:basedOn w:val="DefaultParagraphFont"/>
+    <w:uiPriority w:val="99"/>
+    <w:unhideWhenUsed/>
+    <w:rPr>
+      <w:color w:val="0563C1" w:themeColor="hyperlink"/>
+      <w:u w:val="single"/>
+    </w:rPr>
   </w:style>
 </w:styles>
 </file>

</xml_diff>

<commit_message>
Add overfitting guards in Section 3 and rewrite the weekly journal so it reads less like a template.
Co-authored-by: Cursor <cursoragent@cursor.com>
</commit_message>
<xml_diff>
--- a/milestone1/dx699-milestone-one-draft-v9.docx
+++ b/milestone1/dx699-milestone-one-draft-v9.docx
@@ -15,14 +15,12 @@
       <w:r>
         <w:rPr>
           <w:b/>
-          <w:sz w:val="32"/>
         </w:rPr>
         <w:t>DX699 AI for Leaders</w:t>
       </w:r>
       <w:r>
         <w:rPr>
           <w:b/>
-          <w:sz w:val="32"/>
         </w:rPr>
         <w:br/>
         <w:t>Capstone Milestone One:</w:t>
@@ -30,7 +28,6 @@
       <w:r>
         <w:rPr>
           <w:b/>
-          <w:sz w:val="32"/>
         </w:rPr>
         <w:br/>
         <w:t>Identifying a Problem and Relevant Datasets</w:t>
@@ -88,8 +85,14 @@
             <w:tcW w:w="1872" w:type="dxa"/>
           </w:tcPr>
           <w:p>
+            <w:pPr>
+              <w:rPr>
+                <w:rFonts w:cs="Times New Roman"/>
+              </w:rPr>
+            </w:pPr>
             <w:r>
               <w:rPr>
+                <w:rFonts w:cs="Times New Roman"/>
                 <w:b/>
               </w:rPr>
               <w:t>Dataset</w:t>
@@ -101,8 +104,14 @@
             <w:tcW w:w="1872" w:type="dxa"/>
           </w:tcPr>
           <w:p>
+            <w:pPr>
+              <w:rPr>
+                <w:rFonts w:cs="Times New Roman"/>
+              </w:rPr>
+            </w:pPr>
             <w:r>
               <w:rPr>
+                <w:rFonts w:cs="Times New Roman"/>
                 <w:b/>
               </w:rPr>
               <w:t>Size</w:t>
@@ -114,8 +123,14 @@
             <w:tcW w:w="1872" w:type="dxa"/>
           </w:tcPr>
           <w:p>
+            <w:pPr>
+              <w:rPr>
+                <w:rFonts w:cs="Times New Roman"/>
+              </w:rPr>
+            </w:pPr>
             <w:r>
               <w:rPr>
+                <w:rFonts w:cs="Times New Roman"/>
                 <w:b/>
               </w:rPr>
               <w:t>Source</w:t>
@@ -127,8 +142,14 @@
             <w:tcW w:w="1872" w:type="dxa"/>
           </w:tcPr>
           <w:p>
+            <w:pPr>
+              <w:rPr>
+                <w:rFonts w:cs="Times New Roman"/>
+              </w:rPr>
+            </w:pPr>
             <w:r>
               <w:rPr>
+                <w:rFonts w:cs="Times New Roman"/>
                 <w:b/>
               </w:rPr>
               <w:t>Industry</w:t>
@@ -140,8 +161,14 @@
             <w:tcW w:w="1872" w:type="dxa"/>
           </w:tcPr>
           <w:p>
+            <w:pPr>
+              <w:rPr>
+                <w:rFonts w:cs="Times New Roman"/>
+              </w:rPr>
+            </w:pPr>
             <w:r>
               <w:rPr>
+                <w:rFonts w:cs="Times New Roman"/>
                 <w:b/>
               </w:rPr>
               <w:t>Unit of observation</w:t>
@@ -158,7 +185,15 @@
             <w:tcW w:w="1872" w:type="dxa"/>
           </w:tcPr>
           <w:p>
+            <w:pPr>
+              <w:rPr>
+                <w:rFonts w:cs="Times New Roman"/>
+              </w:rPr>
+            </w:pPr>
             <w:r>
+              <w:rPr>
+                <w:rFonts w:cs="Times New Roman"/>
+              </w:rPr>
               <w:t>1. SPY options snapshot</w:t>
             </w:r>
           </w:p>
@@ -168,7 +203,15 @@
             <w:tcW w:w="1872" w:type="dxa"/>
           </w:tcPr>
           <w:p>
+            <w:pPr>
+              <w:rPr>
+                <w:rFonts w:cs="Times New Roman"/>
+              </w:rPr>
+            </w:pPr>
             <w:r>
+              <w:rPr>
+                <w:rFonts w:cs="Times New Roman"/>
+              </w:rPr>
               <w:t>9,646 x 23</w:t>
             </w:r>
           </w:p>
@@ -178,10 +221,16 @@
             <w:tcW w:w="1872" w:type="dxa"/>
           </w:tcPr>
           <w:p>
-            <w:hyperlink r:id="rId6" w:history="1">
+            <w:pPr>
+              <w:rPr>
+                <w:rFonts w:cs="Times New Roman"/>
+              </w:rPr>
+            </w:pPr>
+            <w:hyperlink r:id="rId8" w:history="1">
               <w:r>
                 <w:rPr>
                   <w:rStyle w:val="Hyperlink"/>
+                  <w:rFonts w:cs="Times New Roman"/>
                   <w:color w:val="0563C1"/>
                 </w:rPr>
                 <w:t>Historic Options Dataset (Dubach, 2025)</w:t>
@@ -194,7 +243,15 @@
             <w:tcW w:w="1872" w:type="dxa"/>
           </w:tcPr>
           <w:p>
+            <w:pPr>
+              <w:rPr>
+                <w:rFonts w:cs="Times New Roman"/>
+              </w:rPr>
+            </w:pPr>
             <w:r>
+              <w:rPr>
+                <w:rFonts w:cs="Times New Roman"/>
+              </w:rPr>
               <w:t>Finance</w:t>
             </w:r>
           </w:p>
@@ -204,7 +261,15 @@
             <w:tcW w:w="1872" w:type="dxa"/>
           </w:tcPr>
           <w:p>
+            <w:pPr>
+              <w:rPr>
+                <w:rFonts w:cs="Times New Roman"/>
+              </w:rPr>
+            </w:pPr>
             <w:r>
+              <w:rPr>
+                <w:rFonts w:cs="Times New Roman"/>
+              </w:rPr>
               <w:t>One listed option contract, Dec 31, 2024</w:t>
             </w:r>
           </w:p>
@@ -219,7 +284,15 @@
             <w:tcW w:w="1872" w:type="dxa"/>
           </w:tcPr>
           <w:p>
+            <w:pPr>
+              <w:rPr>
+                <w:rFonts w:cs="Times New Roman"/>
+              </w:rPr>
+            </w:pPr>
             <w:r>
+              <w:rPr>
+                <w:rFonts w:cs="Times New Roman"/>
+              </w:rPr>
               <w:t>2. China EV sales</w:t>
             </w:r>
           </w:p>
@@ -229,7 +302,15 @@
             <w:tcW w:w="1872" w:type="dxa"/>
           </w:tcPr>
           <w:p>
+            <w:pPr>
+              <w:rPr>
+                <w:rFonts w:cs="Times New Roman"/>
+              </w:rPr>
+            </w:pPr>
             <w:r>
+              <w:rPr>
+                <w:rFonts w:cs="Times New Roman"/>
+              </w:rPr>
               <w:t>38,806 x 10</w:t>
             </w:r>
           </w:p>
@@ -239,13 +320,37 @@
             <w:tcW w:w="1872" w:type="dxa"/>
           </w:tcPr>
           <w:p>
-            <w:hyperlink r:id="rId7" w:history="1">
+            <w:pPr>
+              <w:rPr>
+                <w:rFonts w:cs="Times New Roman"/>
+              </w:rPr>
+            </w:pPr>
+            <w:hyperlink r:id="rId9" w:history="1">
               <w:r>
                 <w:rPr>
                   <w:rStyle w:val="Hyperlink"/>
+                  <w:rFonts w:cs="Times New Roman"/>
                   <w:color w:val="0563C1"/>
                 </w:rPr>
-                <w:t>CPCA via Kaggle (felixzhao)</w:t>
+                <w:t>CPCA via Kaggle (</w:t>
+              </w:r>
+              <w:proofErr w:type="spellStart"/>
+              <w:r>
+                <w:rPr>
+                  <w:rStyle w:val="Hyperlink"/>
+                  <w:rFonts w:cs="Times New Roman"/>
+                  <w:color w:val="0563C1"/>
+                </w:rPr>
+                <w:t>felixzhao</w:t>
+              </w:r>
+              <w:proofErr w:type="spellEnd"/>
+              <w:r>
+                <w:rPr>
+                  <w:rStyle w:val="Hyperlink"/>
+                  <w:rFonts w:cs="Times New Roman"/>
+                  <w:color w:val="0563C1"/>
+                </w:rPr>
+                <w:t>)</w:t>
               </w:r>
             </w:hyperlink>
           </w:p>
@@ -255,7 +360,15 @@
             <w:tcW w:w="1872" w:type="dxa"/>
           </w:tcPr>
           <w:p>
+            <w:pPr>
+              <w:rPr>
+                <w:rFonts w:cs="Times New Roman"/>
+              </w:rPr>
+            </w:pPr>
             <w:r>
+              <w:rPr>
+                <w:rFonts w:cs="Times New Roman"/>
+              </w:rPr>
               <w:t>Environment</w:t>
             </w:r>
           </w:p>
@@ -265,7 +378,15 @@
             <w:tcW w:w="1872" w:type="dxa"/>
           </w:tcPr>
           <w:p>
+            <w:pPr>
+              <w:rPr>
+                <w:rFonts w:cs="Times New Roman"/>
+              </w:rPr>
+            </w:pPr>
             <w:r>
+              <w:rPr>
+                <w:rFonts w:cs="Times New Roman"/>
+              </w:rPr>
               <w:t>One vehicle model in one month, Jan 2018-Apr 2024</w:t>
             </w:r>
           </w:p>
@@ -280,7 +401,15 @@
             <w:tcW w:w="1872" w:type="dxa"/>
           </w:tcPr>
           <w:p>
+            <w:pPr>
+              <w:rPr>
+                <w:rFonts w:cs="Times New Roman"/>
+              </w:rPr>
+            </w:pPr>
             <w:r>
+              <w:rPr>
+                <w:rFonts w:cs="Times New Roman"/>
+              </w:rPr>
               <w:t>3. Spotify tracks</w:t>
             </w:r>
           </w:p>
@@ -290,7 +419,15 @@
             <w:tcW w:w="1872" w:type="dxa"/>
           </w:tcPr>
           <w:p>
+            <w:pPr>
+              <w:rPr>
+                <w:rFonts w:cs="Times New Roman"/>
+              </w:rPr>
+            </w:pPr>
             <w:r>
+              <w:rPr>
+                <w:rFonts w:cs="Times New Roman"/>
+              </w:rPr>
               <w:t>114,000 x 20</w:t>
             </w:r>
           </w:p>
@@ -300,10 +437,16 @@
             <w:tcW w:w="1872" w:type="dxa"/>
           </w:tcPr>
           <w:p>
-            <w:hyperlink r:id="rId8" w:history="1">
+            <w:pPr>
+              <w:rPr>
+                <w:rFonts w:cs="Times New Roman"/>
+              </w:rPr>
+            </w:pPr>
+            <w:hyperlink r:id="rId10" w:history="1">
               <w:r>
                 <w:rPr>
                   <w:rStyle w:val="Hyperlink"/>
+                  <w:rFonts w:cs="Times New Roman"/>
                   <w:color w:val="0563C1"/>
                 </w:rPr>
                 <w:t>Ultimate Spotify Tracks DB</w:t>
@@ -316,7 +459,15 @@
             <w:tcW w:w="1872" w:type="dxa"/>
           </w:tcPr>
           <w:p>
+            <w:pPr>
+              <w:rPr>
+                <w:rFonts w:cs="Times New Roman"/>
+              </w:rPr>
+            </w:pPr>
             <w:r>
+              <w:rPr>
+                <w:rFonts w:cs="Times New Roman"/>
+              </w:rPr>
               <w:t>Entertainment</w:t>
             </w:r>
           </w:p>
@@ -326,7 +477,15 @@
             <w:tcW w:w="1872" w:type="dxa"/>
           </w:tcPr>
           <w:p>
+            <w:pPr>
+              <w:rPr>
+                <w:rFonts w:cs="Times New Roman"/>
+              </w:rPr>
+            </w:pPr>
             <w:r>
+              <w:rPr>
+                <w:rFonts w:cs="Times New Roman"/>
+              </w:rPr>
               <w:t>One track (audio features + genre)</w:t>
             </w:r>
           </w:p>
@@ -341,7 +500,15 @@
             <w:tcW w:w="1872" w:type="dxa"/>
           </w:tcPr>
           <w:p>
+            <w:pPr>
+              <w:rPr>
+                <w:rFonts w:cs="Times New Roman"/>
+              </w:rPr>
+            </w:pPr>
             <w:r>
+              <w:rPr>
+                <w:rFonts w:cs="Times New Roman"/>
+              </w:rPr>
               <w:t>4. TMDB movies</w:t>
             </w:r>
           </w:p>
@@ -351,7 +518,15 @@
             <w:tcW w:w="1872" w:type="dxa"/>
           </w:tcPr>
           <w:p>
+            <w:pPr>
+              <w:rPr>
+                <w:rFonts w:cs="Times New Roman"/>
+              </w:rPr>
+            </w:pPr>
             <w:r>
+              <w:rPr>
+                <w:rFonts w:cs="Times New Roman"/>
+              </w:rPr>
               <w:t>45,466 x 24</w:t>
             </w:r>
           </w:p>
@@ -361,10 +536,16 @@
             <w:tcW w:w="1872" w:type="dxa"/>
           </w:tcPr>
           <w:p>
-            <w:hyperlink r:id="rId9" w:history="1">
+            <w:pPr>
+              <w:rPr>
+                <w:rFonts w:cs="Times New Roman"/>
+              </w:rPr>
+            </w:pPr>
+            <w:hyperlink r:id="rId11" w:history="1">
               <w:r>
                 <w:rPr>
                   <w:rStyle w:val="Hyperlink"/>
+                  <w:rFonts w:cs="Times New Roman"/>
                   <w:color w:val="0563C1"/>
                 </w:rPr>
                 <w:t>The Movies Dataset</w:t>
@@ -377,7 +558,15 @@
             <w:tcW w:w="1872" w:type="dxa"/>
           </w:tcPr>
           <w:p>
+            <w:pPr>
+              <w:rPr>
+                <w:rFonts w:cs="Times New Roman"/>
+              </w:rPr>
+            </w:pPr>
             <w:r>
+              <w:rPr>
+                <w:rFonts w:cs="Times New Roman"/>
+              </w:rPr>
               <w:t>Entertainment</w:t>
             </w:r>
           </w:p>
@@ -387,7 +576,15 @@
             <w:tcW w:w="1872" w:type="dxa"/>
           </w:tcPr>
           <w:p>
+            <w:pPr>
+              <w:rPr>
+                <w:rFonts w:cs="Times New Roman"/>
+              </w:rPr>
+            </w:pPr>
             <w:r>
+              <w:rPr>
+                <w:rFonts w:cs="Times New Roman"/>
+              </w:rPr>
               <w:t>One film (budget, revenue, ratings)</w:t>
             </w:r>
           </w:p>
@@ -402,7 +599,15 @@
             <w:tcW w:w="1872" w:type="dxa"/>
           </w:tcPr>
           <w:p>
+            <w:pPr>
+              <w:rPr>
+                <w:rFonts w:cs="Times New Roman"/>
+              </w:rPr>
+            </w:pPr>
             <w:r>
+              <w:rPr>
+                <w:rFonts w:cs="Times New Roman"/>
+              </w:rPr>
               <w:t>5. FINRA short interest, 30 Sep 2026</w:t>
             </w:r>
           </w:p>
@@ -412,7 +617,15 @@
             <w:tcW w:w="1872" w:type="dxa"/>
           </w:tcPr>
           <w:p>
+            <w:pPr>
+              <w:rPr>
+                <w:rFonts w:cs="Times New Roman"/>
+              </w:rPr>
+            </w:pPr>
             <w:r>
+              <w:rPr>
+                <w:rFonts w:cs="Times New Roman"/>
+              </w:rPr>
               <w:t>22,581 x 14</w:t>
             </w:r>
           </w:p>
@@ -422,10 +635,16 @@
             <w:tcW w:w="1872" w:type="dxa"/>
           </w:tcPr>
           <w:p>
-            <w:hyperlink r:id="rId10" w:history="1">
+            <w:pPr>
+              <w:rPr>
+                <w:rFonts w:cs="Times New Roman"/>
+              </w:rPr>
+            </w:pPr>
+            <w:hyperlink r:id="rId12" w:history="1">
               <w:r>
                 <w:rPr>
                   <w:rStyle w:val="Hyperlink"/>
+                  <w:rFonts w:cs="Times New Roman"/>
                   <w:color w:val="0563C1"/>
                 </w:rPr>
                 <w:t>FINRA Equity Short Interest</w:t>
@@ -438,7 +657,15 @@
             <w:tcW w:w="1872" w:type="dxa"/>
           </w:tcPr>
           <w:p>
+            <w:pPr>
+              <w:rPr>
+                <w:rFonts w:cs="Times New Roman"/>
+              </w:rPr>
+            </w:pPr>
             <w:r>
+              <w:rPr>
+                <w:rFonts w:cs="Times New Roman"/>
+              </w:rPr>
               <w:t>Finance</w:t>
             </w:r>
           </w:p>
@@ -448,7 +675,15 @@
             <w:tcW w:w="1872" w:type="dxa"/>
           </w:tcPr>
           <w:p>
+            <w:pPr>
+              <w:rPr>
+                <w:rFonts w:cs="Times New Roman"/>
+              </w:rPr>
+            </w:pPr>
             <w:r>
+              <w:rPr>
+                <w:rFonts w:cs="Times New Roman"/>
+              </w:rPr>
               <w:t>One stock, settlement date 30 Sep 2026</w:t>
             </w:r>
           </w:p>
@@ -480,7 +715,31 @@
       </w:r>
       <w:r>
         <w:lastRenderedPageBreak/>
-        <w:t>identifiers (strike, call/put, expiration), market observables (bid, ask, last, sizes, volume, open interest), and model-derived outputs (implied volatility, delta, gamma, theta, vega, rho, moneyness, in-the-money flag). Mixed types: continuous numerics, categoricals, one binary flag. Cross-sectional, not a time series.</w:t>
+        <w:t xml:space="preserve">identifiers (strike, call/put, expiration), market observables (bid, ask, last, sizes, volume, open interest), and model-derived outputs (implied volatility, delta, gamma, theta, </w:t>
+      </w:r>
+      <w:proofErr w:type="spellStart"/>
+      <w:r>
+        <w:t>vega</w:t>
+      </w:r>
+      <w:proofErr w:type="spellEnd"/>
+      <w:r>
+        <w:t xml:space="preserve">, rho, moneyness, in-the-money flag). Mixed types: continuous </w:t>
+      </w:r>
+      <w:proofErr w:type="spellStart"/>
+      <w:r>
+        <w:t>numerics</w:t>
+      </w:r>
+      <w:proofErr w:type="spellEnd"/>
+      <w:r>
+        <w:t xml:space="preserve">, </w:t>
+      </w:r>
+      <w:proofErr w:type="spellStart"/>
+      <w:r>
+        <w:t>categoricals</w:t>
+      </w:r>
+      <w:proofErr w:type="spellEnd"/>
+      <w:r>
+        <w:t>, one binary flag. Cross-sectional, not a time series.</w:t>
       </w:r>
     </w:p>
     <w:p>
@@ -506,7 +765,39 @@
     </w:p>
     <w:p>
       <w:r>
-        <w:t>114,000 tracks × 20 columns from the Ultimate Spotify Tracks DB (Hamidani, n.d.): identifiers, a popularity score, and Spotify-computed audio features (danceability, energy, loudness, speechiness, acousticness, instrumentalness, liveness, valence, tempo, key, mode, time signature, duration, explicit flag) plus a genre label. Artificially balanced at 114 genres × 1,000 tracks.</w:t>
+        <w:t>114,000 tracks × 20 columns from the Ultimate Spotify Tracks DB (</w:t>
+      </w:r>
+      <w:proofErr w:type="spellStart"/>
+      <w:r>
+        <w:t>Hamidani</w:t>
+      </w:r>
+      <w:proofErr w:type="spellEnd"/>
+      <w:r>
+        <w:t xml:space="preserve">, n.d.): identifiers, a popularity score, and Spotify-computed audio features (danceability, energy, loudness, </w:t>
+      </w:r>
+      <w:proofErr w:type="spellStart"/>
+      <w:r>
+        <w:t>speechiness</w:t>
+      </w:r>
+      <w:proofErr w:type="spellEnd"/>
+      <w:r>
+        <w:t xml:space="preserve">, </w:t>
+      </w:r>
+      <w:proofErr w:type="spellStart"/>
+      <w:r>
+        <w:t>acousticness</w:t>
+      </w:r>
+      <w:proofErr w:type="spellEnd"/>
+      <w:r>
+        <w:t xml:space="preserve">, </w:t>
+      </w:r>
+      <w:proofErr w:type="spellStart"/>
+      <w:r>
+        <w:t>instrumentalness</w:t>
+      </w:r>
+      <w:proofErr w:type="spellEnd"/>
+      <w:r>
+        <w:t>, liveness, valence, tempo, key, mode, time signature, duration, explicit flag) plus a genre label. Artificially balanced at 114 genres × 1,000 tracks.</w:t>
       </w:r>
     </w:p>
     <w:p>
@@ -519,7 +810,15 @@
     </w:p>
     <w:p>
       <w:r>
-        <w:t>45,466 films × 24 columns from The Movies Dataset (Banik, 2017): budget, revenue, runtime, release date, vote average/count, popularity, language, overview text, tagline, and nested-JSON columns (genres, companies, countries, cast, crew) requiring parsing. The paper’s widest mix of data types: numerics, dates, free text, and structured JSON in one table.</w:t>
+        <w:t xml:space="preserve">45,466 films × 24 columns from The Movies Dataset (Banik, 2017): budget, revenue, runtime, release date, vote average/count, popularity, language, overview text, tagline, and nested-JSON columns (genres, companies, countries, cast, crew) requiring parsing. The paper’s widest mix of data types: </w:t>
+      </w:r>
+      <w:proofErr w:type="spellStart"/>
+      <w:r>
+        <w:t>numerics</w:t>
+      </w:r>
+      <w:proofErr w:type="spellEnd"/>
+      <w:r>
+        <w:t>, dates, free text, and structured JSON in one table.</w:t>
       </w:r>
     </w:p>
     <w:p>
@@ -560,7 +859,15 @@
     </w:p>
     <w:p>
       <w:r>
-        <w:t>No missing values. The problem is 625 zero-bid contracts (6.5%), typically deep out-of-the-money long-dated puts quoted 0.00 bid against a wide ask with no volume. These dead quotes cannot be traded; any model trained on them learns from prices that do not exist, so they are discarded outright. A further ~200 ultra-wide-spread contracts (spreads above 50%) are filtered the same way, and implied volatility (range 0.015–4.034, extremes in illiquid names) is winsorized. Volume concentrates in zero-days-to-expi</w:t>
+        <w:t xml:space="preserve">No missing values. The problem is 625 zero-bid contracts (6.5%), typically deep out-of-the-money long-dated puts quoted 0.00 bid against a wide ask with no volume. These dead quotes cannot be traded; any model trained on them learns from prices that do not exist, so they are discarded outright. A further ~200 ultra-wide-spread contracts (spreads above 50%) are filtered the same way, and implied volatility (range 0.015–4.034, extremes in illiquid names) is </w:t>
+      </w:r>
+      <w:proofErr w:type="spellStart"/>
+      <w:r>
+        <w:t>winsorized</w:t>
+      </w:r>
+      <w:proofErr w:type="spellEnd"/>
+      <w:r>
+        <w:t>. Volume concentrates in zero-days-to-expi</w:t>
       </w:r>
       <w:r>
         <w:t>ry and weeklies, so analysis is stratified by expiration; mid-prices replace last trades to avoid bid-ask bounce; the Greeks are model-derived features carrying model risk, not ground truth.</w:t>
@@ -647,10 +954,7 @@
     </w:p>
     <w:p>
       <w:r>
-        <w:t>Supervised regression: predict implied volatility from strike, moneyness, and time to expiry; each contract carries the quoted IV as target. The smile’s nonlinearity suits tree ensembles or neural networks; a polynomial alternative tests the smile directly through its quadratic moneyness term. Classification: liquid vs illiquid from spread, volume, open interest, and distance from spot, a market-microstructure task modeling which contracts are tradable. Trees fit the regression because the smile is smooth b</w:t>
-      </w:r>
-      <w:r>
-        <w:t>ut non-quadratic; the classifier fits because liquidity is a threshold phenomenon in spread and volume.</w:t>
+        <w:t>Supervised regression: predict implied volatility from strike, moneyness, and time to expiry; each contract carries the quoted IV as target. The smile's nonlinearity suits tree ensembles or a polynomial in moneyness. Classification: liquid vs illiquid from spread, volume, open interest, and distance from spot. Trees fit because the smile is smooth but non-quadratic; the classifier fits because liquidity is a threshold in spread and volume. A deep tree can memorize one day's quotes, so I would hold out expirations (or k-fold by tenor) and cap depth so the smile generalizes to unseen strikes.</w:t>
       </w:r>
     </w:p>
     <w:p>
@@ -663,10 +967,7 @@
     </w:p>
     <w:p>
       <w:r>
-        <w:t>Classification: predict the EV-versus-gasoline flag from brand, brand country, body type, and price band. Every model-month carries the label; tree ensembles suit the mixed features, and the exercise measures how predictable the transition was. Regression: predict monthly EV units from lagged sales and segment mix with expanding-window splits (no leakage); comparing a seasonal baseline to gradient boosting across the series’ three structural phases shows which model holds up. Expanding windows respect tempo</w:t>
-      </w:r>
-      <w:r>
-        <w:t>ral order; trees handle the categorical-heavy features without one-hot explosions.</w:t>
+        <w:t>Classification: predict the EV-versus-gasoline flag from brand, brand country, body type, and price band. Tree ensembles suit the mixed categorical features without a one-hot explosion. Regression: predict monthly EV units from lagged sales and segment mix. Expanding-window splits (no leakage) and a seasonal baseline are the overfitting guards: a booster that only looks good inside 2021-2022 has not generalized.</w:t>
       </w:r>
     </w:p>
     <w:p>
@@ -679,11 +980,15 @@
     </w:p>
     <w:p>
       <w:r>
-        <w:t xml:space="preserve">Classification: predict popularity tier (or genre, post-dedupe) from audio features, to see which sonic attributes the market rewards. Clustering: group tracks into data-derived archetypes (e.g., high-energy/low-acousticness) for playlist and recommendation design, where the problem is </w:t>
+        <w:t>Classification: predict popularity tier (or genre, post-dedupe) from audio features, to see which sonic attributes the market rewards. Clustering: group tracks into data-derived archetypes (high-energy/low-</w:t>
       </w:r>
+      <w:proofErr w:type="spellStart"/>
       <w:r>
-        <w:lastRenderedPageBreak/>
-        <w:t>matching songs to moods, not predicting one number. The audio features are dense and continuous, which suits clustering.</w:t>
+        <w:t>acousticness</w:t>
+      </w:r>
+      <w:proofErr w:type="spellEnd"/>
+      <w:r>
+        <w:t>) for playlist design; the features are dense and continuous, which suits clustering. Split by track id (grouped k-fold), not by row, so the same song cannot sit in train and test under two genre labels.</w:t>
       </w:r>
     </w:p>
     <w:p>
@@ -696,7 +1001,8 @@
     </w:p>
     <w:p>
       <w:r>
-        <w:t>Regression: predict log box-office revenue from budget, genre, cast/crew, timing, and pre-release popularity, the studio greenlight problem. Classification: hit vs flop (revenue &gt; 2× budget) from pre-release features only, evaluated with precision-recall for the asymmetric cost of a false greenlight. The log transform tames revenue’s skew for linear models; trees capture the budget-genre interactions studios argue about.</w:t>
+        <w:lastRenderedPageBreak/>
+        <w:t>Regression: predict log box-office revenue from budget, genre, cast/crew, timing, and pre-release popularity, the studio greenlight problem. Classification: hit vs flop (revenue &gt; 2x budget) from pre-release features only, evaluated with precision-recall for the asymmetric cost of a false greenlight. A year-based hold-out plus a regularized log-linear model, or a depth-capped tree, keeps a 1995 film from training the 2016 greenlight.</w:t>
       </w:r>
     </w:p>
     <w:p>
@@ -709,10 +1015,7 @@
     </w:p>
     <w:p>
       <w:r>
-        <w:t>Regression: predict log short shares from log average daily volume and market class, dropping the 3,143 zero-volume names. Volume explains much less of the position than it does in a large-cap slice (R² 0.42; log correlation 0.65). The residual, actual short shares divided by what volume predicts, is the anomaly score. Classification: label a name crowded when days-to-cover is above 5 (37% of rows) and test whether volume quartile and market class predict it (48% of the lowest-volume quartile, 25% of the hi</w:t>
-      </w:r>
-      <w:r>
-        <w:t>ghest). Short shares and days-to-cover stay out of the features. Clustering on log volume, log short shares, and days-to-cover can separate crowded OTC names from liquid large caps. Evaluation is a random split; there is one row per symbol.</w:t>
+        <w:t>Regression: predict log short shares from log average daily volume and market class, dropping the 3,143 zero-volume names (R-squared 0.42; log correlation 0.65). The residual versus that volume prediction is the anomaly score. Classification: crowded = days-to-cover above 5 (37% of rows), predicted from volume quartile and market class (48% in the lowest-volume quartile, 25% in the highest); short shares and days-to-cover stay out of the features. Clustering on log volume, log short shares, and days-to-cover can separate crowded OTC names from liquid large caps. One row per symbol, so a random split is valid; I would stratify by market class, keep the tree shallow, and treat a collapse to the majority class on the hold-out as overfitting to the OTC days-to-cover cap.</w:t>
       </w:r>
     </w:p>
     <w:p>
@@ -736,11 +1039,11 @@
     </w:p>
     <w:p>
       <w:r>
-        <w:t xml:space="preserve">Can ML recover the volatility smile by predicting IV from moneyness and expiry? Matters to volatility trading and market-making; personally, as a valuation specialist at a Hong Kong hedge fund, I want to prove out the volatility smile with data science methods rather than take it as a </w:t>
+        <w:t xml:space="preserve">Can ML recover the volatility smile by predicting IV from moneyness and expiry? Matters to volatility trading and market-making; personally, as a valuation specialist at a Hong Kong hedge fund, I want to prove out the volatility smile with data science methods rather than take it as a textbook given: an empirical test of the constant-volatility assumption behind Black-Scholes (Black &amp; Scholes, 1973). Do market Greeks behave as textbooks say across moneyness and </w:t>
       </w:r>
       <w:r>
         <w:lastRenderedPageBreak/>
-        <w:t>textbook given: an empirical test of the constant-volatility assumption behind Black-Scholes (Black &amp; Scholes, 1973). Do market Greeks behave as textbooks say across moneyness and tenor? I verified each behavior empirically here, useful for valuation and risk management and as a check on the data’s consistency. What drives IV most: moneyness, expiry, or liquidity? Tells pricing/risk functions where modeling effort belongs.</w:t>
+        <w:t>tenor? I verified each behavior empirically here, useful for valuation and risk management and as a check on the data’s consistency. What drives IV most: moneyness, expiry, or liquidity? Tells pricing/risk functions where modeling effort belongs.</w:t>
       </w:r>
     </w:p>
     <w:p>
@@ -779,7 +1082,15 @@
     </w:p>
     <w:p>
       <w:r>
-        <w:t>What drives revenue: budget, genre, cast, timing, pre-release popularity? Matters to greenlighting; personally, what the market pays for as a film consumer. Can a pre-release hit/flop classifier flag failures before money is spent? Matters to risk management where one flop erases a slate.</w:t>
+        <w:t xml:space="preserve">What drives revenue: budget, genre, cast, timing, pre-release popularity? Matters to greenlighting; personally, what the market pays for as a film consumer. Can a pre-release hit/flop classifier flag failures before money </w:t>
+      </w:r>
+      <w:proofErr w:type="gramStart"/>
+      <w:r>
+        <w:t>is</w:t>
+      </w:r>
+      <w:proofErr w:type="gramEnd"/>
+      <w:r>
+        <w:t xml:space="preserve"> spent? Matters to risk management where one flop erases a slate.</w:t>
       </w:r>
     </w:p>
     <w:p>
@@ -792,14 +1103,11 @@
     </w:p>
     <w:p>
       <w:r>
-        <w:t xml:space="preserve">Which names are heavily shorted relative to how much they trade, and are they the lower-volume names? Matters to risk managers, prime brokers, and securities lenders: a large short position in </w:t>
+        <w:t xml:space="preserve">Which names are heavily shorted relative to how much they trade, and are they the lower-volume names? Matters to risk managers, prime brokers, and securities lenders: a large short position in a thinly traded stock is harder to cover and carries more squeeze risk, and a lender sees more borrow demand. Personally relevant as a hedge-fund professional. Does counting shares or </w:t>
       </w:r>
       <w:r>
         <w:lastRenderedPageBreak/>
-        <w:t xml:space="preserve">a thinly traded stock is harder to cover and carries more squeeze risk, and a lender sees more borrow demand. Personally relevant as a hedge-fund professional. Does counting shares or measuring days-to-cover change who looks crowded? Only 1 of the 50 largest short positions is also among the 50 with the highest days-to-cover. The largest share counts are Nvidia, Transocean, Plug Power, Grab, and Opendoor; the highest days-to-cover are illiquid OTC names at FINRA’s 999.99 cap. Are large percent changes real </w:t>
-      </w:r>
-      <w:r>
-        <w:t>shorting or corporate actions such as splits? Matters to anyone building a short-interest monitor without false alarms.</w:t>
+        <w:t>measuring days-to-cover change who looks crowded? Only 1 of the 50 largest short positions is also among the 50 with the highest days-to-cover. The largest share counts are Nvidia, Transocean, Plug Power, Grab, and Opendoor; the highest days-to-cover are illiquid OTC names at FINRA’s 999.99 cap. Are large percent changes real shorting or corporate actions such as splits? Matters to anyone building a short-interest monitor without false alarms.</w:t>
       </w:r>
     </w:p>
     <w:p>
@@ -815,52 +1123,87 @@
       </w:r>
     </w:p>
     <w:p>
+      <w:pPr>
+        <w:widowControl w:val="0"/>
+      </w:pPr>
       <w:r>
-        <w:t>The project started broad and narrowed fast. I began with more candidate datasets than I could defend; testing them against finance, environment, and entertainment cut the list to five. Week 1 put the business problem before the dataset, and Week 2's CRISP-DM framing made each candidate earn a prediction task. Extracting the SPY snapshot was the turning point: IV against strike reproduced the skew, and the Greeks against moneyness matched textbook delta, gamma, theta, and vega, the empirical check I wanted as a valuation specialist. Weeks 3-4 treated the chain as supervised segmentation across moneyness and expiry. A smile fit too tightly to one day's quotes is memorization, not a model.</w:t>
+        <w:t>The project started broad and narrowed to five datasets I could defend in finance, environment, and entertainment. Week 1 put the business problem before the dataset; Week 2's CRISP-DM framing made each candidate earn a prediction task. The SPY snapshot was the turning point: IV against strike reproduced the skew. Weeks 3-4 treated the chain as supervised segmentation. Overfitting is when a model learns the noise in its training data instead of the real pattern, so it scores great on the data it trained on but fails on new data. Memorization versus understanding. Fitting a volatility smile so tightly to one day's quotes that it nails every print but blows up the next day is what that looks like in my work. That is why the course pairs it with train/test splits and cross-validation. The cure is always testing on data the model has not seen.</w:t>
       </w:r>
     </w:p>
     <w:p>
       <w:pPr>
-        <w:keepNext/>
-        <w:jc w:val="center"/>
-        <w:rPr>
-          <w:b/>
-        </w:rPr>
-      </w:pPr>
-    </w:p>
-    <w:p>
-      <w:pPr>
-        <w:keepNext/>
+        <w:widowControl w:val="0"/>
         <w:jc w:val="center"/>
       </w:pPr>
       <w:r>
         <w:rPr>
           <w:b/>
         </w:rPr>
-        <w:t>Zero-bid contracts, duplicate rows, zero-coded budgets, and corporate-action jumps looked like footnotes until I asked what each one does to the target. That is Week 5 in practice: a model is only as honest as the labels it learns from. This paper treats each file as its own table, which was the right way to describe the datasets and their quality problems. In my opinion, joining datasets is an important next step. It enriches the data enough to address real-world issues a single table cannot: short interest without prices, a smile without realized volatility, sales without a policy calendar.</w:t>
+        <w:t>Zero-bid contracts, duplicate rows, zero-coded budgets, and corporate-action jumps looked like footnotes until I asked what each one does to the target. That is Week 5 in practice: a model is only as honest as the labels it learns from. This paper treats each file as its own table. In my opinion, joining datasets is an important next step. It enriches the data enough to address real-world issues a single table cannot: short interest without prices, a smile without realized volatility, sales without a policy calendar.</w:t>
       </w:r>
+    </w:p>
+    <w:p>
+      <w:pPr>
+        <w:ind w:left="720" w:hanging="720"/>
+      </w:pPr>
+    </w:p>
+    <w:p>
+      <w:pPr>
+        <w:pageBreakBefore/>
+        <w:rPr>
+          <w:rFonts w:cs="Times New Roman"/>
+          <w:b/>
+        </w:rPr>
+      </w:pPr>
       <w:r>
         <w:rPr>
+          <w:rFonts w:cs="Times New Roman"/>
           <w:b/>
         </w:rPr>
+        <w:lastRenderedPageBreak/>
         <w:t>Appendix A: Citations</w:t>
       </w:r>
     </w:p>
     <w:p>
       <w:pPr>
         <w:ind w:left="720" w:hanging="720"/>
+        <w:rPr>
+          <w:rFonts w:cs="Times New Roman"/>
+        </w:rPr>
       </w:pPr>
       <w:r>
-        <w:t xml:space="preserve">Banik, R. (2017). </w:t>
+        <w:rPr>
+          <w:rFonts w:cs="Times New Roman"/>
+        </w:rPr>
+        <w:t xml:space="preserve">Banik, R. (2017). The movies dataset [Data set]. Kaggle. Metadata compiled from The Movie Database (TMDB) API and </w:t>
       </w:r>
+      <w:proofErr w:type="spellStart"/>
       <w:r>
         <w:rPr>
-          <w:i/>
+          <w:rFonts w:cs="Times New Roman"/>
         </w:rPr>
-        <w:t>The movies dataset</w:t>
+        <w:t>GroupLens</w:t>
       </w:r>
+      <w:proofErr w:type="spellEnd"/>
       <w:r>
-        <w:t xml:space="preserve"> [Data set]. Kaggle. Metadata compiled from The Movie Database (TMDB) API and GroupLens MovieLens. https://www.kaggle.com/datasets/rounakbanik/the-movies-dataset</w:t>
+        <w:rPr>
+          <w:rFonts w:cs="Times New Roman"/>
+        </w:rPr>
+        <w:t xml:space="preserve"> </w:t>
+      </w:r>
+      <w:proofErr w:type="spellStart"/>
+      <w:r>
+        <w:rPr>
+          <w:rFonts w:cs="Times New Roman"/>
+        </w:rPr>
+        <w:t>MovieLens</w:t>
+      </w:r>
+      <w:proofErr w:type="spellEnd"/>
+      <w:r>
+        <w:rPr>
+          <w:rFonts w:cs="Times New Roman"/>
+        </w:rPr>
+        <w:t>. https://www.kaggle.com/datasets/rounakbanik/the-movies-dataset</w:t>
       </w:r>
     </w:p>
     <w:p>
@@ -911,7 +1254,20 @@
         <w:t>Historic options dataset: SPY, IWM, and QQQ options 2008–2025</w:t>
       </w:r>
       <w:r>
-        <w:t xml:space="preserve"> [Data set]. GitHub. SPY options chain, December 31, 2024. Original GitHub repository no longer available. File: SPY_options.parquet, from: https://github.com/lambdaclass/options_portfolio_backtester/releases/</w:t>
+        <w:t xml:space="preserve"> [Data set]. GitHub. SPY options chain, December 31, 2024. Original GitHub repository no longer available. File: </w:t>
+      </w:r>
+      <w:proofErr w:type="spellStart"/>
+      <w:r>
+        <w:t>SPY_</w:t>
+      </w:r>
+      <w:proofErr w:type="gramStart"/>
+      <w:r>
+        <w:t>options.parquet</w:t>
+      </w:r>
+      <w:proofErr w:type="spellEnd"/>
+      <w:proofErr w:type="gramEnd"/>
+      <w:r>
+        <w:t>, from: https://github.com/lambdaclass/options_portfolio_backtester/releases/</w:t>
       </w:r>
     </w:p>
     <w:p>
@@ -935,8 +1291,13 @@
       <w:pPr>
         <w:ind w:left="720" w:hanging="720"/>
       </w:pPr>
+      <w:proofErr w:type="spellStart"/>
       <w:r>
-        <w:t xml:space="preserve">Hamidani, Z. (n.d.). </w:t>
+        <w:t>Hamidani</w:t>
+      </w:r>
+      <w:proofErr w:type="spellEnd"/>
+      <w:r>
+        <w:t xml:space="preserve">, Z. (n.d.). </w:t>
       </w:r>
       <w:r>
         <w:rPr>
@@ -989,10 +1350,13 @@
     <w:p>
       <w:pPr>
         <w:keepNext/>
-        <w:spacing w:before="120" w:after="60" w:line="240" w:lineRule="auto"/>
+        <w:rPr>
+          <w:rFonts w:cs="Times New Roman"/>
+        </w:rPr>
       </w:pPr>
       <w:r>
         <w:rPr>
+          <w:rFonts w:cs="Times New Roman"/>
           <w:b/>
         </w:rPr>
         <w:t>Dataset 1: SPY options chain snapshot, near-the-money contracts (6 of 23 columns)</w:t>
@@ -1025,14 +1389,19 @@
           </w:tcPr>
           <w:p>
             <w:pPr>
-              <w:spacing w:line="240" w:lineRule="auto"/>
+              <w:rPr>
+                <w:rFonts w:cs="Times New Roman"/>
+              </w:rPr>
             </w:pPr>
+            <w:proofErr w:type="spellStart"/>
             <w:r>
               <w:rPr>
+                <w:rFonts w:cs="Times New Roman"/>
                 <w:b/>
               </w:rPr>
               <w:t>contract_id</w:t>
             </w:r>
+            <w:proofErr w:type="spellEnd"/>
           </w:p>
         </w:tc>
         <w:tc>
@@ -1041,10 +1410,13 @@
           </w:tcPr>
           <w:p>
             <w:pPr>
-              <w:spacing w:line="240" w:lineRule="auto"/>
+              <w:rPr>
+                <w:rFonts w:cs="Times New Roman"/>
+              </w:rPr>
             </w:pPr>
             <w:r>
               <w:rPr>
+                <w:rFonts w:cs="Times New Roman"/>
                 <w:b/>
               </w:rPr>
               <w:t>strike</w:t>
@@ -1057,10 +1429,13 @@
           </w:tcPr>
           <w:p>
             <w:pPr>
-              <w:spacing w:line="240" w:lineRule="auto"/>
+              <w:rPr>
+                <w:rFonts w:cs="Times New Roman"/>
+              </w:rPr>
             </w:pPr>
             <w:r>
               <w:rPr>
+                <w:rFonts w:cs="Times New Roman"/>
                 <w:b/>
               </w:rPr>
               <w:t>type</w:t>
@@ -1073,10 +1448,13 @@
           </w:tcPr>
           <w:p>
             <w:pPr>
-              <w:spacing w:line="240" w:lineRule="auto"/>
+              <w:rPr>
+                <w:rFonts w:cs="Times New Roman"/>
+              </w:rPr>
             </w:pPr>
             <w:r>
               <w:rPr>
+                <w:rFonts w:cs="Times New Roman"/>
                 <w:b/>
               </w:rPr>
               <w:t>last</w:t>
@@ -1089,10 +1467,13 @@
           </w:tcPr>
           <w:p>
             <w:pPr>
-              <w:spacing w:line="240" w:lineRule="auto"/>
+              <w:rPr>
+                <w:rFonts w:cs="Times New Roman"/>
+              </w:rPr>
             </w:pPr>
             <w:r>
               <w:rPr>
+                <w:rFonts w:cs="Times New Roman"/>
                 <w:b/>
               </w:rPr>
               <w:t>volume</w:t>
@@ -1105,14 +1486,19 @@
           </w:tcPr>
           <w:p>
             <w:pPr>
-              <w:spacing w:line="240" w:lineRule="auto"/>
+              <w:rPr>
+                <w:rFonts w:cs="Times New Roman"/>
+              </w:rPr>
             </w:pPr>
+            <w:proofErr w:type="spellStart"/>
             <w:r>
               <w:rPr>
+                <w:rFonts w:cs="Times New Roman"/>
                 <w:b/>
               </w:rPr>
               <w:t>implied_volatility</w:t>
             </w:r>
+            <w:proofErr w:type="spellEnd"/>
           </w:p>
         </w:tc>
       </w:tr>
@@ -1127,9 +1513,14 @@
           </w:tcPr>
           <w:p>
             <w:pPr>
-              <w:spacing w:line="240" w:lineRule="auto"/>
+              <w:rPr>
+                <w:rFonts w:cs="Times New Roman"/>
+              </w:rPr>
             </w:pPr>
             <w:r>
+              <w:rPr>
+                <w:rFonts w:cs="Times New Roman"/>
+              </w:rPr>
               <w:t>SPY250207C00594000</w:t>
             </w:r>
           </w:p>
@@ -1140,9 +1531,14 @@
           </w:tcPr>
           <w:p>
             <w:pPr>
-              <w:spacing w:line="240" w:lineRule="auto"/>
+              <w:rPr>
+                <w:rFonts w:cs="Times New Roman"/>
+              </w:rPr>
             </w:pPr>
             <w:r>
+              <w:rPr>
+                <w:rFonts w:cs="Times New Roman"/>
+              </w:rPr>
               <w:t>594.0</w:t>
             </w:r>
           </w:p>
@@ -1153,9 +1549,14 @@
           </w:tcPr>
           <w:p>
             <w:pPr>
-              <w:spacing w:line="240" w:lineRule="auto"/>
+              <w:rPr>
+                <w:rFonts w:cs="Times New Roman"/>
+              </w:rPr>
             </w:pPr>
             <w:r>
+              <w:rPr>
+                <w:rFonts w:cs="Times New Roman"/>
+              </w:rPr>
               <w:t>call</w:t>
             </w:r>
           </w:p>
@@ -1166,9 +1567,14 @@
           </w:tcPr>
           <w:p>
             <w:pPr>
-              <w:spacing w:line="240" w:lineRule="auto"/>
+              <w:rPr>
+                <w:rFonts w:cs="Times New Roman"/>
+              </w:rPr>
             </w:pPr>
             <w:r>
+              <w:rPr>
+                <w:rFonts w:cs="Times New Roman"/>
+              </w:rPr>
               <w:t>7.8</w:t>
             </w:r>
           </w:p>
@@ -1179,9 +1585,14 @@
           </w:tcPr>
           <w:p>
             <w:pPr>
-              <w:spacing w:line="240" w:lineRule="auto"/>
+              <w:rPr>
+                <w:rFonts w:cs="Times New Roman"/>
+              </w:rPr>
             </w:pPr>
             <w:r>
+              <w:rPr>
+                <w:rFonts w:cs="Times New Roman"/>
+              </w:rPr>
               <w:t>275</w:t>
             </w:r>
           </w:p>
@@ -1192,9 +1603,14 @@
           </w:tcPr>
           <w:p>
             <w:pPr>
-              <w:spacing w:line="240" w:lineRule="auto"/>
+              <w:rPr>
+                <w:rFonts w:cs="Times New Roman"/>
+              </w:rPr>
             </w:pPr>
             <w:r>
+              <w:rPr>
+                <w:rFonts w:cs="Times New Roman"/>
+              </w:rPr>
               <w:t>0.13195</w:t>
             </w:r>
           </w:p>
@@ -1211,9 +1627,14 @@
           </w:tcPr>
           <w:p>
             <w:pPr>
-              <w:spacing w:line="240" w:lineRule="auto"/>
+              <w:rPr>
+                <w:rFonts w:cs="Times New Roman"/>
+              </w:rPr>
             </w:pPr>
             <w:r>
+              <w:rPr>
+                <w:rFonts w:cs="Times New Roman"/>
+              </w:rPr>
               <w:t>SPY250207P00594000</w:t>
             </w:r>
           </w:p>
@@ -1224,9 +1645,14 @@
           </w:tcPr>
           <w:p>
             <w:pPr>
-              <w:spacing w:line="240" w:lineRule="auto"/>
+              <w:rPr>
+                <w:rFonts w:cs="Times New Roman"/>
+              </w:rPr>
             </w:pPr>
             <w:r>
+              <w:rPr>
+                <w:rFonts w:cs="Times New Roman"/>
+              </w:rPr>
               <w:t>594.0</w:t>
             </w:r>
           </w:p>
@@ -1237,9 +1663,14 @@
           </w:tcPr>
           <w:p>
             <w:pPr>
-              <w:spacing w:line="240" w:lineRule="auto"/>
+              <w:rPr>
+                <w:rFonts w:cs="Times New Roman"/>
+              </w:rPr>
             </w:pPr>
             <w:r>
+              <w:rPr>
+                <w:rFonts w:cs="Times New Roman"/>
+              </w:rPr>
               <w:t>put</w:t>
             </w:r>
           </w:p>
@@ -1250,9 +1681,14 @@
           </w:tcPr>
           <w:p>
             <w:pPr>
-              <w:spacing w:line="240" w:lineRule="auto"/>
+              <w:rPr>
+                <w:rFonts w:cs="Times New Roman"/>
+              </w:rPr>
             </w:pPr>
             <w:r>
+              <w:rPr>
+                <w:rFonts w:cs="Times New Roman"/>
+              </w:rPr>
               <w:t>12.94</w:t>
             </w:r>
           </w:p>
@@ -1263,9 +1699,14 @@
           </w:tcPr>
           <w:p>
             <w:pPr>
-              <w:spacing w:line="240" w:lineRule="auto"/>
+              <w:rPr>
+                <w:rFonts w:cs="Times New Roman"/>
+              </w:rPr>
             </w:pPr>
             <w:r>
+              <w:rPr>
+                <w:rFonts w:cs="Times New Roman"/>
+              </w:rPr>
               <w:t>12</w:t>
             </w:r>
           </w:p>
@@ -1276,9 +1717,14 @@
           </w:tcPr>
           <w:p>
             <w:pPr>
-              <w:spacing w:line="240" w:lineRule="auto"/>
+              <w:rPr>
+                <w:rFonts w:cs="Times New Roman"/>
+              </w:rPr>
             </w:pPr>
             <w:r>
+              <w:rPr>
+                <w:rFonts w:cs="Times New Roman"/>
+              </w:rPr>
               <w:t>0.1417</w:t>
             </w:r>
           </w:p>
@@ -1295,9 +1741,14 @@
           </w:tcPr>
           <w:p>
             <w:pPr>
-              <w:spacing w:line="240" w:lineRule="auto"/>
+              <w:rPr>
+                <w:rFonts w:cs="Times New Roman"/>
+              </w:rPr>
             </w:pPr>
             <w:r>
+              <w:rPr>
+                <w:rFonts w:cs="Times New Roman"/>
+              </w:rPr>
               <w:t>SPY250207C00595000</w:t>
             </w:r>
           </w:p>
@@ -1308,9 +1759,14 @@
           </w:tcPr>
           <w:p>
             <w:pPr>
-              <w:spacing w:line="240" w:lineRule="auto"/>
+              <w:rPr>
+                <w:rFonts w:cs="Times New Roman"/>
+              </w:rPr>
             </w:pPr>
             <w:r>
+              <w:rPr>
+                <w:rFonts w:cs="Times New Roman"/>
+              </w:rPr>
               <w:t>595.0</w:t>
             </w:r>
           </w:p>
@@ -1321,9 +1777,14 @@
           </w:tcPr>
           <w:p>
             <w:pPr>
-              <w:spacing w:line="240" w:lineRule="auto"/>
+              <w:rPr>
+                <w:rFonts w:cs="Times New Roman"/>
+              </w:rPr>
             </w:pPr>
             <w:r>
+              <w:rPr>
+                <w:rFonts w:cs="Times New Roman"/>
+              </w:rPr>
               <w:t>call</w:t>
             </w:r>
           </w:p>
@@ -1334,9 +1795,14 @@
           </w:tcPr>
           <w:p>
             <w:pPr>
-              <w:spacing w:line="240" w:lineRule="auto"/>
+              <w:rPr>
+                <w:rFonts w:cs="Times New Roman"/>
+              </w:rPr>
             </w:pPr>
             <w:r>
+              <w:rPr>
+                <w:rFonts w:cs="Times New Roman"/>
+              </w:rPr>
               <w:t>7.39</w:t>
             </w:r>
           </w:p>
@@ -1347,9 +1813,14 @@
           </w:tcPr>
           <w:p>
             <w:pPr>
-              <w:spacing w:line="240" w:lineRule="auto"/>
+              <w:rPr>
+                <w:rFonts w:cs="Times New Roman"/>
+              </w:rPr>
             </w:pPr>
             <w:r>
+              <w:rPr>
+                <w:rFonts w:cs="Times New Roman"/>
+              </w:rPr>
               <w:t>134</w:t>
             </w:r>
           </w:p>
@@ -1360,9 +1831,14 @@
           </w:tcPr>
           <w:p>
             <w:pPr>
-              <w:spacing w:line="240" w:lineRule="auto"/>
+              <w:rPr>
+                <w:rFonts w:cs="Times New Roman"/>
+              </w:rPr>
             </w:pPr>
             <w:r>
+              <w:rPr>
+                <w:rFonts w:cs="Times New Roman"/>
+              </w:rPr>
               <w:t>0.13195</w:t>
             </w:r>
           </w:p>
@@ -1372,10 +1848,13 @@
     <w:p>
       <w:pPr>
         <w:keepNext/>
-        <w:spacing w:before="120" w:after="60" w:line="240" w:lineRule="auto"/>
+        <w:rPr>
+          <w:rFonts w:cs="Times New Roman"/>
+        </w:rPr>
       </w:pPr>
       <w:r>
         <w:rPr>
+          <w:rFonts w:cs="Times New Roman"/>
           <w:b/>
         </w:rPr>
         <w:t>Dataset 2: China passenger-vehicle sales (5 of 10 columns)</w:t>
@@ -1407,14 +1886,19 @@
           </w:tcPr>
           <w:p>
             <w:pPr>
-              <w:spacing w:line="240" w:lineRule="auto"/>
+              <w:rPr>
+                <w:rFonts w:cs="Times New Roman"/>
+              </w:rPr>
             </w:pPr>
+            <w:proofErr w:type="spellStart"/>
             <w:r>
               <w:rPr>
+                <w:rFonts w:cs="Times New Roman"/>
                 <w:b/>
               </w:rPr>
               <w:t>year_month</w:t>
             </w:r>
+            <w:proofErr w:type="spellEnd"/>
           </w:p>
         </w:tc>
         <w:tc>
@@ -1423,10 +1907,13 @@
           </w:tcPr>
           <w:p>
             <w:pPr>
-              <w:spacing w:line="240" w:lineRule="auto"/>
+              <w:rPr>
+                <w:rFonts w:cs="Times New Roman"/>
+              </w:rPr>
             </w:pPr>
             <w:r>
               <w:rPr>
+                <w:rFonts w:cs="Times New Roman"/>
                 <w:b/>
               </w:rPr>
               <w:t>brand</w:t>
@@ -1439,10 +1926,13 @@
           </w:tcPr>
           <w:p>
             <w:pPr>
-              <w:spacing w:line="240" w:lineRule="auto"/>
+              <w:rPr>
+                <w:rFonts w:cs="Times New Roman"/>
+              </w:rPr>
             </w:pPr>
             <w:r>
               <w:rPr>
+                <w:rFonts w:cs="Times New Roman"/>
                 <w:b/>
               </w:rPr>
               <w:t>model</w:t>
@@ -1455,14 +1945,19 @@
           </w:tcPr>
           <w:p>
             <w:pPr>
-              <w:spacing w:line="240" w:lineRule="auto"/>
+              <w:rPr>
+                <w:rFonts w:cs="Times New Roman"/>
+              </w:rPr>
             </w:pPr>
+            <w:proofErr w:type="spellStart"/>
             <w:r>
               <w:rPr>
+                <w:rFonts w:cs="Times New Roman"/>
                 <w:b/>
               </w:rPr>
               <w:t>units_sold</w:t>
             </w:r>
+            <w:proofErr w:type="spellEnd"/>
           </w:p>
         </w:tc>
         <w:tc>
@@ -1471,14 +1966,19 @@
           </w:tcPr>
           <w:p>
             <w:pPr>
-              <w:spacing w:line="240" w:lineRule="auto"/>
+              <w:rPr>
+                <w:rFonts w:cs="Times New Roman"/>
+              </w:rPr>
             </w:pPr>
+            <w:proofErr w:type="spellStart"/>
             <w:r>
               <w:rPr>
+                <w:rFonts w:cs="Times New Roman"/>
                 <w:b/>
               </w:rPr>
               <w:t>is_ev</w:t>
             </w:r>
+            <w:proofErr w:type="spellEnd"/>
           </w:p>
         </w:tc>
       </w:tr>
@@ -1493,9 +1993,14 @@
           </w:tcPr>
           <w:p>
             <w:pPr>
-              <w:spacing w:line="240" w:lineRule="auto"/>
+              <w:rPr>
+                <w:rFonts w:cs="Times New Roman"/>
+              </w:rPr>
             </w:pPr>
             <w:r>
+              <w:rPr>
+                <w:rFonts w:cs="Times New Roman"/>
+              </w:rPr>
               <w:t>2022-11-01</w:t>
             </w:r>
           </w:p>
@@ -1506,9 +2011,14 @@
           </w:tcPr>
           <w:p>
             <w:pPr>
-              <w:spacing w:line="240" w:lineRule="auto"/>
+              <w:rPr>
+                <w:rFonts w:cs="Times New Roman"/>
+              </w:rPr>
             </w:pPr>
             <w:r>
+              <w:rPr>
+                <w:rFonts w:cs="Times New Roman"/>
+              </w:rPr>
               <w:t>Tesla</w:t>
             </w:r>
           </w:p>
@@ -1519,9 +2029,14 @@
           </w:tcPr>
           <w:p>
             <w:pPr>
-              <w:spacing w:line="240" w:lineRule="auto"/>
+              <w:rPr>
+                <w:rFonts w:cs="Times New Roman"/>
+              </w:rPr>
             </w:pPr>
             <w:r>
+              <w:rPr>
+                <w:rFonts w:cs="Times New Roman"/>
+              </w:rPr>
               <w:t>Model Y</w:t>
             </w:r>
           </w:p>
@@ -1532,9 +2047,14 @@
           </w:tcPr>
           <w:p>
             <w:pPr>
-              <w:spacing w:line="240" w:lineRule="auto"/>
+              <w:rPr>
+                <w:rFonts w:cs="Times New Roman"/>
+              </w:rPr>
             </w:pPr>
             <w:r>
+              <w:rPr>
+                <w:rFonts w:cs="Times New Roman"/>
+              </w:rPr>
               <w:t>69098</w:t>
             </w:r>
           </w:p>
@@ -1545,9 +2065,14 @@
           </w:tcPr>
           <w:p>
             <w:pPr>
-              <w:spacing w:line="240" w:lineRule="auto"/>
+              <w:rPr>
+                <w:rFonts w:cs="Times New Roman"/>
+              </w:rPr>
             </w:pPr>
             <w:r>
+              <w:rPr>
+                <w:rFonts w:cs="Times New Roman"/>
+              </w:rPr>
               <w:t>EV</w:t>
             </w:r>
           </w:p>
@@ -1564,9 +2089,14 @@
           </w:tcPr>
           <w:p>
             <w:pPr>
-              <w:spacing w:line="240" w:lineRule="auto"/>
+              <w:rPr>
+                <w:rFonts w:cs="Times New Roman"/>
+              </w:rPr>
             </w:pPr>
             <w:r>
+              <w:rPr>
+                <w:rFonts w:cs="Times New Roman"/>
+              </w:rPr>
               <w:t>2022-11-01</w:t>
             </w:r>
           </w:p>
@@ -1577,9 +2107,14 @@
           </w:tcPr>
           <w:p>
             <w:pPr>
-              <w:spacing w:line="240" w:lineRule="auto"/>
+              <w:rPr>
+                <w:rFonts w:cs="Times New Roman"/>
+              </w:rPr>
             </w:pPr>
             <w:r>
+              <w:rPr>
+                <w:rFonts w:cs="Times New Roman"/>
+              </w:rPr>
               <w:t>Wuling Motors</w:t>
             </w:r>
           </w:p>
@@ -1590,14 +2125,24 @@
           </w:tcPr>
           <w:p>
             <w:pPr>
-              <w:spacing w:line="240" w:lineRule="auto"/>
+              <w:rPr>
+                <w:rFonts w:cs="Times New Roman"/>
+              </w:rPr>
             </w:pPr>
+            <w:proofErr w:type="spellStart"/>
             <w:r>
+              <w:rPr>
+                <w:rFonts w:cs="Times New Roman"/>
+              </w:rPr>
               <w:t>宏光</w:t>
             </w:r>
             <w:r>
+              <w:rPr>
+                <w:rFonts w:cs="Times New Roman"/>
+              </w:rPr>
               <w:t>MINIEV</w:t>
             </w:r>
+            <w:proofErr w:type="spellEnd"/>
           </w:p>
         </w:tc>
         <w:tc>
@@ -1606,9 +2151,14 @@
           </w:tcPr>
           <w:p>
             <w:pPr>
-              <w:spacing w:line="240" w:lineRule="auto"/>
+              <w:rPr>
+                <w:rFonts w:cs="Times New Roman"/>
+              </w:rPr>
             </w:pPr>
             <w:r>
+              <w:rPr>
+                <w:rFonts w:cs="Times New Roman"/>
+              </w:rPr>
               <w:t>68567</w:t>
             </w:r>
           </w:p>
@@ -1619,9 +2169,14 @@
           </w:tcPr>
           <w:p>
             <w:pPr>
-              <w:spacing w:line="240" w:lineRule="auto"/>
+              <w:rPr>
+                <w:rFonts w:cs="Times New Roman"/>
+              </w:rPr>
             </w:pPr>
             <w:r>
+              <w:rPr>
+                <w:rFonts w:cs="Times New Roman"/>
+              </w:rPr>
               <w:t>EV</w:t>
             </w:r>
           </w:p>
@@ -1638,9 +2193,14 @@
           </w:tcPr>
           <w:p>
             <w:pPr>
-              <w:spacing w:line="240" w:lineRule="auto"/>
+              <w:rPr>
+                <w:rFonts w:cs="Times New Roman"/>
+              </w:rPr>
             </w:pPr>
             <w:r>
+              <w:rPr>
+                <w:rFonts w:cs="Times New Roman"/>
+              </w:rPr>
               <w:t>2022-11-01</w:t>
             </w:r>
           </w:p>
@@ -1651,9 +2211,14 @@
           </w:tcPr>
           <w:p>
             <w:pPr>
-              <w:spacing w:line="240" w:lineRule="auto"/>
+              <w:rPr>
+                <w:rFonts w:cs="Times New Roman"/>
+              </w:rPr>
             </w:pPr>
             <w:r>
+              <w:rPr>
+                <w:rFonts w:cs="Times New Roman"/>
+              </w:rPr>
               <w:t>BYD</w:t>
             </w:r>
           </w:p>
@@ -1664,17 +2229,30 @@
           </w:tcPr>
           <w:p>
             <w:pPr>
-              <w:spacing w:line="240" w:lineRule="auto"/>
+              <w:rPr>
+                <w:rFonts w:cs="Times New Roman"/>
+              </w:rPr>
             </w:pPr>
+            <w:proofErr w:type="spellStart"/>
             <w:r>
+              <w:rPr>
+                <w:rFonts w:cs="Times New Roman"/>
+              </w:rPr>
               <w:t>宋</w:t>
             </w:r>
             <w:r>
+              <w:rPr>
+                <w:rFonts w:cs="Times New Roman"/>
+              </w:rPr>
               <w:t>PLUS</w:t>
             </w:r>
             <w:r>
+              <w:rPr>
+                <w:rFonts w:cs="Times New Roman"/>
+              </w:rPr>
               <w:t>新能源</w:t>
             </w:r>
+            <w:proofErr w:type="spellEnd"/>
           </w:p>
         </w:tc>
         <w:tc>
@@ -1683,9 +2261,14 @@
           </w:tcPr>
           <w:p>
             <w:pPr>
-              <w:spacing w:line="240" w:lineRule="auto"/>
+              <w:rPr>
+                <w:rFonts w:cs="Times New Roman"/>
+              </w:rPr>
             </w:pPr>
             <w:r>
+              <w:rPr>
+                <w:rFonts w:cs="Times New Roman"/>
+              </w:rPr>
               <w:t>64145</w:t>
             </w:r>
           </w:p>
@@ -1696,9 +2279,14 @@
           </w:tcPr>
           <w:p>
             <w:pPr>
-              <w:spacing w:line="240" w:lineRule="auto"/>
+              <w:rPr>
+                <w:rFonts w:cs="Times New Roman"/>
+              </w:rPr>
             </w:pPr>
             <w:r>
+              <w:rPr>
+                <w:rFonts w:cs="Times New Roman"/>
+              </w:rPr>
               <w:t>EV</w:t>
             </w:r>
           </w:p>
@@ -1708,10 +2296,13 @@
     <w:p>
       <w:pPr>
         <w:keepNext/>
-        <w:spacing w:before="120" w:after="60" w:line="240" w:lineRule="auto"/>
+        <w:rPr>
+          <w:rFonts w:cs="Times New Roman"/>
+        </w:rPr>
       </w:pPr>
       <w:r>
         <w:rPr>
+          <w:rFonts w:cs="Times New Roman"/>
           <w:b/>
         </w:rPr>
         <w:t>Dataset 3: Spotify track features (5 of 20 columns)</w:t>
@@ -1743,10 +2334,13 @@
           </w:tcPr>
           <w:p>
             <w:pPr>
-              <w:spacing w:line="240" w:lineRule="auto"/>
+              <w:rPr>
+                <w:rFonts w:cs="Times New Roman"/>
+              </w:rPr>
             </w:pPr>
             <w:r>
               <w:rPr>
+                <w:rFonts w:cs="Times New Roman"/>
                 <w:b/>
               </w:rPr>
               <w:t>artists</w:t>
@@ -1759,14 +2353,19 @@
           </w:tcPr>
           <w:p>
             <w:pPr>
-              <w:spacing w:line="240" w:lineRule="auto"/>
+              <w:rPr>
+                <w:rFonts w:cs="Times New Roman"/>
+              </w:rPr>
             </w:pPr>
+            <w:proofErr w:type="spellStart"/>
             <w:r>
               <w:rPr>
+                <w:rFonts w:cs="Times New Roman"/>
                 <w:b/>
               </w:rPr>
               <w:t>track_name</w:t>
             </w:r>
+            <w:proofErr w:type="spellEnd"/>
           </w:p>
         </w:tc>
         <w:tc>
@@ -1775,10 +2374,13 @@
           </w:tcPr>
           <w:p>
             <w:pPr>
-              <w:spacing w:line="240" w:lineRule="auto"/>
+              <w:rPr>
+                <w:rFonts w:cs="Times New Roman"/>
+              </w:rPr>
             </w:pPr>
             <w:r>
               <w:rPr>
+                <w:rFonts w:cs="Times New Roman"/>
                 <w:b/>
               </w:rPr>
               <w:t>popularity</w:t>
@@ -1791,10 +2393,13 @@
           </w:tcPr>
           <w:p>
             <w:pPr>
-              <w:spacing w:line="240" w:lineRule="auto"/>
+              <w:rPr>
+                <w:rFonts w:cs="Times New Roman"/>
+              </w:rPr>
             </w:pPr>
             <w:r>
               <w:rPr>
+                <w:rFonts w:cs="Times New Roman"/>
                 <w:b/>
               </w:rPr>
               <w:t>danceability</w:t>
@@ -1807,14 +2412,19 @@
           </w:tcPr>
           <w:p>
             <w:pPr>
-              <w:spacing w:line="240" w:lineRule="auto"/>
+              <w:rPr>
+                <w:rFonts w:cs="Times New Roman"/>
+              </w:rPr>
             </w:pPr>
+            <w:proofErr w:type="spellStart"/>
             <w:r>
               <w:rPr>
+                <w:rFonts w:cs="Times New Roman"/>
                 <w:b/>
               </w:rPr>
               <w:t>track_genre</w:t>
             </w:r>
+            <w:proofErr w:type="spellEnd"/>
           </w:p>
         </w:tc>
       </w:tr>
@@ -1829,9 +2439,14 @@
           </w:tcPr>
           <w:p>
             <w:pPr>
-              <w:spacing w:line="240" w:lineRule="auto"/>
+              <w:rPr>
+                <w:rFonts w:cs="Times New Roman"/>
+              </w:rPr>
             </w:pPr>
             <w:r>
+              <w:rPr>
+                <w:rFonts w:cs="Times New Roman"/>
+              </w:rPr>
               <w:t>Gen Hoshino</w:t>
             </w:r>
           </w:p>
@@ -1842,9 +2457,14 @@
           </w:tcPr>
           <w:p>
             <w:pPr>
-              <w:spacing w:line="240" w:lineRule="auto"/>
+              <w:rPr>
+                <w:rFonts w:cs="Times New Roman"/>
+              </w:rPr>
             </w:pPr>
             <w:r>
+              <w:rPr>
+                <w:rFonts w:cs="Times New Roman"/>
+              </w:rPr>
               <w:t>Comedy</w:t>
             </w:r>
           </w:p>
@@ -1855,9 +2475,14 @@
           </w:tcPr>
           <w:p>
             <w:pPr>
-              <w:spacing w:line="240" w:lineRule="auto"/>
+              <w:rPr>
+                <w:rFonts w:cs="Times New Roman"/>
+              </w:rPr>
             </w:pPr>
             <w:r>
+              <w:rPr>
+                <w:rFonts w:cs="Times New Roman"/>
+              </w:rPr>
               <w:t>73</w:t>
             </w:r>
           </w:p>
@@ -1868,9 +2493,14 @@
           </w:tcPr>
           <w:p>
             <w:pPr>
-              <w:spacing w:line="240" w:lineRule="auto"/>
+              <w:rPr>
+                <w:rFonts w:cs="Times New Roman"/>
+              </w:rPr>
             </w:pPr>
             <w:r>
+              <w:rPr>
+                <w:rFonts w:cs="Times New Roman"/>
+              </w:rPr>
               <w:t>0.676</w:t>
             </w:r>
           </w:p>
@@ -1881,9 +2511,14 @@
           </w:tcPr>
           <w:p>
             <w:pPr>
-              <w:spacing w:line="240" w:lineRule="auto"/>
+              <w:rPr>
+                <w:rFonts w:cs="Times New Roman"/>
+              </w:rPr>
             </w:pPr>
             <w:r>
+              <w:rPr>
+                <w:rFonts w:cs="Times New Roman"/>
+              </w:rPr>
               <w:t>acoustic</w:t>
             </w:r>
           </w:p>
@@ -1900,9 +2535,14 @@
           </w:tcPr>
           <w:p>
             <w:pPr>
-              <w:spacing w:line="240" w:lineRule="auto"/>
+              <w:rPr>
+                <w:rFonts w:cs="Times New Roman"/>
+              </w:rPr>
             </w:pPr>
             <w:r>
+              <w:rPr>
+                <w:rFonts w:cs="Times New Roman"/>
+              </w:rPr>
               <w:t>Ben Woodward</w:t>
             </w:r>
           </w:p>
@@ -1913,9 +2553,14 @@
           </w:tcPr>
           <w:p>
             <w:pPr>
-              <w:spacing w:line="240" w:lineRule="auto"/>
+              <w:rPr>
+                <w:rFonts w:cs="Times New Roman"/>
+              </w:rPr>
             </w:pPr>
             <w:r>
+              <w:rPr>
+                <w:rFonts w:cs="Times New Roman"/>
+              </w:rPr>
               <w:t>Ghost - Acoustic</w:t>
             </w:r>
           </w:p>
@@ -1926,9 +2571,14 @@
           </w:tcPr>
           <w:p>
             <w:pPr>
-              <w:spacing w:line="240" w:lineRule="auto"/>
+              <w:rPr>
+                <w:rFonts w:cs="Times New Roman"/>
+              </w:rPr>
             </w:pPr>
             <w:r>
+              <w:rPr>
+                <w:rFonts w:cs="Times New Roman"/>
+              </w:rPr>
               <w:t>55</w:t>
             </w:r>
           </w:p>
@@ -1939,9 +2589,14 @@
           </w:tcPr>
           <w:p>
             <w:pPr>
-              <w:spacing w:line="240" w:lineRule="auto"/>
+              <w:rPr>
+                <w:rFonts w:cs="Times New Roman"/>
+              </w:rPr>
             </w:pPr>
             <w:r>
+              <w:rPr>
+                <w:rFonts w:cs="Times New Roman"/>
+              </w:rPr>
               <w:t>0.42</w:t>
             </w:r>
           </w:p>
@@ -1952,9 +2607,14 @@
           </w:tcPr>
           <w:p>
             <w:pPr>
-              <w:spacing w:line="240" w:lineRule="auto"/>
+              <w:rPr>
+                <w:rFonts w:cs="Times New Roman"/>
+              </w:rPr>
             </w:pPr>
             <w:r>
+              <w:rPr>
+                <w:rFonts w:cs="Times New Roman"/>
+              </w:rPr>
               <w:t>acoustic</w:t>
             </w:r>
           </w:p>
@@ -1971,11 +2631,26 @@
           </w:tcPr>
           <w:p>
             <w:pPr>
-              <w:spacing w:line="240" w:lineRule="auto"/>
+              <w:rPr>
+                <w:rFonts w:cs="Times New Roman"/>
+              </w:rPr>
             </w:pPr>
             <w:r>
-              <w:t>Ingrid Michaelson;ZAYN</w:t>
+              <w:rPr>
+                <w:rFonts w:cs="Times New Roman"/>
+              </w:rPr>
+              <w:t xml:space="preserve">Ingrid </w:t>
             </w:r>
+            <w:proofErr w:type="spellStart"/>
+            <w:proofErr w:type="gramStart"/>
+            <w:r>
+              <w:rPr>
+                <w:rFonts w:cs="Times New Roman"/>
+              </w:rPr>
+              <w:t>Michaelson;ZAYN</w:t>
+            </w:r>
+            <w:proofErr w:type="spellEnd"/>
+            <w:proofErr w:type="gramEnd"/>
           </w:p>
         </w:tc>
         <w:tc>
@@ -1984,9 +2659,14 @@
           </w:tcPr>
           <w:p>
             <w:pPr>
-              <w:spacing w:line="240" w:lineRule="auto"/>
+              <w:rPr>
+                <w:rFonts w:cs="Times New Roman"/>
+              </w:rPr>
             </w:pPr>
             <w:r>
+              <w:rPr>
+                <w:rFonts w:cs="Times New Roman"/>
+              </w:rPr>
               <w:t>To Begin Again</w:t>
             </w:r>
           </w:p>
@@ -1997,9 +2677,14 @@
           </w:tcPr>
           <w:p>
             <w:pPr>
-              <w:spacing w:line="240" w:lineRule="auto"/>
+              <w:rPr>
+                <w:rFonts w:cs="Times New Roman"/>
+              </w:rPr>
             </w:pPr>
             <w:r>
+              <w:rPr>
+                <w:rFonts w:cs="Times New Roman"/>
+              </w:rPr>
               <w:t>57</w:t>
             </w:r>
           </w:p>
@@ -2010,9 +2695,14 @@
           </w:tcPr>
           <w:p>
             <w:pPr>
-              <w:spacing w:line="240" w:lineRule="auto"/>
+              <w:rPr>
+                <w:rFonts w:cs="Times New Roman"/>
+              </w:rPr>
             </w:pPr>
             <w:r>
+              <w:rPr>
+                <w:rFonts w:cs="Times New Roman"/>
+              </w:rPr>
               <w:t>0.438</w:t>
             </w:r>
           </w:p>
@@ -2023,9 +2713,14 @@
           </w:tcPr>
           <w:p>
             <w:pPr>
-              <w:spacing w:line="240" w:lineRule="auto"/>
+              <w:rPr>
+                <w:rFonts w:cs="Times New Roman"/>
+              </w:rPr>
             </w:pPr>
             <w:r>
+              <w:rPr>
+                <w:rFonts w:cs="Times New Roman"/>
+              </w:rPr>
               <w:t>acoustic</w:t>
             </w:r>
           </w:p>
@@ -2035,12 +2730,16 @@
     <w:p>
       <w:pPr>
         <w:keepNext/>
-        <w:spacing w:before="120" w:after="60" w:line="240" w:lineRule="auto"/>
+        <w:rPr>
+          <w:rFonts w:cs="Times New Roman"/>
+        </w:rPr>
       </w:pPr>
       <w:r>
         <w:rPr>
+          <w:rFonts w:cs="Times New Roman"/>
           <w:b/>
         </w:rPr>
+        <w:lastRenderedPageBreak/>
         <w:t>Dataset 4: TMDB movie metadata (6 of 24 columns)</w:t>
       </w:r>
     </w:p>
@@ -2071,10 +2770,13 @@
           </w:tcPr>
           <w:p>
             <w:pPr>
-              <w:spacing w:line="240" w:lineRule="auto"/>
+              <w:rPr>
+                <w:rFonts w:cs="Times New Roman"/>
+              </w:rPr>
             </w:pPr>
             <w:r>
               <w:rPr>
+                <w:rFonts w:cs="Times New Roman"/>
                 <w:b/>
               </w:rPr>
               <w:t>budget</w:t>
@@ -2087,14 +2789,19 @@
           </w:tcPr>
           <w:p>
             <w:pPr>
-              <w:spacing w:line="240" w:lineRule="auto"/>
+              <w:rPr>
+                <w:rFonts w:cs="Times New Roman"/>
+              </w:rPr>
             </w:pPr>
+            <w:proofErr w:type="spellStart"/>
             <w:r>
               <w:rPr>
+                <w:rFonts w:cs="Times New Roman"/>
                 <w:b/>
               </w:rPr>
               <w:t>release_date</w:t>
             </w:r>
+            <w:proofErr w:type="spellEnd"/>
           </w:p>
         </w:tc>
         <w:tc>
@@ -2103,10 +2810,13 @@
           </w:tcPr>
           <w:p>
             <w:pPr>
-              <w:spacing w:line="240" w:lineRule="auto"/>
+              <w:rPr>
+                <w:rFonts w:cs="Times New Roman"/>
+              </w:rPr>
             </w:pPr>
             <w:r>
               <w:rPr>
+                <w:rFonts w:cs="Times New Roman"/>
                 <w:b/>
               </w:rPr>
               <w:t>revenue</w:t>
@@ -2119,10 +2829,13 @@
           </w:tcPr>
           <w:p>
             <w:pPr>
-              <w:spacing w:line="240" w:lineRule="auto"/>
+              <w:rPr>
+                <w:rFonts w:cs="Times New Roman"/>
+              </w:rPr>
             </w:pPr>
             <w:r>
               <w:rPr>
+                <w:rFonts w:cs="Times New Roman"/>
                 <w:b/>
               </w:rPr>
               <w:t>title</w:t>
@@ -2135,14 +2848,19 @@
           </w:tcPr>
           <w:p>
             <w:pPr>
-              <w:spacing w:line="240" w:lineRule="auto"/>
+              <w:rPr>
+                <w:rFonts w:cs="Times New Roman"/>
+              </w:rPr>
             </w:pPr>
+            <w:proofErr w:type="spellStart"/>
             <w:r>
               <w:rPr>
+                <w:rFonts w:cs="Times New Roman"/>
                 <w:b/>
               </w:rPr>
               <w:t>vote_average</w:t>
             </w:r>
+            <w:proofErr w:type="spellEnd"/>
           </w:p>
         </w:tc>
         <w:tc>
@@ -2151,14 +2869,19 @@
           </w:tcPr>
           <w:p>
             <w:pPr>
-              <w:spacing w:line="240" w:lineRule="auto"/>
+              <w:rPr>
+                <w:rFonts w:cs="Times New Roman"/>
+              </w:rPr>
             </w:pPr>
+            <w:proofErr w:type="spellStart"/>
             <w:r>
               <w:rPr>
+                <w:rFonts w:cs="Times New Roman"/>
                 <w:b/>
               </w:rPr>
               <w:t>vote_count</w:t>
             </w:r>
+            <w:proofErr w:type="spellEnd"/>
           </w:p>
         </w:tc>
       </w:tr>
@@ -2173,9 +2896,14 @@
           </w:tcPr>
           <w:p>
             <w:pPr>
-              <w:spacing w:line="240" w:lineRule="auto"/>
+              <w:rPr>
+                <w:rFonts w:cs="Times New Roman"/>
+              </w:rPr>
             </w:pPr>
             <w:r>
+              <w:rPr>
+                <w:rFonts w:cs="Times New Roman"/>
+              </w:rPr>
               <w:t>30000000</w:t>
             </w:r>
           </w:p>
@@ -2186,9 +2914,14 @@
           </w:tcPr>
           <w:p>
             <w:pPr>
-              <w:spacing w:line="240" w:lineRule="auto"/>
+              <w:rPr>
+                <w:rFonts w:cs="Times New Roman"/>
+              </w:rPr>
             </w:pPr>
             <w:r>
+              <w:rPr>
+                <w:rFonts w:cs="Times New Roman"/>
+              </w:rPr>
               <w:t>1995-10-30</w:t>
             </w:r>
           </w:p>
@@ -2199,9 +2932,14 @@
           </w:tcPr>
           <w:p>
             <w:pPr>
-              <w:spacing w:line="240" w:lineRule="auto"/>
+              <w:rPr>
+                <w:rFonts w:cs="Times New Roman"/>
+              </w:rPr>
             </w:pPr>
             <w:r>
+              <w:rPr>
+                <w:rFonts w:cs="Times New Roman"/>
+              </w:rPr>
               <w:t>373554033</w:t>
             </w:r>
           </w:p>
@@ -2212,9 +2950,14 @@
           </w:tcPr>
           <w:p>
             <w:pPr>
-              <w:spacing w:line="240" w:lineRule="auto"/>
+              <w:rPr>
+                <w:rFonts w:cs="Times New Roman"/>
+              </w:rPr>
             </w:pPr>
             <w:r>
+              <w:rPr>
+                <w:rFonts w:cs="Times New Roman"/>
+              </w:rPr>
               <w:t>Toy Story</w:t>
             </w:r>
           </w:p>
@@ -2225,9 +2968,14 @@
           </w:tcPr>
           <w:p>
             <w:pPr>
-              <w:spacing w:line="240" w:lineRule="auto"/>
+              <w:rPr>
+                <w:rFonts w:cs="Times New Roman"/>
+              </w:rPr>
             </w:pPr>
             <w:r>
+              <w:rPr>
+                <w:rFonts w:cs="Times New Roman"/>
+              </w:rPr>
               <w:t>7.7</w:t>
             </w:r>
           </w:p>
@@ -2238,9 +2986,14 @@
           </w:tcPr>
           <w:p>
             <w:pPr>
-              <w:spacing w:line="240" w:lineRule="auto"/>
+              <w:rPr>
+                <w:rFonts w:cs="Times New Roman"/>
+              </w:rPr>
             </w:pPr>
             <w:r>
+              <w:rPr>
+                <w:rFonts w:cs="Times New Roman"/>
+              </w:rPr>
               <w:t>5415</w:t>
             </w:r>
           </w:p>
@@ -2257,9 +3010,14 @@
           </w:tcPr>
           <w:p>
             <w:pPr>
-              <w:spacing w:line="240" w:lineRule="auto"/>
+              <w:rPr>
+                <w:rFonts w:cs="Times New Roman"/>
+              </w:rPr>
             </w:pPr>
             <w:r>
+              <w:rPr>
+                <w:rFonts w:cs="Times New Roman"/>
+              </w:rPr>
               <w:t>65000000</w:t>
             </w:r>
           </w:p>
@@ -2270,9 +3028,14 @@
           </w:tcPr>
           <w:p>
             <w:pPr>
-              <w:spacing w:line="240" w:lineRule="auto"/>
+              <w:rPr>
+                <w:rFonts w:cs="Times New Roman"/>
+              </w:rPr>
             </w:pPr>
             <w:r>
+              <w:rPr>
+                <w:rFonts w:cs="Times New Roman"/>
+              </w:rPr>
               <w:t>1995-12-15</w:t>
             </w:r>
           </w:p>
@@ -2283,9 +3046,14 @@
           </w:tcPr>
           <w:p>
             <w:pPr>
-              <w:spacing w:line="240" w:lineRule="auto"/>
+              <w:rPr>
+                <w:rFonts w:cs="Times New Roman"/>
+              </w:rPr>
             </w:pPr>
             <w:r>
+              <w:rPr>
+                <w:rFonts w:cs="Times New Roman"/>
+              </w:rPr>
               <w:t>262797249</w:t>
             </w:r>
           </w:p>
@@ -2296,9 +3064,14 @@
           </w:tcPr>
           <w:p>
             <w:pPr>
-              <w:spacing w:line="240" w:lineRule="auto"/>
+              <w:rPr>
+                <w:rFonts w:cs="Times New Roman"/>
+              </w:rPr>
             </w:pPr>
             <w:r>
+              <w:rPr>
+                <w:rFonts w:cs="Times New Roman"/>
+              </w:rPr>
               <w:t>Jumanji</w:t>
             </w:r>
           </w:p>
@@ -2309,9 +3082,14 @@
           </w:tcPr>
           <w:p>
             <w:pPr>
-              <w:spacing w:line="240" w:lineRule="auto"/>
+              <w:rPr>
+                <w:rFonts w:cs="Times New Roman"/>
+              </w:rPr>
             </w:pPr>
             <w:r>
+              <w:rPr>
+                <w:rFonts w:cs="Times New Roman"/>
+              </w:rPr>
               <w:t>6.9</w:t>
             </w:r>
           </w:p>
@@ -2322,9 +3100,14 @@
           </w:tcPr>
           <w:p>
             <w:pPr>
-              <w:spacing w:line="240" w:lineRule="auto"/>
+              <w:rPr>
+                <w:rFonts w:cs="Times New Roman"/>
+              </w:rPr>
             </w:pPr>
             <w:r>
+              <w:rPr>
+                <w:rFonts w:cs="Times New Roman"/>
+              </w:rPr>
               <w:t>2413</w:t>
             </w:r>
           </w:p>
@@ -2341,9 +3124,14 @@
           </w:tcPr>
           <w:p>
             <w:pPr>
-              <w:spacing w:line="240" w:lineRule="auto"/>
+              <w:rPr>
+                <w:rFonts w:cs="Times New Roman"/>
+              </w:rPr>
             </w:pPr>
             <w:r>
+              <w:rPr>
+                <w:rFonts w:cs="Times New Roman"/>
+              </w:rPr>
               <w:t>0</w:t>
             </w:r>
           </w:p>
@@ -2354,9 +3142,14 @@
           </w:tcPr>
           <w:p>
             <w:pPr>
-              <w:spacing w:line="240" w:lineRule="auto"/>
+              <w:rPr>
+                <w:rFonts w:cs="Times New Roman"/>
+              </w:rPr>
             </w:pPr>
             <w:r>
+              <w:rPr>
+                <w:rFonts w:cs="Times New Roman"/>
+              </w:rPr>
               <w:t>1995-12-22</w:t>
             </w:r>
           </w:p>
@@ -2367,9 +3160,14 @@
           </w:tcPr>
           <w:p>
             <w:pPr>
-              <w:spacing w:line="240" w:lineRule="auto"/>
+              <w:rPr>
+                <w:rFonts w:cs="Times New Roman"/>
+              </w:rPr>
             </w:pPr>
             <w:r>
+              <w:rPr>
+                <w:rFonts w:cs="Times New Roman"/>
+              </w:rPr>
               <w:t>0</w:t>
             </w:r>
           </w:p>
@@ -2380,9 +3178,14 @@
           </w:tcPr>
           <w:p>
             <w:pPr>
-              <w:spacing w:line="240" w:lineRule="auto"/>
+              <w:rPr>
+                <w:rFonts w:cs="Times New Roman"/>
+              </w:rPr>
             </w:pPr>
             <w:r>
+              <w:rPr>
+                <w:rFonts w:cs="Times New Roman"/>
+              </w:rPr>
               <w:t>Grumpier Old Men</w:t>
             </w:r>
           </w:p>
@@ -2393,9 +3196,14 @@
           </w:tcPr>
           <w:p>
             <w:pPr>
-              <w:spacing w:line="240" w:lineRule="auto"/>
+              <w:rPr>
+                <w:rFonts w:cs="Times New Roman"/>
+              </w:rPr>
             </w:pPr>
             <w:r>
+              <w:rPr>
+                <w:rFonts w:cs="Times New Roman"/>
+              </w:rPr>
               <w:t>6.5</w:t>
             </w:r>
           </w:p>
@@ -2406,9 +3214,14 @@
           </w:tcPr>
           <w:p>
             <w:pPr>
-              <w:spacing w:line="240" w:lineRule="auto"/>
+              <w:rPr>
+                <w:rFonts w:cs="Times New Roman"/>
+              </w:rPr>
             </w:pPr>
             <w:r>
+              <w:rPr>
+                <w:rFonts w:cs="Times New Roman"/>
+              </w:rPr>
               <w:t>92</w:t>
             </w:r>
           </w:p>
@@ -2418,10 +3231,13 @@
     <w:p>
       <w:pPr>
         <w:keepNext/>
-        <w:spacing w:before="120" w:after="60" w:line="240" w:lineRule="auto"/>
+        <w:rPr>
+          <w:rFonts w:cs="Times New Roman"/>
+        </w:rPr>
       </w:pPr>
       <w:r>
         <w:rPr>
+          <w:rFonts w:cs="Times New Roman"/>
           <w:b/>
         </w:rPr>
         <w:t>Dataset 5: FINRA equity short interest, 30 Sep 2026 (6 of 14 columns)</w:t>
@@ -2454,14 +3270,19 @@
           </w:tcPr>
           <w:p>
             <w:pPr>
-              <w:spacing w:line="240" w:lineRule="auto"/>
+              <w:rPr>
+                <w:rFonts w:cs="Times New Roman"/>
+              </w:rPr>
             </w:pPr>
+            <w:proofErr w:type="spellStart"/>
             <w:r>
               <w:rPr>
+                <w:rFonts w:cs="Times New Roman"/>
                 <w:b/>
               </w:rPr>
               <w:t>settlementDate</w:t>
             </w:r>
+            <w:proofErr w:type="spellEnd"/>
           </w:p>
         </w:tc>
         <w:tc>
@@ -2470,14 +3291,19 @@
           </w:tcPr>
           <w:p>
             <w:pPr>
-              <w:spacing w:line="240" w:lineRule="auto"/>
+              <w:rPr>
+                <w:rFonts w:cs="Times New Roman"/>
+              </w:rPr>
             </w:pPr>
+            <w:proofErr w:type="spellStart"/>
             <w:r>
               <w:rPr>
+                <w:rFonts w:cs="Times New Roman"/>
                 <w:b/>
               </w:rPr>
               <w:t>symbolCode</w:t>
             </w:r>
+            <w:proofErr w:type="spellEnd"/>
           </w:p>
         </w:tc>
         <w:tc>
@@ -2486,14 +3312,19 @@
           </w:tcPr>
           <w:p>
             <w:pPr>
-              <w:spacing w:line="240" w:lineRule="auto"/>
+              <w:rPr>
+                <w:rFonts w:cs="Times New Roman"/>
+              </w:rPr>
             </w:pPr>
+            <w:proofErr w:type="spellStart"/>
             <w:r>
               <w:rPr>
+                <w:rFonts w:cs="Times New Roman"/>
                 <w:b/>
               </w:rPr>
               <w:t>currentShortPositionQuantity</w:t>
             </w:r>
+            <w:proofErr w:type="spellEnd"/>
           </w:p>
         </w:tc>
         <w:tc>
@@ -2502,14 +3333,19 @@
           </w:tcPr>
           <w:p>
             <w:pPr>
-              <w:spacing w:line="240" w:lineRule="auto"/>
+              <w:rPr>
+                <w:rFonts w:cs="Times New Roman"/>
+              </w:rPr>
             </w:pPr>
+            <w:proofErr w:type="spellStart"/>
             <w:r>
               <w:rPr>
+                <w:rFonts w:cs="Times New Roman"/>
                 <w:b/>
               </w:rPr>
               <w:t>previousShortPositionQuantity</w:t>
             </w:r>
+            <w:proofErr w:type="spellEnd"/>
           </w:p>
         </w:tc>
         <w:tc>
@@ -2518,14 +3354,19 @@
           </w:tcPr>
           <w:p>
             <w:pPr>
-              <w:spacing w:line="240" w:lineRule="auto"/>
+              <w:rPr>
+                <w:rFonts w:cs="Times New Roman"/>
+              </w:rPr>
             </w:pPr>
+            <w:proofErr w:type="spellStart"/>
             <w:r>
               <w:rPr>
+                <w:rFonts w:cs="Times New Roman"/>
                 <w:b/>
               </w:rPr>
               <w:t>changePercent</w:t>
             </w:r>
+            <w:proofErr w:type="spellEnd"/>
           </w:p>
         </w:tc>
         <w:tc>
@@ -2534,14 +3375,19 @@
           </w:tcPr>
           <w:p>
             <w:pPr>
-              <w:spacing w:line="240" w:lineRule="auto"/>
+              <w:rPr>
+                <w:rFonts w:cs="Times New Roman"/>
+              </w:rPr>
             </w:pPr>
+            <w:proofErr w:type="spellStart"/>
             <w:r>
               <w:rPr>
+                <w:rFonts w:cs="Times New Roman"/>
                 <w:b/>
               </w:rPr>
               <w:t>daysToCoverQuantity</w:t>
             </w:r>
+            <w:proofErr w:type="spellEnd"/>
           </w:p>
         </w:tc>
       </w:tr>
@@ -2556,9 +3402,14 @@
           </w:tcPr>
           <w:p>
             <w:pPr>
-              <w:spacing w:line="240" w:lineRule="auto"/>
+              <w:rPr>
+                <w:rFonts w:cs="Times New Roman"/>
+              </w:rPr>
             </w:pPr>
             <w:r>
+              <w:rPr>
+                <w:rFonts w:cs="Times New Roman"/>
+              </w:rPr>
               <w:t>2026-09-30</w:t>
             </w:r>
           </w:p>
@@ -2569,9 +3420,14 @@
           </w:tcPr>
           <w:p>
             <w:pPr>
-              <w:spacing w:line="240" w:lineRule="auto"/>
+              <w:rPr>
+                <w:rFonts w:cs="Times New Roman"/>
+              </w:rPr>
             </w:pPr>
             <w:r>
+              <w:rPr>
+                <w:rFonts w:cs="Times New Roman"/>
+              </w:rPr>
               <w:t>A</w:t>
             </w:r>
           </w:p>
@@ -2582,9 +3438,14 @@
           </w:tcPr>
           <w:p>
             <w:pPr>
-              <w:spacing w:line="240" w:lineRule="auto"/>
+              <w:rPr>
+                <w:rFonts w:cs="Times New Roman"/>
+              </w:rPr>
             </w:pPr>
             <w:r>
+              <w:rPr>
+                <w:rFonts w:cs="Times New Roman"/>
+              </w:rPr>
               <w:t>5,240,309</w:t>
             </w:r>
           </w:p>
@@ -2595,9 +3456,14 @@
           </w:tcPr>
           <w:p>
             <w:pPr>
-              <w:spacing w:line="240" w:lineRule="auto"/>
+              <w:rPr>
+                <w:rFonts w:cs="Times New Roman"/>
+              </w:rPr>
             </w:pPr>
             <w:r>
+              <w:rPr>
+                <w:rFonts w:cs="Times New Roman"/>
+              </w:rPr>
               <w:t>5,078,629</w:t>
             </w:r>
           </w:p>
@@ -2608,9 +3474,14 @@
           </w:tcPr>
           <w:p>
             <w:pPr>
-              <w:spacing w:line="240" w:lineRule="auto"/>
+              <w:rPr>
+                <w:rFonts w:cs="Times New Roman"/>
+              </w:rPr>
             </w:pPr>
             <w:r>
+              <w:rPr>
+                <w:rFonts w:cs="Times New Roman"/>
+              </w:rPr>
               <w:t>3.18</w:t>
             </w:r>
           </w:p>
@@ -2621,9 +3492,14 @@
           </w:tcPr>
           <w:p>
             <w:pPr>
-              <w:spacing w:line="240" w:lineRule="auto"/>
+              <w:rPr>
+                <w:rFonts w:cs="Times New Roman"/>
+              </w:rPr>
             </w:pPr>
             <w:r>
+              <w:rPr>
+                <w:rFonts w:cs="Times New Roman"/>
+              </w:rPr>
               <w:t>1.78</w:t>
             </w:r>
           </w:p>
@@ -2640,9 +3516,14 @@
           </w:tcPr>
           <w:p>
             <w:pPr>
-              <w:spacing w:line="240" w:lineRule="auto"/>
+              <w:rPr>
+                <w:rFonts w:cs="Times New Roman"/>
+              </w:rPr>
             </w:pPr>
             <w:r>
+              <w:rPr>
+                <w:rFonts w:cs="Times New Roman"/>
+              </w:rPr>
               <w:t>2026-09-30</w:t>
             </w:r>
           </w:p>
@@ -2653,9 +3534,14 @@
           </w:tcPr>
           <w:p>
             <w:pPr>
-              <w:spacing w:line="240" w:lineRule="auto"/>
+              <w:rPr>
+                <w:rFonts w:cs="Times New Roman"/>
+              </w:rPr>
             </w:pPr>
             <w:r>
+              <w:rPr>
+                <w:rFonts w:cs="Times New Roman"/>
+              </w:rPr>
               <w:t>AA</w:t>
             </w:r>
           </w:p>
@@ -2666,9 +3552,14 @@
           </w:tcPr>
           <w:p>
             <w:pPr>
-              <w:spacing w:line="240" w:lineRule="auto"/>
+              <w:rPr>
+                <w:rFonts w:cs="Times New Roman"/>
+              </w:rPr>
             </w:pPr>
             <w:r>
+              <w:rPr>
+                <w:rFonts w:cs="Times New Roman"/>
+              </w:rPr>
               <w:t>11,725,447</w:t>
             </w:r>
           </w:p>
@@ -2679,9 +3570,14 @@
           </w:tcPr>
           <w:p>
             <w:pPr>
-              <w:spacing w:line="240" w:lineRule="auto"/>
+              <w:rPr>
+                <w:rFonts w:cs="Times New Roman"/>
+              </w:rPr>
             </w:pPr>
             <w:r>
+              <w:rPr>
+                <w:rFonts w:cs="Times New Roman"/>
+              </w:rPr>
               <w:t>11,984,650</w:t>
             </w:r>
           </w:p>
@@ -2692,9 +3588,14 @@
           </w:tcPr>
           <w:p>
             <w:pPr>
-              <w:spacing w:line="240" w:lineRule="auto"/>
+              <w:rPr>
+                <w:rFonts w:cs="Times New Roman"/>
+              </w:rPr>
             </w:pPr>
             <w:r>
+              <w:rPr>
+                <w:rFonts w:cs="Times New Roman"/>
+              </w:rPr>
               <w:t>-2.16</w:t>
             </w:r>
           </w:p>
@@ -2705,9 +3606,14 @@
           </w:tcPr>
           <w:p>
             <w:pPr>
-              <w:spacing w:line="240" w:lineRule="auto"/>
+              <w:rPr>
+                <w:rFonts w:cs="Times New Roman"/>
+              </w:rPr>
             </w:pPr>
             <w:r>
+              <w:rPr>
+                <w:rFonts w:cs="Times New Roman"/>
+              </w:rPr>
               <w:t>2.85</w:t>
             </w:r>
           </w:p>
@@ -2724,9 +3630,14 @@
           </w:tcPr>
           <w:p>
             <w:pPr>
-              <w:spacing w:line="240" w:lineRule="auto"/>
+              <w:rPr>
+                <w:rFonts w:cs="Times New Roman"/>
+              </w:rPr>
             </w:pPr>
             <w:r>
+              <w:rPr>
+                <w:rFonts w:cs="Times New Roman"/>
+              </w:rPr>
               <w:t>2026-09-30</w:t>
             </w:r>
           </w:p>
@@ -2737,9 +3648,14 @@
           </w:tcPr>
           <w:p>
             <w:pPr>
-              <w:spacing w:line="240" w:lineRule="auto"/>
+              <w:rPr>
+                <w:rFonts w:cs="Times New Roman"/>
+              </w:rPr>
             </w:pPr>
             <w:r>
+              <w:rPr>
+                <w:rFonts w:cs="Times New Roman"/>
+              </w:rPr>
               <w:t>AAA</w:t>
             </w:r>
           </w:p>
@@ -2750,9 +3666,14 @@
           </w:tcPr>
           <w:p>
             <w:pPr>
-              <w:spacing w:line="240" w:lineRule="auto"/>
+              <w:rPr>
+                <w:rFonts w:cs="Times New Roman"/>
+              </w:rPr>
             </w:pPr>
             <w:r>
+              <w:rPr>
+                <w:rFonts w:cs="Times New Roman"/>
+              </w:rPr>
               <w:t>7,957</w:t>
             </w:r>
           </w:p>
@@ -2763,9 +3684,14 @@
           </w:tcPr>
           <w:p>
             <w:pPr>
-              <w:spacing w:line="240" w:lineRule="auto"/>
+              <w:rPr>
+                <w:rFonts w:cs="Times New Roman"/>
+              </w:rPr>
             </w:pPr>
             <w:r>
+              <w:rPr>
+                <w:rFonts w:cs="Times New Roman"/>
+              </w:rPr>
               <w:t>1,429</w:t>
             </w:r>
           </w:p>
@@ -2776,9 +3702,14 @@
           </w:tcPr>
           <w:p>
             <w:pPr>
-              <w:spacing w:line="240" w:lineRule="auto"/>
+              <w:rPr>
+                <w:rFonts w:cs="Times New Roman"/>
+              </w:rPr>
             </w:pPr>
             <w:r>
+              <w:rPr>
+                <w:rFonts w:cs="Times New Roman"/>
+              </w:rPr>
               <w:t>456.82</w:t>
             </w:r>
           </w:p>
@@ -2789,9 +3720,14 @@
           </w:tcPr>
           <w:p>
             <w:pPr>
-              <w:spacing w:line="240" w:lineRule="auto"/>
+              <w:rPr>
+                <w:rFonts w:cs="Times New Roman"/>
+              </w:rPr>
             </w:pPr>
             <w:r>
+              <w:rPr>
+                <w:rFonts w:cs="Times New Roman"/>
+              </w:rPr>
               <w:t>1.00</w:t>
             </w:r>
           </w:p>
@@ -2800,7 +3736,9 @@
     </w:tbl>
     <w:p>
       <w:pPr>
-        <w:spacing w:line="20" w:lineRule="exact"/>
+        <w:rPr>
+          <w:rFonts w:cs="Times New Roman"/>
+        </w:rPr>
       </w:pPr>
     </w:p>
     <w:sectPr>
@@ -2813,39 +3751,91 @@
 </w:document>
 </file>
 
+<file path=word/endnotes.xml><?xml version="1.0" encoding="utf-8"?>
+<w:endnotes xmlns:wpc="http://schemas.microsoft.com/office/word/2010/wordprocessingCanvas" xmlns:cx="http://schemas.microsoft.com/office/drawing/2014/chartex" xmlns:cx1="http://schemas.microsoft.com/office/drawing/2015/9/8/chartex" xmlns:cx2="http://schemas.microsoft.com/office/drawing/2015/10/21/chartex" xmlns:cx3="http://schemas.microsoft.com/office/drawing/2016/5/9/chartex" xmlns:cx4="http://schemas.microsoft.com/office/drawing/2016/5/10/chartex" xmlns:cx5="http://schemas.microsoft.com/office/drawing/2016/5/11/chartex" xmlns:cx6="http://schemas.microsoft.com/office/drawing/2016/5/12/chartex" xmlns:cx7="http://schemas.microsoft.com/office/drawing/2016/5/13/chartex" xmlns:cx8="http://schemas.microsoft.com/office/drawing/2016/5/14/chartex" xmlns:mc="http://schemas.openxmlformats.org/markup-compatibility/2006" xmlns:aink="http://schemas.microsoft.com/office/drawing/2016/ink" xmlns:am3d="http://schemas.microsoft.com/office/drawing/2017/model3d" xmlns:o="urn:schemas-microsoft-com:office:office" xmlns:oel="http://schemas.microsoft.com/office/2019/extlst" xmlns:r="http://schemas.openxmlformats.org/officeDocument/2006/relationships" xmlns:m="http://schemas.openxmlformats.org/officeDocument/2006/math" xmlns:v="urn:schemas-microsoft-com:vml" xmlns:wp14="http://schemas.microsoft.com/office/word/2010/wordprocessingDrawing" xmlns:wp="http://schemas.openxmlformats.org/drawingml/2006/wordprocessingDrawing" xmlns:w10="urn:schemas-microsoft-com:office:word" xmlns:w="http://schemas.openxmlformats.org/wordprocessingml/2006/main" xmlns:w14="http://schemas.microsoft.com/office/word/2010/wordml" xmlns:w15="http://schemas.microsoft.com/office/word/2012/wordml" xmlns:w16cex="http://schemas.microsoft.com/office/word/2018/wordml/cex" xmlns:w16cid="http://schemas.microsoft.com/office/word/2016/wordml/cid" xmlns:w16="http://schemas.microsoft.com/office/word/2018/wordml" xmlns:w16du="http://schemas.microsoft.com/office/word/2023/wordml/word16du" xmlns:w16sdtdh="http://schemas.microsoft.com/office/word/2020/wordml/sdtdatahash" xmlns:w16sdtfl="http://schemas.microsoft.com/office/word/2024/wordml/sdtformatlock" xmlns:w16se="http://schemas.microsoft.com/office/word/2015/wordml/symex" xmlns:wpg="http://schemas.microsoft.com/office/word/2010/wordprocessingGroup" xmlns:wpi="http://schemas.microsoft.com/office/word/2010/wordprocessingInk" xmlns:wne="http://schemas.microsoft.com/office/word/2006/wordml" xmlns:wps="http://schemas.microsoft.com/office/word/2010/wordprocessingShape" mc:Ignorable="w14 w15 w16se w16cid w16 w16cex w16sdtdh w16sdtfl w16du wp14">
+  <w:endnote w:type="separator" w:id="-1">
+    <w:p>
+      <w:pPr>
+        <w:spacing w:line="240" w:lineRule="auto"/>
+      </w:pPr>
+      <w:r>
+        <w:separator/>
+      </w:r>
+    </w:p>
+  </w:endnote>
+  <w:endnote w:type="continuationSeparator" w:id="0">
+    <w:p>
+      <w:pPr>
+        <w:spacing w:line="240" w:lineRule="auto"/>
+      </w:pPr>
+      <w:r>
+        <w:continuationSeparator/>
+      </w:r>
+    </w:p>
+  </w:endnote>
+</w:endnotes>
+</file>
+
+<file path=word/footnotes.xml><?xml version="1.0" encoding="utf-8"?>
+<w:footnotes xmlns:wpc="http://schemas.microsoft.com/office/word/2010/wordprocessingCanvas" xmlns:cx="http://schemas.microsoft.com/office/drawing/2014/chartex" xmlns:cx1="http://schemas.microsoft.com/office/drawing/2015/9/8/chartex" xmlns:cx2="http://schemas.microsoft.com/office/drawing/2015/10/21/chartex" xmlns:cx3="http://schemas.microsoft.com/office/drawing/2016/5/9/chartex" xmlns:cx4="http://schemas.microsoft.com/office/drawing/2016/5/10/chartex" xmlns:cx5="http://schemas.microsoft.com/office/drawing/2016/5/11/chartex" xmlns:cx6="http://schemas.microsoft.com/office/drawing/2016/5/12/chartex" xmlns:cx7="http://schemas.microsoft.com/office/drawing/2016/5/13/chartex" xmlns:cx8="http://schemas.microsoft.com/office/drawing/2016/5/14/chartex" xmlns:mc="http://schemas.openxmlformats.org/markup-compatibility/2006" xmlns:aink="http://schemas.microsoft.com/office/drawing/2016/ink" xmlns:am3d="http://schemas.microsoft.com/office/drawing/2017/model3d" xmlns:o="urn:schemas-microsoft-com:office:office" xmlns:oel="http://schemas.microsoft.com/office/2019/extlst" xmlns:r="http://schemas.openxmlformats.org/officeDocument/2006/relationships" xmlns:m="http://schemas.openxmlformats.org/officeDocument/2006/math" xmlns:v="urn:schemas-microsoft-com:vml" xmlns:wp14="http://schemas.microsoft.com/office/word/2010/wordprocessingDrawing" xmlns:wp="http://schemas.openxmlformats.org/drawingml/2006/wordprocessingDrawing" xmlns:w10="urn:schemas-microsoft-com:office:word" xmlns:w="http://schemas.openxmlformats.org/wordprocessingml/2006/main" xmlns:w14="http://schemas.microsoft.com/office/word/2010/wordml" xmlns:w15="http://schemas.microsoft.com/office/word/2012/wordml" xmlns:w16cex="http://schemas.microsoft.com/office/word/2018/wordml/cex" xmlns:w16cid="http://schemas.microsoft.com/office/word/2016/wordml/cid" xmlns:w16="http://schemas.microsoft.com/office/word/2018/wordml" xmlns:w16du="http://schemas.microsoft.com/office/word/2023/wordml/word16du" xmlns:w16sdtdh="http://schemas.microsoft.com/office/word/2020/wordml/sdtdatahash" xmlns:w16sdtfl="http://schemas.microsoft.com/office/word/2024/wordml/sdtformatlock" xmlns:w16se="http://schemas.microsoft.com/office/word/2015/wordml/symex" xmlns:wpg="http://schemas.microsoft.com/office/word/2010/wordprocessingGroup" xmlns:wpi="http://schemas.microsoft.com/office/word/2010/wordprocessingInk" xmlns:wne="http://schemas.microsoft.com/office/word/2006/wordml" xmlns:wps="http://schemas.microsoft.com/office/word/2010/wordprocessingShape" mc:Ignorable="w14 w15 w16se w16cid w16 w16cex w16sdtdh w16sdtfl w16du wp14">
+  <w:footnote w:type="separator" w:id="-1">
+    <w:p>
+      <w:pPr>
+        <w:spacing w:line="240" w:lineRule="auto"/>
+      </w:pPr>
+      <w:r>
+        <w:separator/>
+      </w:r>
+    </w:p>
+  </w:footnote>
+  <w:footnote w:type="continuationSeparator" w:id="0">
+    <w:p>
+      <w:pPr>
+        <w:spacing w:line="240" w:lineRule="auto"/>
+      </w:pPr>
+      <w:r>
+        <w:continuationSeparator/>
+      </w:r>
+    </w:p>
+  </w:footnote>
+</w:footnotes>
+</file>
+
 <file path=word/numbering.xml><?xml version="1.0" encoding="utf-8"?>
 <w:numbering xmlns:wpc="http://schemas.microsoft.com/office/word/2010/wordprocessingCanvas" xmlns:cx="http://schemas.microsoft.com/office/drawing/2014/chartex" xmlns:cx1="http://schemas.microsoft.com/office/drawing/2015/9/8/chartex" xmlns:cx2="http://schemas.microsoft.com/office/drawing/2015/10/21/chartex" xmlns:cx3="http://schemas.microsoft.com/office/drawing/2016/5/9/chartex" xmlns:cx4="http://schemas.microsoft.com/office/drawing/2016/5/10/chartex" xmlns:cx5="http://schemas.microsoft.com/office/drawing/2016/5/11/chartex" xmlns:cx6="http://schemas.microsoft.com/office/drawing/2016/5/12/chartex" xmlns:cx7="http://schemas.microsoft.com/office/drawing/2016/5/13/chartex" xmlns:cx8="http://schemas.microsoft.com/office/drawing/2016/5/14/chartex" xmlns:mc="http://schemas.openxmlformats.org/markup-compatibility/2006" xmlns:aink="http://schemas.microsoft.com/office/drawing/2016/ink" xmlns:am3d="http://schemas.microsoft.com/office/drawing/2017/model3d" xmlns:o="urn:schemas-microsoft-com:office:office" xmlns:oel="http://schemas.microsoft.com/office/2019/extlst" xmlns:r="http://schemas.openxmlformats.org/officeDocument/2006/relationships" xmlns:m="http://schemas.openxmlformats.org/officeDocument/2006/math" xmlns:v="urn:schemas-microsoft-com:vml" xmlns:wp14="http://schemas.microsoft.com/office/word/2010/wordprocessingDrawing" xmlns:wp="http://schemas.openxmlformats.org/drawingml/2006/wordprocessingDrawing" xmlns:w10="urn:schemas-microsoft-com:office:word" xmlns:w="http://schemas.openxmlformats.org/wordprocessingml/2006/main" xmlns:w14="http://schemas.microsoft.com/office/word/2010/wordml" xmlns:w15="http://schemas.microsoft.com/office/word/2012/wordml" xmlns:w16cex="http://schemas.microsoft.com/office/word/2018/wordml/cex" xmlns:w16cid="http://schemas.microsoft.com/office/word/2016/wordml/cid" xmlns:w16="http://schemas.microsoft.com/office/word/2018/wordml" xmlns:w16du="http://schemas.microsoft.com/office/word/2023/wordml/word16du" xmlns:w16sdtdh="http://schemas.microsoft.com/office/word/2020/wordml/sdtdatahash" xmlns:w16sdtfl="http://schemas.microsoft.com/office/word/2024/wordml/sdtformatlock" xmlns:w16se="http://schemas.microsoft.com/office/word/2015/wordml/symex" xmlns:wpg="http://schemas.microsoft.com/office/word/2010/wordprocessingGroup" xmlns:wpi="http://schemas.microsoft.com/office/word/2010/wordprocessingInk" xmlns:wne="http://schemas.microsoft.com/office/word/2006/wordml" xmlns:wps="http://schemas.microsoft.com/office/word/2010/wordprocessingShape" mc:Ignorable="w14 w15 w16se w16cid w16 w16cex w16sdtdh w16sdtfl w16du wp14">
   <w:abstractNum w:abstractNumId="0" w15:restartNumberingAfterBreak="0">
     <w:nsid w:val="FFFFFF7C"/>
     <w:multiLevelType w:val="singleLevel"/>
-    <w:tmpl w:val="C310EC42"/>
+    <w:tmpl w:val="14EAA6BC"/>
     <w:lvl w:ilvl="0">
       <w:start w:val="1"/>
       <w:numFmt w:val="decimal"/>
+      <w:pStyle w:val="ListNumber5"/>
       <w:lvlText w:val="%1."/>
       <w:lvlJc w:val="left"/>
       <w:pPr>
         <w:tabs>
-          <w:tab w:val="num" w:pos="1800"/>
+          <w:tab w:val="num" w:pos="1492"/>
         </w:tabs>
-        <w:ind w:left="1800" w:hanging="360"/>
+        <w:ind w:left="1492" w:hanging="360"/>
       </w:pPr>
     </w:lvl>
   </w:abstractNum>
   <w:abstractNum w:abstractNumId="1" w15:restartNumberingAfterBreak="0">
     <w:nsid w:val="FFFFFF7D"/>
     <w:multiLevelType w:val="singleLevel"/>
-    <w:tmpl w:val="E4089024"/>
+    <w:tmpl w:val="5FE41A26"/>
     <w:lvl w:ilvl="0">
       <w:start w:val="1"/>
       <w:numFmt w:val="decimal"/>
+      <w:pStyle w:val="ListNumber4"/>
       <w:lvlText w:val="%1."/>
       <w:lvlJc w:val="left"/>
       <w:pPr>
         <w:tabs>
-          <w:tab w:val="num" w:pos="1440"/>
+          <w:tab w:val="num" w:pos="1209"/>
         </w:tabs>
-        <w:ind w:left="1440" w:hanging="360"/>
+        <w:ind w:left="1209" w:hanging="360"/>
       </w:pPr>
     </w:lvl>
   </w:abstractNum>
@@ -2886,12 +3876,34 @@
     </w:lvl>
   </w:abstractNum>
   <w:abstractNum w:abstractNumId="4" w15:restartNumberingAfterBreak="0">
-    <w:nsid w:val="FFFFFF81"/>
+    <w:nsid w:val="FFFFFF80"/>
     <w:multiLevelType w:val="singleLevel"/>
-    <w:tmpl w:val="171AC3A4"/>
+    <w:tmpl w:val="8AAA2C2C"/>
     <w:lvl w:ilvl="0">
       <w:start w:val="1"/>
       <w:numFmt w:val="bullet"/>
+      <w:pStyle w:val="ListBullet5"/>
+      <w:lvlText w:val=""/>
+      <w:lvlJc w:val="left"/>
+      <w:pPr>
+        <w:tabs>
+          <w:tab w:val="num" w:pos="1492"/>
+        </w:tabs>
+        <w:ind w:left="1492" w:hanging="360"/>
+      </w:pPr>
+      <w:rPr>
+        <w:rFonts w:ascii="Symbol" w:hAnsi="Symbol" w:hint="default"/>
+      </w:rPr>
+    </w:lvl>
+  </w:abstractNum>
+  <w:abstractNum w:abstractNumId="5" w15:restartNumberingAfterBreak="0">
+    <w:nsid w:val="FFFFFF81"/>
+    <w:multiLevelType w:val="singleLevel"/>
+    <w:tmpl w:val="2B083F66"/>
+    <w:lvl w:ilvl="0">
+      <w:start w:val="1"/>
+      <w:numFmt w:val="bullet"/>
+      <w:pStyle w:val="ListBullet4"/>
       <w:lvlText w:val=""/>
       <w:lvlJc w:val="left"/>
       <w:pPr>
@@ -2905,7 +3917,7 @@
       </w:rPr>
     </w:lvl>
   </w:abstractNum>
-  <w:abstractNum w:abstractNumId="5" w15:restartNumberingAfterBreak="0">
+  <w:abstractNum w:abstractNumId="6" w15:restartNumberingAfterBreak="0">
     <w:nsid w:val="FFFFFF82"/>
     <w:multiLevelType w:val="singleLevel"/>
     <w:tmpl w:val="F3EAFDEC"/>
@@ -2926,7 +3938,7 @@
       </w:rPr>
     </w:lvl>
   </w:abstractNum>
-  <w:abstractNum w:abstractNumId="6" w15:restartNumberingAfterBreak="0">
+  <w:abstractNum w:abstractNumId="7" w15:restartNumberingAfterBreak="0">
     <w:nsid w:val="FFFFFF83"/>
     <w:multiLevelType w:val="singleLevel"/>
     <w:tmpl w:val="3D1EFFD4"/>
@@ -2947,7 +3959,7 @@
       </w:rPr>
     </w:lvl>
   </w:abstractNum>
-  <w:abstractNum w:abstractNumId="7" w15:restartNumberingAfterBreak="0">
+  <w:abstractNum w:abstractNumId="8" w15:restartNumberingAfterBreak="0">
     <w:nsid w:val="FFFFFF88"/>
     <w:multiLevelType w:val="singleLevel"/>
     <w:tmpl w:val="D0A62B40"/>
@@ -2965,7 +3977,7 @@
       </w:pPr>
     </w:lvl>
   </w:abstractNum>
-  <w:abstractNum w:abstractNumId="8" w15:restartNumberingAfterBreak="0">
+  <w:abstractNum w:abstractNumId="9" w15:restartNumberingAfterBreak="0">
     <w:nsid w:val="FFFFFF89"/>
     <w:multiLevelType w:val="singleLevel"/>
     <w:tmpl w:val="29761A62"/>
@@ -2987,19 +3999,19 @@
     </w:lvl>
   </w:abstractNum>
   <w:num w:numId="1" w16cid:durableId="1188059999">
-    <w:abstractNumId w:val="8"/>
+    <w:abstractNumId w:val="9"/>
   </w:num>
   <w:num w:numId="2" w16cid:durableId="1505129948">
+    <w:abstractNumId w:val="7"/>
+  </w:num>
+  <w:num w:numId="3" w16cid:durableId="751202110">
     <w:abstractNumId w:val="6"/>
   </w:num>
-  <w:num w:numId="3" w16cid:durableId="751202110">
+  <w:num w:numId="4" w16cid:durableId="1096560740">
     <w:abstractNumId w:val="5"/>
   </w:num>
-  <w:num w:numId="4" w16cid:durableId="1096560740">
-    <w:abstractNumId w:val="4"/>
-  </w:num>
   <w:num w:numId="5" w16cid:durableId="1966083211">
-    <w:abstractNumId w:val="7"/>
+    <w:abstractNumId w:val="8"/>
   </w:num>
   <w:num w:numId="6" w16cid:durableId="411633417">
     <w:abstractNumId w:val="3"/>
@@ -3011,6 +4023,15 @@
     <w:abstractNumId w:val="1"/>
   </w:num>
   <w:num w:numId="9" w16cid:durableId="106974721">
+    <w:abstractNumId w:val="0"/>
+  </w:num>
+  <w:num w:numId="10" w16cid:durableId="452527969">
+    <w:abstractNumId w:val="4"/>
+  </w:num>
+  <w:num w:numId="11" w16cid:durableId="969438917">
+    <w:abstractNumId w:val="1"/>
+  </w:num>
+  <w:num w:numId="12" w16cid:durableId="323094221">
     <w:abstractNumId w:val="0"/>
   </w:num>
 </w:numbering>
@@ -14412,6 +15433,1081 @@
       <w:u w:val="single"/>
     </w:rPr>
   </w:style>
+  <w:style w:type="paragraph" w:styleId="BalloonText">
+    <w:name w:val="Balloon Text"/>
+    <w:basedOn w:val="Normal"/>
+    <w:link w:val="BalloonTextChar"/>
+    <w:uiPriority w:val="99"/>
+    <w:semiHidden/>
+    <w:unhideWhenUsed/>
+    <w:rsid w:val="00FC5D67"/>
+    <w:pPr>
+      <w:spacing w:line="240" w:lineRule="auto"/>
+    </w:pPr>
+    <w:rPr>
+      <w:rFonts w:ascii="Segoe UI" w:hAnsi="Segoe UI" w:cs="Segoe UI"/>
+      <w:sz w:val="18"/>
+      <w:szCs w:val="18"/>
+    </w:rPr>
+  </w:style>
+  <w:style w:type="character" w:customStyle="1" w:styleId="BalloonTextChar">
+    <w:name w:val="Balloon Text Char"/>
+    <w:basedOn w:val="DefaultParagraphFont"/>
+    <w:link w:val="BalloonText"/>
+    <w:uiPriority w:val="99"/>
+    <w:semiHidden/>
+    <w:rsid w:val="00FC5D67"/>
+    <w:rPr>
+      <w:rFonts w:ascii="Segoe UI" w:hAnsi="Segoe UI" w:cs="Segoe UI"/>
+      <w:sz w:val="18"/>
+      <w:szCs w:val="18"/>
+    </w:rPr>
+  </w:style>
+  <w:style w:type="paragraph" w:styleId="Bibliography">
+    <w:name w:val="Bibliography"/>
+    <w:basedOn w:val="Normal"/>
+    <w:next w:val="Normal"/>
+    <w:uiPriority w:val="37"/>
+    <w:semiHidden/>
+    <w:unhideWhenUsed/>
+    <w:rsid w:val="00FC5D67"/>
+  </w:style>
+  <w:style w:type="paragraph" w:styleId="BlockText">
+    <w:name w:val="Block Text"/>
+    <w:basedOn w:val="Normal"/>
+    <w:uiPriority w:val="99"/>
+    <w:semiHidden/>
+    <w:unhideWhenUsed/>
+    <w:rsid w:val="00FC5D67"/>
+    <w:pPr>
+      <w:pBdr>
+        <w:top w:val="single" w:sz="2" w:space="10" w:color="4F81BD" w:themeColor="accent1"/>
+        <w:left w:val="single" w:sz="2" w:space="10" w:color="4F81BD" w:themeColor="accent1"/>
+        <w:bottom w:val="single" w:sz="2" w:space="10" w:color="4F81BD" w:themeColor="accent1"/>
+        <w:right w:val="single" w:sz="2" w:space="10" w:color="4F81BD" w:themeColor="accent1"/>
+      </w:pBdr>
+      <w:ind w:left="1152" w:right="1152"/>
+    </w:pPr>
+    <w:rPr>
+      <w:rFonts w:asciiTheme="minorHAnsi" w:hAnsiTheme="minorHAnsi"/>
+      <w:i/>
+      <w:iCs/>
+      <w:color w:val="4F81BD" w:themeColor="accent1"/>
+    </w:rPr>
+  </w:style>
+  <w:style w:type="paragraph" w:styleId="BodyTextFirstIndent">
+    <w:name w:val="Body Text First Indent"/>
+    <w:basedOn w:val="BodyText"/>
+    <w:link w:val="BodyTextFirstIndentChar"/>
+    <w:uiPriority w:val="99"/>
+    <w:semiHidden/>
+    <w:unhideWhenUsed/>
+    <w:rsid w:val="00FC5D67"/>
+    <w:pPr>
+      <w:spacing w:after="0"/>
+      <w:ind w:firstLine="360"/>
+    </w:pPr>
+  </w:style>
+  <w:style w:type="character" w:customStyle="1" w:styleId="BodyTextFirstIndentChar">
+    <w:name w:val="Body Text First Indent Char"/>
+    <w:basedOn w:val="BodyTextChar"/>
+    <w:link w:val="BodyTextFirstIndent"/>
+    <w:uiPriority w:val="99"/>
+    <w:semiHidden/>
+    <w:rsid w:val="00FC5D67"/>
+    <w:rPr>
+      <w:rFonts w:ascii="Times New Roman" w:hAnsi="Times New Roman"/>
+      <w:sz w:val="24"/>
+    </w:rPr>
+  </w:style>
+  <w:style w:type="paragraph" w:styleId="BodyTextIndent">
+    <w:name w:val="Body Text Indent"/>
+    <w:basedOn w:val="Normal"/>
+    <w:link w:val="BodyTextIndentChar"/>
+    <w:uiPriority w:val="99"/>
+    <w:semiHidden/>
+    <w:unhideWhenUsed/>
+    <w:rsid w:val="00FC5D67"/>
+    <w:pPr>
+      <w:spacing w:after="120"/>
+      <w:ind w:left="283"/>
+    </w:pPr>
+  </w:style>
+  <w:style w:type="character" w:customStyle="1" w:styleId="BodyTextIndentChar">
+    <w:name w:val="Body Text Indent Char"/>
+    <w:basedOn w:val="DefaultParagraphFont"/>
+    <w:link w:val="BodyTextIndent"/>
+    <w:uiPriority w:val="99"/>
+    <w:semiHidden/>
+    <w:rsid w:val="00FC5D67"/>
+    <w:rPr>
+      <w:rFonts w:ascii="Times New Roman" w:hAnsi="Times New Roman"/>
+      <w:sz w:val="24"/>
+    </w:rPr>
+  </w:style>
+  <w:style w:type="paragraph" w:styleId="BodyTextFirstIndent2">
+    <w:name w:val="Body Text First Indent 2"/>
+    <w:basedOn w:val="BodyTextIndent"/>
+    <w:link w:val="BodyTextFirstIndent2Char"/>
+    <w:uiPriority w:val="99"/>
+    <w:semiHidden/>
+    <w:unhideWhenUsed/>
+    <w:rsid w:val="00FC5D67"/>
+    <w:pPr>
+      <w:spacing w:after="0"/>
+      <w:ind w:left="360" w:firstLine="360"/>
+    </w:pPr>
+  </w:style>
+  <w:style w:type="character" w:customStyle="1" w:styleId="BodyTextFirstIndent2Char">
+    <w:name w:val="Body Text First Indent 2 Char"/>
+    <w:basedOn w:val="BodyTextIndentChar"/>
+    <w:link w:val="BodyTextFirstIndent2"/>
+    <w:uiPriority w:val="99"/>
+    <w:semiHidden/>
+    <w:rsid w:val="00FC5D67"/>
+    <w:rPr>
+      <w:rFonts w:ascii="Times New Roman" w:hAnsi="Times New Roman"/>
+      <w:sz w:val="24"/>
+    </w:rPr>
+  </w:style>
+  <w:style w:type="paragraph" w:styleId="BodyTextIndent2">
+    <w:name w:val="Body Text Indent 2"/>
+    <w:basedOn w:val="Normal"/>
+    <w:link w:val="BodyTextIndent2Char"/>
+    <w:uiPriority w:val="99"/>
+    <w:semiHidden/>
+    <w:unhideWhenUsed/>
+    <w:rsid w:val="00FC5D67"/>
+    <w:pPr>
+      <w:spacing w:after="120"/>
+      <w:ind w:left="283"/>
+    </w:pPr>
+  </w:style>
+  <w:style w:type="character" w:customStyle="1" w:styleId="BodyTextIndent2Char">
+    <w:name w:val="Body Text Indent 2 Char"/>
+    <w:basedOn w:val="DefaultParagraphFont"/>
+    <w:link w:val="BodyTextIndent2"/>
+    <w:uiPriority w:val="99"/>
+    <w:semiHidden/>
+    <w:rsid w:val="00FC5D67"/>
+    <w:rPr>
+      <w:rFonts w:ascii="Times New Roman" w:hAnsi="Times New Roman"/>
+      <w:sz w:val="24"/>
+    </w:rPr>
+  </w:style>
+  <w:style w:type="paragraph" w:styleId="BodyTextIndent3">
+    <w:name w:val="Body Text Indent 3"/>
+    <w:basedOn w:val="Normal"/>
+    <w:link w:val="BodyTextIndent3Char"/>
+    <w:uiPriority w:val="99"/>
+    <w:semiHidden/>
+    <w:unhideWhenUsed/>
+    <w:rsid w:val="00FC5D67"/>
+    <w:pPr>
+      <w:spacing w:after="120"/>
+      <w:ind w:left="283"/>
+    </w:pPr>
+    <w:rPr>
+      <w:sz w:val="16"/>
+      <w:szCs w:val="16"/>
+    </w:rPr>
+  </w:style>
+  <w:style w:type="character" w:customStyle="1" w:styleId="BodyTextIndent3Char">
+    <w:name w:val="Body Text Indent 3 Char"/>
+    <w:basedOn w:val="DefaultParagraphFont"/>
+    <w:link w:val="BodyTextIndent3"/>
+    <w:uiPriority w:val="99"/>
+    <w:semiHidden/>
+    <w:rsid w:val="00FC5D67"/>
+    <w:rPr>
+      <w:rFonts w:ascii="Times New Roman" w:hAnsi="Times New Roman"/>
+      <w:sz w:val="16"/>
+      <w:szCs w:val="16"/>
+    </w:rPr>
+  </w:style>
+  <w:style w:type="paragraph" w:styleId="Closing">
+    <w:name w:val="Closing"/>
+    <w:basedOn w:val="Normal"/>
+    <w:link w:val="ClosingChar"/>
+    <w:uiPriority w:val="99"/>
+    <w:semiHidden/>
+    <w:unhideWhenUsed/>
+    <w:rsid w:val="00FC5D67"/>
+    <w:pPr>
+      <w:spacing w:line="240" w:lineRule="auto"/>
+      <w:ind w:left="4252"/>
+    </w:pPr>
+  </w:style>
+  <w:style w:type="character" w:customStyle="1" w:styleId="ClosingChar">
+    <w:name w:val="Closing Char"/>
+    <w:basedOn w:val="DefaultParagraphFont"/>
+    <w:link w:val="Closing"/>
+    <w:uiPriority w:val="99"/>
+    <w:semiHidden/>
+    <w:rsid w:val="00FC5D67"/>
+    <w:rPr>
+      <w:rFonts w:ascii="Times New Roman" w:hAnsi="Times New Roman"/>
+      <w:sz w:val="24"/>
+    </w:rPr>
+  </w:style>
+  <w:style w:type="paragraph" w:styleId="CommentText">
+    <w:name w:val="annotation text"/>
+    <w:basedOn w:val="Normal"/>
+    <w:link w:val="CommentTextChar"/>
+    <w:uiPriority w:val="99"/>
+    <w:semiHidden/>
+    <w:unhideWhenUsed/>
+    <w:rsid w:val="00FC5D67"/>
+    <w:pPr>
+      <w:spacing w:line="240" w:lineRule="auto"/>
+    </w:pPr>
+    <w:rPr>
+      <w:sz w:val="20"/>
+      <w:szCs w:val="20"/>
+    </w:rPr>
+  </w:style>
+  <w:style w:type="character" w:customStyle="1" w:styleId="CommentTextChar">
+    <w:name w:val="Comment Text Char"/>
+    <w:basedOn w:val="DefaultParagraphFont"/>
+    <w:link w:val="CommentText"/>
+    <w:uiPriority w:val="99"/>
+    <w:semiHidden/>
+    <w:rsid w:val="00FC5D67"/>
+    <w:rPr>
+      <w:rFonts w:ascii="Times New Roman" w:hAnsi="Times New Roman"/>
+      <w:sz w:val="20"/>
+      <w:szCs w:val="20"/>
+    </w:rPr>
+  </w:style>
+  <w:style w:type="paragraph" w:styleId="CommentSubject">
+    <w:name w:val="annotation subject"/>
+    <w:basedOn w:val="CommentText"/>
+    <w:next w:val="CommentText"/>
+    <w:link w:val="CommentSubjectChar"/>
+    <w:uiPriority w:val="99"/>
+    <w:semiHidden/>
+    <w:unhideWhenUsed/>
+    <w:rsid w:val="00FC5D67"/>
+    <w:rPr>
+      <w:b/>
+      <w:bCs/>
+    </w:rPr>
+  </w:style>
+  <w:style w:type="character" w:customStyle="1" w:styleId="CommentSubjectChar">
+    <w:name w:val="Comment Subject Char"/>
+    <w:basedOn w:val="CommentTextChar"/>
+    <w:link w:val="CommentSubject"/>
+    <w:uiPriority w:val="99"/>
+    <w:semiHidden/>
+    <w:rsid w:val="00FC5D67"/>
+    <w:rPr>
+      <w:rFonts w:ascii="Times New Roman" w:hAnsi="Times New Roman"/>
+      <w:b/>
+      <w:bCs/>
+      <w:sz w:val="20"/>
+      <w:szCs w:val="20"/>
+    </w:rPr>
+  </w:style>
+  <w:style w:type="paragraph" w:styleId="Date">
+    <w:name w:val="Date"/>
+    <w:basedOn w:val="Normal"/>
+    <w:next w:val="Normal"/>
+    <w:link w:val="DateChar"/>
+    <w:uiPriority w:val="99"/>
+    <w:semiHidden/>
+    <w:unhideWhenUsed/>
+    <w:rsid w:val="00FC5D67"/>
+  </w:style>
+  <w:style w:type="character" w:customStyle="1" w:styleId="DateChar">
+    <w:name w:val="Date Char"/>
+    <w:basedOn w:val="DefaultParagraphFont"/>
+    <w:link w:val="Date"/>
+    <w:uiPriority w:val="99"/>
+    <w:semiHidden/>
+    <w:rsid w:val="00FC5D67"/>
+    <w:rPr>
+      <w:rFonts w:ascii="Times New Roman" w:hAnsi="Times New Roman"/>
+      <w:sz w:val="24"/>
+    </w:rPr>
+  </w:style>
+  <w:style w:type="paragraph" w:styleId="DocumentMap">
+    <w:name w:val="Document Map"/>
+    <w:basedOn w:val="Normal"/>
+    <w:link w:val="DocumentMapChar"/>
+    <w:uiPriority w:val="99"/>
+    <w:semiHidden/>
+    <w:unhideWhenUsed/>
+    <w:rsid w:val="00FC5D67"/>
+    <w:pPr>
+      <w:spacing w:line="240" w:lineRule="auto"/>
+    </w:pPr>
+    <w:rPr>
+      <w:rFonts w:ascii="Segoe UI" w:hAnsi="Segoe UI" w:cs="Segoe UI"/>
+      <w:sz w:val="16"/>
+      <w:szCs w:val="16"/>
+    </w:rPr>
+  </w:style>
+  <w:style w:type="character" w:customStyle="1" w:styleId="DocumentMapChar">
+    <w:name w:val="Document Map Char"/>
+    <w:basedOn w:val="DefaultParagraphFont"/>
+    <w:link w:val="DocumentMap"/>
+    <w:uiPriority w:val="99"/>
+    <w:semiHidden/>
+    <w:rsid w:val="00FC5D67"/>
+    <w:rPr>
+      <w:rFonts w:ascii="Segoe UI" w:hAnsi="Segoe UI" w:cs="Segoe UI"/>
+      <w:sz w:val="16"/>
+      <w:szCs w:val="16"/>
+    </w:rPr>
+  </w:style>
+  <w:style w:type="paragraph" w:styleId="E-mailSignature">
+    <w:name w:val="E-mail Signature"/>
+    <w:basedOn w:val="Normal"/>
+    <w:link w:val="E-mailSignatureChar"/>
+    <w:uiPriority w:val="99"/>
+    <w:semiHidden/>
+    <w:unhideWhenUsed/>
+    <w:rsid w:val="00FC5D67"/>
+    <w:pPr>
+      <w:spacing w:line="240" w:lineRule="auto"/>
+    </w:pPr>
+  </w:style>
+  <w:style w:type="character" w:customStyle="1" w:styleId="E-mailSignatureChar">
+    <w:name w:val="E-mail Signature Char"/>
+    <w:basedOn w:val="DefaultParagraphFont"/>
+    <w:link w:val="E-mailSignature"/>
+    <w:uiPriority w:val="99"/>
+    <w:semiHidden/>
+    <w:rsid w:val="00FC5D67"/>
+    <w:rPr>
+      <w:rFonts w:ascii="Times New Roman" w:hAnsi="Times New Roman"/>
+      <w:sz w:val="24"/>
+    </w:rPr>
+  </w:style>
+  <w:style w:type="paragraph" w:styleId="EndnoteText">
+    <w:name w:val="endnote text"/>
+    <w:basedOn w:val="Normal"/>
+    <w:link w:val="EndnoteTextChar"/>
+    <w:uiPriority w:val="99"/>
+    <w:semiHidden/>
+    <w:unhideWhenUsed/>
+    <w:rsid w:val="00FC5D67"/>
+    <w:pPr>
+      <w:spacing w:line="240" w:lineRule="auto"/>
+    </w:pPr>
+    <w:rPr>
+      <w:sz w:val="20"/>
+      <w:szCs w:val="20"/>
+    </w:rPr>
+  </w:style>
+  <w:style w:type="character" w:customStyle="1" w:styleId="EndnoteTextChar">
+    <w:name w:val="Endnote Text Char"/>
+    <w:basedOn w:val="DefaultParagraphFont"/>
+    <w:link w:val="EndnoteText"/>
+    <w:uiPriority w:val="99"/>
+    <w:semiHidden/>
+    <w:rsid w:val="00FC5D67"/>
+    <w:rPr>
+      <w:rFonts w:ascii="Times New Roman" w:hAnsi="Times New Roman"/>
+      <w:sz w:val="20"/>
+      <w:szCs w:val="20"/>
+    </w:rPr>
+  </w:style>
+  <w:style w:type="paragraph" w:styleId="EnvelopeAddress">
+    <w:name w:val="envelope address"/>
+    <w:basedOn w:val="Normal"/>
+    <w:uiPriority w:val="99"/>
+    <w:semiHidden/>
+    <w:unhideWhenUsed/>
+    <w:rsid w:val="00FC5D67"/>
+    <w:pPr>
+      <w:framePr w:w="7920" w:h="1980" w:hRule="exact" w:hSpace="180" w:wrap="auto" w:hAnchor="page" w:xAlign="center" w:yAlign="bottom"/>
+      <w:spacing w:line="240" w:lineRule="auto"/>
+      <w:ind w:left="2880"/>
+    </w:pPr>
+    <w:rPr>
+      <w:rFonts w:asciiTheme="majorHAnsi" w:eastAsiaTheme="majorEastAsia" w:hAnsiTheme="majorHAnsi" w:cstheme="majorBidi"/>
+      <w:szCs w:val="24"/>
+    </w:rPr>
+  </w:style>
+  <w:style w:type="paragraph" w:styleId="EnvelopeReturn">
+    <w:name w:val="envelope return"/>
+    <w:basedOn w:val="Normal"/>
+    <w:uiPriority w:val="99"/>
+    <w:semiHidden/>
+    <w:unhideWhenUsed/>
+    <w:rsid w:val="00FC5D67"/>
+    <w:pPr>
+      <w:spacing w:line="240" w:lineRule="auto"/>
+    </w:pPr>
+    <w:rPr>
+      <w:rFonts w:asciiTheme="majorHAnsi" w:eastAsiaTheme="majorEastAsia" w:hAnsiTheme="majorHAnsi" w:cstheme="majorBidi"/>
+      <w:sz w:val="20"/>
+      <w:szCs w:val="20"/>
+    </w:rPr>
+  </w:style>
+  <w:style w:type="paragraph" w:styleId="FootnoteText">
+    <w:name w:val="footnote text"/>
+    <w:basedOn w:val="Normal"/>
+    <w:link w:val="FootnoteTextChar"/>
+    <w:uiPriority w:val="99"/>
+    <w:semiHidden/>
+    <w:unhideWhenUsed/>
+    <w:rsid w:val="00FC5D67"/>
+    <w:pPr>
+      <w:spacing w:line="240" w:lineRule="auto"/>
+    </w:pPr>
+    <w:rPr>
+      <w:sz w:val="20"/>
+      <w:szCs w:val="20"/>
+    </w:rPr>
+  </w:style>
+  <w:style w:type="character" w:customStyle="1" w:styleId="FootnoteTextChar">
+    <w:name w:val="Footnote Text Char"/>
+    <w:basedOn w:val="DefaultParagraphFont"/>
+    <w:link w:val="FootnoteText"/>
+    <w:uiPriority w:val="99"/>
+    <w:semiHidden/>
+    <w:rsid w:val="00FC5D67"/>
+    <w:rPr>
+      <w:rFonts w:ascii="Times New Roman" w:hAnsi="Times New Roman"/>
+      <w:sz w:val="20"/>
+      <w:szCs w:val="20"/>
+    </w:rPr>
+  </w:style>
+  <w:style w:type="paragraph" w:styleId="HTMLAddress">
+    <w:name w:val="HTML Address"/>
+    <w:basedOn w:val="Normal"/>
+    <w:link w:val="HTMLAddressChar"/>
+    <w:uiPriority w:val="99"/>
+    <w:semiHidden/>
+    <w:unhideWhenUsed/>
+    <w:rsid w:val="00FC5D67"/>
+    <w:pPr>
+      <w:spacing w:line="240" w:lineRule="auto"/>
+    </w:pPr>
+    <w:rPr>
+      <w:i/>
+      <w:iCs/>
+    </w:rPr>
+  </w:style>
+  <w:style w:type="character" w:customStyle="1" w:styleId="HTMLAddressChar">
+    <w:name w:val="HTML Address Char"/>
+    <w:basedOn w:val="DefaultParagraphFont"/>
+    <w:link w:val="HTMLAddress"/>
+    <w:uiPriority w:val="99"/>
+    <w:semiHidden/>
+    <w:rsid w:val="00FC5D67"/>
+    <w:rPr>
+      <w:rFonts w:ascii="Times New Roman" w:hAnsi="Times New Roman"/>
+      <w:i/>
+      <w:iCs/>
+      <w:sz w:val="24"/>
+    </w:rPr>
+  </w:style>
+  <w:style w:type="paragraph" w:styleId="HTMLPreformatted">
+    <w:name w:val="HTML Preformatted"/>
+    <w:basedOn w:val="Normal"/>
+    <w:link w:val="HTMLPreformattedChar"/>
+    <w:uiPriority w:val="99"/>
+    <w:semiHidden/>
+    <w:unhideWhenUsed/>
+    <w:rsid w:val="00FC5D67"/>
+    <w:pPr>
+      <w:spacing w:line="240" w:lineRule="auto"/>
+    </w:pPr>
+    <w:rPr>
+      <w:rFonts w:ascii="Consolas" w:hAnsi="Consolas"/>
+      <w:sz w:val="20"/>
+      <w:szCs w:val="20"/>
+    </w:rPr>
+  </w:style>
+  <w:style w:type="character" w:customStyle="1" w:styleId="HTMLPreformattedChar">
+    <w:name w:val="HTML Preformatted Char"/>
+    <w:basedOn w:val="DefaultParagraphFont"/>
+    <w:link w:val="HTMLPreformatted"/>
+    <w:uiPriority w:val="99"/>
+    <w:semiHidden/>
+    <w:rsid w:val="00FC5D67"/>
+    <w:rPr>
+      <w:rFonts w:ascii="Consolas" w:hAnsi="Consolas"/>
+      <w:sz w:val="20"/>
+      <w:szCs w:val="20"/>
+    </w:rPr>
+  </w:style>
+  <w:style w:type="paragraph" w:styleId="Index1">
+    <w:name w:val="index 1"/>
+    <w:basedOn w:val="Normal"/>
+    <w:next w:val="Normal"/>
+    <w:autoRedefine/>
+    <w:uiPriority w:val="99"/>
+    <w:semiHidden/>
+    <w:unhideWhenUsed/>
+    <w:rsid w:val="00FC5D67"/>
+    <w:pPr>
+      <w:spacing w:line="240" w:lineRule="auto"/>
+      <w:ind w:left="240" w:hanging="240"/>
+    </w:pPr>
+  </w:style>
+  <w:style w:type="paragraph" w:styleId="Index2">
+    <w:name w:val="index 2"/>
+    <w:basedOn w:val="Normal"/>
+    <w:next w:val="Normal"/>
+    <w:autoRedefine/>
+    <w:uiPriority w:val="99"/>
+    <w:semiHidden/>
+    <w:unhideWhenUsed/>
+    <w:rsid w:val="00FC5D67"/>
+    <w:pPr>
+      <w:spacing w:line="240" w:lineRule="auto"/>
+      <w:ind w:left="480" w:hanging="240"/>
+    </w:pPr>
+  </w:style>
+  <w:style w:type="paragraph" w:styleId="Index3">
+    <w:name w:val="index 3"/>
+    <w:basedOn w:val="Normal"/>
+    <w:next w:val="Normal"/>
+    <w:autoRedefine/>
+    <w:uiPriority w:val="99"/>
+    <w:semiHidden/>
+    <w:unhideWhenUsed/>
+    <w:rsid w:val="00FC5D67"/>
+    <w:pPr>
+      <w:spacing w:line="240" w:lineRule="auto"/>
+      <w:ind w:left="720" w:hanging="240"/>
+    </w:pPr>
+  </w:style>
+  <w:style w:type="paragraph" w:styleId="Index4">
+    <w:name w:val="index 4"/>
+    <w:basedOn w:val="Normal"/>
+    <w:next w:val="Normal"/>
+    <w:autoRedefine/>
+    <w:uiPriority w:val="99"/>
+    <w:semiHidden/>
+    <w:unhideWhenUsed/>
+    <w:rsid w:val="00FC5D67"/>
+    <w:pPr>
+      <w:spacing w:line="240" w:lineRule="auto"/>
+      <w:ind w:left="960" w:hanging="240"/>
+    </w:pPr>
+  </w:style>
+  <w:style w:type="paragraph" w:styleId="Index5">
+    <w:name w:val="index 5"/>
+    <w:basedOn w:val="Normal"/>
+    <w:next w:val="Normal"/>
+    <w:autoRedefine/>
+    <w:uiPriority w:val="99"/>
+    <w:semiHidden/>
+    <w:unhideWhenUsed/>
+    <w:rsid w:val="00FC5D67"/>
+    <w:pPr>
+      <w:spacing w:line="240" w:lineRule="auto"/>
+      <w:ind w:left="1200" w:hanging="240"/>
+    </w:pPr>
+  </w:style>
+  <w:style w:type="paragraph" w:styleId="Index6">
+    <w:name w:val="index 6"/>
+    <w:basedOn w:val="Normal"/>
+    <w:next w:val="Normal"/>
+    <w:autoRedefine/>
+    <w:uiPriority w:val="99"/>
+    <w:semiHidden/>
+    <w:unhideWhenUsed/>
+    <w:rsid w:val="00FC5D67"/>
+    <w:pPr>
+      <w:spacing w:line="240" w:lineRule="auto"/>
+      <w:ind w:left="1440" w:hanging="240"/>
+    </w:pPr>
+  </w:style>
+  <w:style w:type="paragraph" w:styleId="Index7">
+    <w:name w:val="index 7"/>
+    <w:basedOn w:val="Normal"/>
+    <w:next w:val="Normal"/>
+    <w:autoRedefine/>
+    <w:uiPriority w:val="99"/>
+    <w:semiHidden/>
+    <w:unhideWhenUsed/>
+    <w:rsid w:val="00FC5D67"/>
+    <w:pPr>
+      <w:spacing w:line="240" w:lineRule="auto"/>
+      <w:ind w:left="1680" w:hanging="240"/>
+    </w:pPr>
+  </w:style>
+  <w:style w:type="paragraph" w:styleId="Index8">
+    <w:name w:val="index 8"/>
+    <w:basedOn w:val="Normal"/>
+    <w:next w:val="Normal"/>
+    <w:autoRedefine/>
+    <w:uiPriority w:val="99"/>
+    <w:semiHidden/>
+    <w:unhideWhenUsed/>
+    <w:rsid w:val="00FC5D67"/>
+    <w:pPr>
+      <w:spacing w:line="240" w:lineRule="auto"/>
+      <w:ind w:left="1920" w:hanging="240"/>
+    </w:pPr>
+  </w:style>
+  <w:style w:type="paragraph" w:styleId="Index9">
+    <w:name w:val="index 9"/>
+    <w:basedOn w:val="Normal"/>
+    <w:next w:val="Normal"/>
+    <w:autoRedefine/>
+    <w:uiPriority w:val="99"/>
+    <w:semiHidden/>
+    <w:unhideWhenUsed/>
+    <w:rsid w:val="00FC5D67"/>
+    <w:pPr>
+      <w:spacing w:line="240" w:lineRule="auto"/>
+      <w:ind w:left="2160" w:hanging="240"/>
+    </w:pPr>
+  </w:style>
+  <w:style w:type="paragraph" w:styleId="IndexHeading">
+    <w:name w:val="index heading"/>
+    <w:basedOn w:val="Normal"/>
+    <w:next w:val="Index1"/>
+    <w:uiPriority w:val="99"/>
+    <w:semiHidden/>
+    <w:unhideWhenUsed/>
+    <w:rsid w:val="00FC5D67"/>
+    <w:rPr>
+      <w:rFonts w:asciiTheme="majorHAnsi" w:eastAsiaTheme="majorEastAsia" w:hAnsiTheme="majorHAnsi" w:cstheme="majorBidi"/>
+      <w:b/>
+      <w:bCs/>
+    </w:rPr>
+  </w:style>
+  <w:style w:type="paragraph" w:styleId="List4">
+    <w:name w:val="List 4"/>
+    <w:basedOn w:val="Normal"/>
+    <w:uiPriority w:val="99"/>
+    <w:semiHidden/>
+    <w:unhideWhenUsed/>
+    <w:rsid w:val="00FC5D67"/>
+    <w:pPr>
+      <w:ind w:left="1132" w:hanging="283"/>
+      <w:contextualSpacing/>
+    </w:pPr>
+  </w:style>
+  <w:style w:type="paragraph" w:styleId="List5">
+    <w:name w:val="List 5"/>
+    <w:basedOn w:val="Normal"/>
+    <w:uiPriority w:val="99"/>
+    <w:semiHidden/>
+    <w:unhideWhenUsed/>
+    <w:rsid w:val="00FC5D67"/>
+    <w:pPr>
+      <w:ind w:left="1415" w:hanging="283"/>
+      <w:contextualSpacing/>
+    </w:pPr>
+  </w:style>
+  <w:style w:type="paragraph" w:styleId="ListBullet4">
+    <w:name w:val="List Bullet 4"/>
+    <w:basedOn w:val="Normal"/>
+    <w:uiPriority w:val="99"/>
+    <w:semiHidden/>
+    <w:unhideWhenUsed/>
+    <w:rsid w:val="00FC5D67"/>
+    <w:pPr>
+      <w:numPr>
+        <w:numId w:val="4"/>
+      </w:numPr>
+      <w:contextualSpacing/>
+    </w:pPr>
+  </w:style>
+  <w:style w:type="paragraph" w:styleId="ListBullet5">
+    <w:name w:val="List Bullet 5"/>
+    <w:basedOn w:val="Normal"/>
+    <w:uiPriority w:val="99"/>
+    <w:semiHidden/>
+    <w:unhideWhenUsed/>
+    <w:rsid w:val="00FC5D67"/>
+    <w:pPr>
+      <w:numPr>
+        <w:numId w:val="10"/>
+      </w:numPr>
+      <w:contextualSpacing/>
+    </w:pPr>
+  </w:style>
+  <w:style w:type="paragraph" w:styleId="ListContinue4">
+    <w:name w:val="List Continue 4"/>
+    <w:basedOn w:val="Normal"/>
+    <w:uiPriority w:val="99"/>
+    <w:semiHidden/>
+    <w:unhideWhenUsed/>
+    <w:rsid w:val="00FC5D67"/>
+    <w:pPr>
+      <w:spacing w:after="120"/>
+      <w:ind w:left="1132"/>
+      <w:contextualSpacing/>
+    </w:pPr>
+  </w:style>
+  <w:style w:type="paragraph" w:styleId="ListContinue5">
+    <w:name w:val="List Continue 5"/>
+    <w:basedOn w:val="Normal"/>
+    <w:uiPriority w:val="99"/>
+    <w:semiHidden/>
+    <w:unhideWhenUsed/>
+    <w:rsid w:val="00FC5D67"/>
+    <w:pPr>
+      <w:spacing w:after="120"/>
+      <w:ind w:left="1415"/>
+      <w:contextualSpacing/>
+    </w:pPr>
+  </w:style>
+  <w:style w:type="paragraph" w:styleId="ListNumber4">
+    <w:name w:val="List Number 4"/>
+    <w:basedOn w:val="Normal"/>
+    <w:uiPriority w:val="99"/>
+    <w:semiHidden/>
+    <w:unhideWhenUsed/>
+    <w:rsid w:val="00FC5D67"/>
+    <w:pPr>
+      <w:numPr>
+        <w:numId w:val="11"/>
+      </w:numPr>
+      <w:contextualSpacing/>
+    </w:pPr>
+  </w:style>
+  <w:style w:type="paragraph" w:styleId="ListNumber5">
+    <w:name w:val="List Number 5"/>
+    <w:basedOn w:val="Normal"/>
+    <w:uiPriority w:val="99"/>
+    <w:semiHidden/>
+    <w:unhideWhenUsed/>
+    <w:rsid w:val="00FC5D67"/>
+    <w:pPr>
+      <w:numPr>
+        <w:numId w:val="12"/>
+      </w:numPr>
+      <w:contextualSpacing/>
+    </w:pPr>
+  </w:style>
+  <w:style w:type="paragraph" w:styleId="MessageHeader">
+    <w:name w:val="Message Header"/>
+    <w:basedOn w:val="Normal"/>
+    <w:link w:val="MessageHeaderChar"/>
+    <w:uiPriority w:val="99"/>
+    <w:semiHidden/>
+    <w:unhideWhenUsed/>
+    <w:rsid w:val="00FC5D67"/>
+    <w:pPr>
+      <w:pBdr>
+        <w:top w:val="single" w:sz="6" w:space="1" w:color="auto"/>
+        <w:left w:val="single" w:sz="6" w:space="1" w:color="auto"/>
+        <w:bottom w:val="single" w:sz="6" w:space="1" w:color="auto"/>
+        <w:right w:val="single" w:sz="6" w:space="1" w:color="auto"/>
+      </w:pBdr>
+      <w:shd w:val="pct20" w:color="auto" w:fill="auto"/>
+      <w:spacing w:line="240" w:lineRule="auto"/>
+      <w:ind w:left="1134" w:hanging="1134"/>
+    </w:pPr>
+    <w:rPr>
+      <w:rFonts w:asciiTheme="majorHAnsi" w:eastAsiaTheme="majorEastAsia" w:hAnsiTheme="majorHAnsi" w:cstheme="majorBidi"/>
+      <w:szCs w:val="24"/>
+    </w:rPr>
+  </w:style>
+  <w:style w:type="character" w:customStyle="1" w:styleId="MessageHeaderChar">
+    <w:name w:val="Message Header Char"/>
+    <w:basedOn w:val="DefaultParagraphFont"/>
+    <w:link w:val="MessageHeader"/>
+    <w:uiPriority w:val="99"/>
+    <w:semiHidden/>
+    <w:rsid w:val="00FC5D67"/>
+    <w:rPr>
+      <w:rFonts w:asciiTheme="majorHAnsi" w:eastAsiaTheme="majorEastAsia" w:hAnsiTheme="majorHAnsi" w:cstheme="majorBidi"/>
+      <w:sz w:val="24"/>
+      <w:szCs w:val="24"/>
+      <w:shd w:val="pct20" w:color="auto" w:fill="auto"/>
+    </w:rPr>
+  </w:style>
+  <w:style w:type="paragraph" w:styleId="NormalWeb">
+    <w:name w:val="Normal (Web)"/>
+    <w:basedOn w:val="Normal"/>
+    <w:uiPriority w:val="99"/>
+    <w:semiHidden/>
+    <w:unhideWhenUsed/>
+    <w:rsid w:val="00FC5D67"/>
+    <w:rPr>
+      <w:rFonts w:cs="Times New Roman"/>
+      <w:szCs w:val="24"/>
+    </w:rPr>
+  </w:style>
+  <w:style w:type="paragraph" w:styleId="NormalIndent">
+    <w:name w:val="Normal Indent"/>
+    <w:basedOn w:val="Normal"/>
+    <w:uiPriority w:val="99"/>
+    <w:semiHidden/>
+    <w:unhideWhenUsed/>
+    <w:rsid w:val="00FC5D67"/>
+    <w:pPr>
+      <w:ind w:left="720"/>
+    </w:pPr>
+  </w:style>
+  <w:style w:type="paragraph" w:styleId="NoteHeading">
+    <w:name w:val="Note Heading"/>
+    <w:basedOn w:val="Normal"/>
+    <w:next w:val="Normal"/>
+    <w:link w:val="NoteHeadingChar"/>
+    <w:uiPriority w:val="99"/>
+    <w:semiHidden/>
+    <w:unhideWhenUsed/>
+    <w:rsid w:val="00FC5D67"/>
+    <w:pPr>
+      <w:spacing w:line="240" w:lineRule="auto"/>
+    </w:pPr>
+  </w:style>
+  <w:style w:type="character" w:customStyle="1" w:styleId="NoteHeadingChar">
+    <w:name w:val="Note Heading Char"/>
+    <w:basedOn w:val="DefaultParagraphFont"/>
+    <w:link w:val="NoteHeading"/>
+    <w:uiPriority w:val="99"/>
+    <w:semiHidden/>
+    <w:rsid w:val="00FC5D67"/>
+    <w:rPr>
+      <w:rFonts w:ascii="Times New Roman" w:hAnsi="Times New Roman"/>
+      <w:sz w:val="24"/>
+    </w:rPr>
+  </w:style>
+  <w:style w:type="paragraph" w:styleId="PlainText">
+    <w:name w:val="Plain Text"/>
+    <w:basedOn w:val="Normal"/>
+    <w:link w:val="PlainTextChar"/>
+    <w:uiPriority w:val="99"/>
+    <w:semiHidden/>
+    <w:unhideWhenUsed/>
+    <w:rsid w:val="00FC5D67"/>
+    <w:pPr>
+      <w:spacing w:line="240" w:lineRule="auto"/>
+    </w:pPr>
+    <w:rPr>
+      <w:rFonts w:ascii="Consolas" w:hAnsi="Consolas"/>
+      <w:sz w:val="21"/>
+      <w:szCs w:val="21"/>
+    </w:rPr>
+  </w:style>
+  <w:style w:type="character" w:customStyle="1" w:styleId="PlainTextChar">
+    <w:name w:val="Plain Text Char"/>
+    <w:basedOn w:val="DefaultParagraphFont"/>
+    <w:link w:val="PlainText"/>
+    <w:uiPriority w:val="99"/>
+    <w:semiHidden/>
+    <w:rsid w:val="00FC5D67"/>
+    <w:rPr>
+      <w:rFonts w:ascii="Consolas" w:hAnsi="Consolas"/>
+      <w:sz w:val="21"/>
+      <w:szCs w:val="21"/>
+    </w:rPr>
+  </w:style>
+  <w:style w:type="paragraph" w:styleId="Salutation">
+    <w:name w:val="Salutation"/>
+    <w:basedOn w:val="Normal"/>
+    <w:next w:val="Normal"/>
+    <w:link w:val="SalutationChar"/>
+    <w:uiPriority w:val="99"/>
+    <w:semiHidden/>
+    <w:unhideWhenUsed/>
+    <w:rsid w:val="00FC5D67"/>
+  </w:style>
+  <w:style w:type="character" w:customStyle="1" w:styleId="SalutationChar">
+    <w:name w:val="Salutation Char"/>
+    <w:basedOn w:val="DefaultParagraphFont"/>
+    <w:link w:val="Salutation"/>
+    <w:uiPriority w:val="99"/>
+    <w:semiHidden/>
+    <w:rsid w:val="00FC5D67"/>
+    <w:rPr>
+      <w:rFonts w:ascii="Times New Roman" w:hAnsi="Times New Roman"/>
+      <w:sz w:val="24"/>
+    </w:rPr>
+  </w:style>
+  <w:style w:type="paragraph" w:styleId="Signature">
+    <w:name w:val="Signature"/>
+    <w:basedOn w:val="Normal"/>
+    <w:link w:val="SignatureChar"/>
+    <w:uiPriority w:val="99"/>
+    <w:semiHidden/>
+    <w:unhideWhenUsed/>
+    <w:rsid w:val="00FC5D67"/>
+    <w:pPr>
+      <w:spacing w:line="240" w:lineRule="auto"/>
+      <w:ind w:left="4252"/>
+    </w:pPr>
+  </w:style>
+  <w:style w:type="character" w:customStyle="1" w:styleId="SignatureChar">
+    <w:name w:val="Signature Char"/>
+    <w:basedOn w:val="DefaultParagraphFont"/>
+    <w:link w:val="Signature"/>
+    <w:uiPriority w:val="99"/>
+    <w:semiHidden/>
+    <w:rsid w:val="00FC5D67"/>
+    <w:rPr>
+      <w:rFonts w:ascii="Times New Roman" w:hAnsi="Times New Roman"/>
+      <w:sz w:val="24"/>
+    </w:rPr>
+  </w:style>
+  <w:style w:type="paragraph" w:styleId="TableofAuthorities">
+    <w:name w:val="table of authorities"/>
+    <w:basedOn w:val="Normal"/>
+    <w:next w:val="Normal"/>
+    <w:uiPriority w:val="99"/>
+    <w:semiHidden/>
+    <w:unhideWhenUsed/>
+    <w:rsid w:val="00FC5D67"/>
+    <w:pPr>
+      <w:ind w:left="240" w:hanging="240"/>
+    </w:pPr>
+  </w:style>
+  <w:style w:type="paragraph" w:styleId="TableofFigures">
+    <w:name w:val="table of figures"/>
+    <w:basedOn w:val="Normal"/>
+    <w:next w:val="Normal"/>
+    <w:uiPriority w:val="99"/>
+    <w:semiHidden/>
+    <w:unhideWhenUsed/>
+    <w:rsid w:val="00FC5D67"/>
+  </w:style>
+  <w:style w:type="paragraph" w:styleId="TOAHeading">
+    <w:name w:val="toa heading"/>
+    <w:basedOn w:val="Normal"/>
+    <w:next w:val="Normal"/>
+    <w:uiPriority w:val="99"/>
+    <w:semiHidden/>
+    <w:unhideWhenUsed/>
+    <w:rsid w:val="00FC5D67"/>
+    <w:pPr>
+      <w:spacing w:before="120"/>
+    </w:pPr>
+    <w:rPr>
+      <w:rFonts w:asciiTheme="majorHAnsi" w:eastAsiaTheme="majorEastAsia" w:hAnsiTheme="majorHAnsi" w:cstheme="majorBidi"/>
+      <w:b/>
+      <w:bCs/>
+      <w:szCs w:val="24"/>
+    </w:rPr>
+  </w:style>
+  <w:style w:type="paragraph" w:styleId="TOC1">
+    <w:name w:val="toc 1"/>
+    <w:basedOn w:val="Normal"/>
+    <w:next w:val="Normal"/>
+    <w:autoRedefine/>
+    <w:uiPriority w:val="39"/>
+    <w:semiHidden/>
+    <w:unhideWhenUsed/>
+    <w:rsid w:val="00FC5D67"/>
+    <w:pPr>
+      <w:spacing w:after="100"/>
+    </w:pPr>
+  </w:style>
+  <w:style w:type="paragraph" w:styleId="TOC2">
+    <w:name w:val="toc 2"/>
+    <w:basedOn w:val="Normal"/>
+    <w:next w:val="Normal"/>
+    <w:autoRedefine/>
+    <w:uiPriority w:val="39"/>
+    <w:semiHidden/>
+    <w:unhideWhenUsed/>
+    <w:rsid w:val="00FC5D67"/>
+    <w:pPr>
+      <w:spacing w:after="100"/>
+      <w:ind w:left="240"/>
+    </w:pPr>
+  </w:style>
+  <w:style w:type="paragraph" w:styleId="TOC3">
+    <w:name w:val="toc 3"/>
+    <w:basedOn w:val="Normal"/>
+    <w:next w:val="Normal"/>
+    <w:autoRedefine/>
+    <w:uiPriority w:val="39"/>
+    <w:semiHidden/>
+    <w:unhideWhenUsed/>
+    <w:rsid w:val="00FC5D67"/>
+    <w:pPr>
+      <w:spacing w:after="100"/>
+      <w:ind w:left="480"/>
+    </w:pPr>
+  </w:style>
+  <w:style w:type="paragraph" w:styleId="TOC4">
+    <w:name w:val="toc 4"/>
+    <w:basedOn w:val="Normal"/>
+    <w:next w:val="Normal"/>
+    <w:autoRedefine/>
+    <w:uiPriority w:val="39"/>
+    <w:semiHidden/>
+    <w:unhideWhenUsed/>
+    <w:rsid w:val="00FC5D67"/>
+    <w:pPr>
+      <w:spacing w:after="100"/>
+      <w:ind w:left="720"/>
+    </w:pPr>
+  </w:style>
+  <w:style w:type="paragraph" w:styleId="TOC5">
+    <w:name w:val="toc 5"/>
+    <w:basedOn w:val="Normal"/>
+    <w:next w:val="Normal"/>
+    <w:autoRedefine/>
+    <w:uiPriority w:val="39"/>
+    <w:semiHidden/>
+    <w:unhideWhenUsed/>
+    <w:rsid w:val="00FC5D67"/>
+    <w:pPr>
+      <w:spacing w:after="100"/>
+      <w:ind w:left="960"/>
+    </w:pPr>
+  </w:style>
+  <w:style w:type="paragraph" w:styleId="TOC6">
+    <w:name w:val="toc 6"/>
+    <w:basedOn w:val="Normal"/>
+    <w:next w:val="Normal"/>
+    <w:autoRedefine/>
+    <w:uiPriority w:val="39"/>
+    <w:semiHidden/>
+    <w:unhideWhenUsed/>
+    <w:rsid w:val="00FC5D67"/>
+    <w:pPr>
+      <w:spacing w:after="100"/>
+      <w:ind w:left="1200"/>
+    </w:pPr>
+  </w:style>
+  <w:style w:type="paragraph" w:styleId="TOC7">
+    <w:name w:val="toc 7"/>
+    <w:basedOn w:val="Normal"/>
+    <w:next w:val="Normal"/>
+    <w:autoRedefine/>
+    <w:uiPriority w:val="39"/>
+    <w:semiHidden/>
+    <w:unhideWhenUsed/>
+    <w:rsid w:val="00FC5D67"/>
+    <w:pPr>
+      <w:spacing w:after="100"/>
+      <w:ind w:left="1440"/>
+    </w:pPr>
+  </w:style>
+  <w:style w:type="paragraph" w:styleId="TOC8">
+    <w:name w:val="toc 8"/>
+    <w:basedOn w:val="Normal"/>
+    <w:next w:val="Normal"/>
+    <w:autoRedefine/>
+    <w:uiPriority w:val="39"/>
+    <w:semiHidden/>
+    <w:unhideWhenUsed/>
+    <w:rsid w:val="00FC5D67"/>
+    <w:pPr>
+      <w:spacing w:after="100"/>
+      <w:ind w:left="1680"/>
+    </w:pPr>
+  </w:style>
+  <w:style w:type="paragraph" w:styleId="TOC9">
+    <w:name w:val="toc 9"/>
+    <w:basedOn w:val="Normal"/>
+    <w:next w:val="Normal"/>
+    <w:autoRedefine/>
+    <w:uiPriority w:val="39"/>
+    <w:semiHidden/>
+    <w:unhideWhenUsed/>
+    <w:rsid w:val="00FC5D67"/>
+    <w:pPr>
+      <w:spacing w:after="100"/>
+      <w:ind w:left="1920"/>
+    </w:pPr>
+  </w:style>
 </w:styles>
 </file>
 

</xml_diff>